<commit_message>
Actualización memoria segunda entrega
</commit_message>
<xml_diff>
--- a/docs/memoria.docx
+++ b/docs/memoria.docx
@@ -8,10 +8,10 @@
           <w:noProof/>
         </w:rPr>
         <w:drawing>
-          <wp:anchor distT="0" distB="0" distL="114300" distR="114300" simplePos="0" relativeHeight="251660288" behindDoc="0" locked="0" layoutInCell="1" allowOverlap="1" wp14:anchorId="3C43120D" wp14:editId="37F27E0C">
+          <wp:anchor distT="0" distB="0" distL="114300" distR="114300" simplePos="0" relativeHeight="251660288" behindDoc="0" locked="0" layoutInCell="1" allowOverlap="1" wp14:anchorId="3C43120D" wp14:editId="0E9D0F96">
             <wp:simplePos x="0" y="0"/>
             <wp:positionH relativeFrom="page">
-              <wp:align>right</wp:align>
+              <wp:posOffset>6654</wp:posOffset>
             </wp:positionH>
             <wp:positionV relativeFrom="paragraph">
               <wp:posOffset>-890905</wp:posOffset>
@@ -433,19 +433,11 @@
       <w:r>
         <w:t xml:space="preserve">, </w:t>
       </w:r>
-      <w:proofErr w:type="gramStart"/>
       <w:r>
         <w:rPr>
           <w:highlight w:val="yellow"/>
         </w:rPr>
-        <w:t>Single</w:t>
-      </w:r>
-      <w:proofErr w:type="gramEnd"/>
-      <w:r>
-        <w:rPr>
-          <w:highlight w:val="yellow"/>
-        </w:rPr>
-        <w:t xml:space="preserve"> Page </w:t>
+        <w:t xml:space="preserve">Single Page </w:t>
       </w:r>
       <w:proofErr w:type="spellStart"/>
       <w:r>
@@ -806,9 +798,25 @@
         <w:p>
           <w:pPr>
             <w:pStyle w:val="TtuloTDC"/>
+            <w:rPr>
+              <w:rFonts w:ascii="Times New Roman" w:hAnsi="Times New Roman" w:cs="Times New Roman"/>
+              <w:b/>
+              <w:bCs/>
+              <w:color w:val="auto"/>
+              <w:sz w:val="28"/>
+              <w:szCs w:val="28"/>
+            </w:rPr>
           </w:pPr>
           <w:r>
-            <w:t>Contenido</w:t>
+            <w:rPr>
+              <w:rFonts w:ascii="Times New Roman" w:hAnsi="Times New Roman" w:cs="Times New Roman"/>
+              <w:b/>
+              <w:bCs/>
+              <w:color w:val="auto"/>
+              <w:sz w:val="28"/>
+              <w:szCs w:val="28"/>
+            </w:rPr>
+            <w:t>ÍNDICE</w:t>
           </w:r>
         </w:p>
         <w:p>
@@ -833,7 +841,7 @@
           <w:r>
             <w:fldChar w:fldCharType="separate"/>
           </w:r>
-          <w:hyperlink w:anchor="_Toc189730630" w:history="1">
+          <w:hyperlink w:anchor="_Toc189926257" w:history="1">
             <w:r>
               <w:rPr>
                 <w:rStyle w:val="Hipervnculo"/>
@@ -860,7 +868,7 @@
                 <w:noProof/>
                 <w:webHidden/>
               </w:rPr>
-              <w:instrText xml:space="preserve"> PAGEREF _Toc189730630 \h </w:instrText>
+              <w:instrText xml:space="preserve"> PAGEREF _Toc189926257 \h </w:instrText>
             </w:r>
             <w:r>
               <w:rPr>
@@ -904,7 +912,7 @@
               <w:lang w:eastAsia="es-ES"/>
             </w:rPr>
           </w:pPr>
-          <w:hyperlink w:anchor="_Toc189730631" w:history="1">
+          <w:hyperlink w:anchor="_Toc189926258" w:history="1">
             <w:r>
               <w:rPr>
                 <w:rStyle w:val="Hipervnculo"/>
@@ -931,7 +939,7 @@
                 <w:noProof/>
                 <w:webHidden/>
               </w:rPr>
-              <w:instrText xml:space="preserve"> PAGEREF _Toc189730631 \h </w:instrText>
+              <w:instrText xml:space="preserve"> PAGEREF _Toc189926258 \h </w:instrText>
             </w:r>
             <w:r>
               <w:rPr>
@@ -975,7 +983,7 @@
               <w:lang w:eastAsia="es-ES"/>
             </w:rPr>
           </w:pPr>
-          <w:hyperlink w:anchor="_Toc189730632" w:history="1">
+          <w:hyperlink w:anchor="_Toc189926259" w:history="1">
             <w:r>
               <w:rPr>
                 <w:rStyle w:val="Hipervnculo"/>
@@ -1002,7 +1010,7 @@
                 <w:noProof/>
                 <w:webHidden/>
               </w:rPr>
-              <w:instrText xml:space="preserve"> PAGEREF _Toc189730632 \h </w:instrText>
+              <w:instrText xml:space="preserve"> PAGEREF _Toc189926259 \h </w:instrText>
             </w:r>
             <w:r>
               <w:rPr>
@@ -1022,7 +1030,7 @@
                 <w:noProof/>
                 <w:webHidden/>
               </w:rPr>
-              <w:t>11</w:t>
+              <w:t>12</w:t>
             </w:r>
             <w:r>
               <w:rPr>
@@ -1046,27 +1054,13 @@
               <w:lang w:eastAsia="es-ES"/>
             </w:rPr>
           </w:pPr>
-          <w:hyperlink w:anchor="_Toc189730633" w:history="1">
+          <w:hyperlink w:anchor="_Toc189926260" w:history="1">
             <w:r>
               <w:rPr>
                 <w:rStyle w:val="Hipervnculo"/>
                 <w:noProof/>
               </w:rPr>
-              <w:t xml:space="preserve">FASES </w:t>
-            </w:r>
-            <w:r>
-              <w:rPr>
-                <w:rStyle w:val="Hipervnculo"/>
-                <w:noProof/>
-              </w:rPr>
-              <w:t>D</w:t>
-            </w:r>
-            <w:r>
-              <w:rPr>
-                <w:rStyle w:val="Hipervnculo"/>
-                <w:noProof/>
-              </w:rPr>
-              <w:t>EL PROYECTO</w:t>
+              <w:t>FASES DEL PROYECTO</w:t>
             </w:r>
             <w:r>
               <w:rPr>
@@ -1087,7 +1081,7 @@
                 <w:noProof/>
                 <w:webHidden/>
               </w:rPr>
-              <w:instrText xml:space="preserve"> PAGEREF _Toc189730633 \h </w:instrText>
+              <w:instrText xml:space="preserve"> PAGEREF _Toc189926260 \h </w:instrText>
             </w:r>
             <w:r>
               <w:rPr>
@@ -1131,7 +1125,7 @@
               <w:lang w:eastAsia="es-ES"/>
             </w:rPr>
           </w:pPr>
-          <w:hyperlink w:anchor="_Toc189730634" w:history="1">
+          <w:hyperlink w:anchor="_Toc189926261" w:history="1">
             <w:r>
               <w:rPr>
                 <w:rStyle w:val="Hipervnculo"/>
@@ -1158,7 +1152,7 @@
                 <w:noProof/>
                 <w:webHidden/>
               </w:rPr>
-              <w:instrText xml:space="preserve"> PAGEREF _Toc189730634 \h </w:instrText>
+              <w:instrText xml:space="preserve"> PAGEREF _Toc189926261 \h </w:instrText>
             </w:r>
             <w:r>
               <w:rPr>
@@ -1191,6 +1185,148 @@
         </w:p>
         <w:p>
           <w:pPr>
+            <w:pStyle w:val="TDC2"/>
+            <w:tabs>
+              <w:tab w:val="right" w:leader="dot" w:pos="8494"/>
+            </w:tabs>
+            <w:rPr>
+              <w:rFonts w:asciiTheme="minorHAnsi" w:eastAsiaTheme="minorEastAsia" w:hAnsiTheme="minorHAnsi"/>
+              <w:noProof/>
+              <w:szCs w:val="24"/>
+              <w:lang w:eastAsia="es-ES"/>
+            </w:rPr>
+          </w:pPr>
+          <w:hyperlink w:anchor="_Toc189926262" w:history="1">
+            <w:r>
+              <w:rPr>
+                <w:rStyle w:val="Hipervnculo"/>
+                <w:noProof/>
+              </w:rPr>
+              <w:t>ANÁLISIS DE LA APLICACIÓN</w:t>
+            </w:r>
+            <w:r>
+              <w:rPr>
+                <w:noProof/>
+                <w:webHidden/>
+              </w:rPr>
+              <w:tab/>
+            </w:r>
+            <w:r>
+              <w:rPr>
+                <w:noProof/>
+                <w:webHidden/>
+              </w:rPr>
+              <w:fldChar w:fldCharType="begin"/>
+            </w:r>
+            <w:r>
+              <w:rPr>
+                <w:noProof/>
+                <w:webHidden/>
+              </w:rPr>
+              <w:instrText xml:space="preserve"> PAGEREF _Toc189926262 \h </w:instrText>
+            </w:r>
+            <w:r>
+              <w:rPr>
+                <w:noProof/>
+                <w:webHidden/>
+              </w:rPr>
+            </w:r>
+            <w:r>
+              <w:rPr>
+                <w:noProof/>
+                <w:webHidden/>
+              </w:rPr>
+              <w:fldChar w:fldCharType="separate"/>
+            </w:r>
+            <w:r>
+              <w:rPr>
+                <w:noProof/>
+                <w:webHidden/>
+              </w:rPr>
+              <w:t>14</w:t>
+            </w:r>
+            <w:r>
+              <w:rPr>
+                <w:noProof/>
+                <w:webHidden/>
+              </w:rPr>
+              <w:fldChar w:fldCharType="end"/>
+            </w:r>
+          </w:hyperlink>
+        </w:p>
+        <w:p>
+          <w:pPr>
+            <w:pStyle w:val="TDC2"/>
+            <w:tabs>
+              <w:tab w:val="right" w:leader="dot" w:pos="8494"/>
+            </w:tabs>
+            <w:rPr>
+              <w:rFonts w:asciiTheme="minorHAnsi" w:eastAsiaTheme="minorEastAsia" w:hAnsiTheme="minorHAnsi"/>
+              <w:noProof/>
+              <w:szCs w:val="24"/>
+              <w:lang w:eastAsia="es-ES"/>
+            </w:rPr>
+          </w:pPr>
+          <w:hyperlink w:anchor="_Toc189926263" w:history="1">
+            <w:r>
+              <w:rPr>
+                <w:rStyle w:val="Hipervnculo"/>
+                <w:noProof/>
+              </w:rPr>
+              <w:t>MODELO DE DATOS</w:t>
+            </w:r>
+            <w:r>
+              <w:rPr>
+                <w:noProof/>
+                <w:webHidden/>
+              </w:rPr>
+              <w:tab/>
+            </w:r>
+            <w:r>
+              <w:rPr>
+                <w:noProof/>
+                <w:webHidden/>
+              </w:rPr>
+              <w:fldChar w:fldCharType="begin"/>
+            </w:r>
+            <w:r>
+              <w:rPr>
+                <w:noProof/>
+                <w:webHidden/>
+              </w:rPr>
+              <w:instrText xml:space="preserve"> PAGEREF _Toc189926263 \h </w:instrText>
+            </w:r>
+            <w:r>
+              <w:rPr>
+                <w:noProof/>
+                <w:webHidden/>
+              </w:rPr>
+            </w:r>
+            <w:r>
+              <w:rPr>
+                <w:noProof/>
+                <w:webHidden/>
+              </w:rPr>
+              <w:fldChar w:fldCharType="separate"/>
+            </w:r>
+            <w:r>
+              <w:rPr>
+                <w:noProof/>
+                <w:webHidden/>
+              </w:rPr>
+              <w:t>14</w:t>
+            </w:r>
+            <w:r>
+              <w:rPr>
+                <w:noProof/>
+                <w:webHidden/>
+              </w:rPr>
+              <w:fldChar w:fldCharType="end"/>
+            </w:r>
+          </w:hyperlink>
+        </w:p>
+        <w:p>
+          <w:pPr>
             <w:pStyle w:val="TDC1"/>
             <w:tabs>
               <w:tab w:val="right" w:leader="dot" w:pos="8494"/>
@@ -1202,7 +1338,7 @@
               <w:lang w:eastAsia="es-ES"/>
             </w:rPr>
           </w:pPr>
-          <w:hyperlink w:anchor="_Toc189730635" w:history="1">
+          <w:hyperlink w:anchor="_Toc189926264" w:history="1">
             <w:r>
               <w:rPr>
                 <w:rStyle w:val="Hipervnculo"/>
@@ -1229,7 +1365,7 @@
                 <w:noProof/>
                 <w:webHidden/>
               </w:rPr>
-              <w:instrText xml:space="preserve"> PAGEREF _Toc189730635 \h </w:instrText>
+              <w:instrText xml:space="preserve"> PAGEREF _Toc189926264 \h </w:instrText>
             </w:r>
             <w:r>
               <w:rPr>
@@ -1249,7 +1385,7 @@
                 <w:noProof/>
                 <w:webHidden/>
               </w:rPr>
-              <w:t>12</w:t>
+              <w:t>25</w:t>
             </w:r>
             <w:r>
               <w:rPr>
@@ -1273,7 +1409,7 @@
               <w:lang w:eastAsia="es-ES"/>
             </w:rPr>
           </w:pPr>
-          <w:hyperlink w:anchor="_Toc189730636" w:history="1">
+          <w:hyperlink w:anchor="_Toc189926265" w:history="1">
             <w:r>
               <w:rPr>
                 <w:rStyle w:val="Hipervnculo"/>
@@ -1300,7 +1436,7 @@
                 <w:noProof/>
                 <w:webHidden/>
               </w:rPr>
-              <w:instrText xml:space="preserve"> PAGEREF _Toc189730636 \h </w:instrText>
+              <w:instrText xml:space="preserve"> PAGEREF _Toc189926265 \h </w:instrText>
             </w:r>
             <w:r>
               <w:rPr>
@@ -1320,7 +1456,7 @@
                 <w:noProof/>
                 <w:webHidden/>
               </w:rPr>
-              <w:t>12</w:t>
+              <w:t>25</w:t>
             </w:r>
             <w:r>
               <w:rPr>
@@ -1344,7 +1480,7 @@
               <w:lang w:eastAsia="es-ES"/>
             </w:rPr>
           </w:pPr>
-          <w:hyperlink w:anchor="_Toc189730637" w:history="1">
+          <w:hyperlink w:anchor="_Toc189926266" w:history="1">
             <w:r>
               <w:rPr>
                 <w:rStyle w:val="Hipervnculo"/>
@@ -1371,7 +1507,7 @@
                 <w:noProof/>
                 <w:webHidden/>
               </w:rPr>
-              <w:instrText xml:space="preserve"> PAGEREF _Toc189730637 \h </w:instrText>
+              <w:instrText xml:space="preserve"> PAGEREF _Toc189926266 \h </w:instrText>
             </w:r>
             <w:r>
               <w:rPr>
@@ -1391,7 +1527,7 @@
                 <w:noProof/>
                 <w:webHidden/>
               </w:rPr>
-              <w:t>12</w:t>
+              <w:t>25</w:t>
             </w:r>
             <w:r>
               <w:rPr>
@@ -1499,24 +1635,6 @@
     </w:p>
     <w:p>
       <w:pPr>
-        <w:spacing w:line="360" w:lineRule="auto"/>
-        <w:jc w:val="both"/>
-      </w:pPr>
-    </w:p>
-    <w:p>
-      <w:pPr>
-        <w:spacing w:line="360" w:lineRule="auto"/>
-        <w:jc w:val="both"/>
-      </w:pPr>
-    </w:p>
-    <w:p>
-      <w:pPr>
-        <w:spacing w:line="360" w:lineRule="auto"/>
-        <w:jc w:val="both"/>
-      </w:pPr>
-    </w:p>
-    <w:p>
-      <w:pPr>
         <w:rPr>
           <w:rFonts w:asciiTheme="majorHAnsi" w:eastAsiaTheme="majorEastAsia" w:hAnsiTheme="majorHAnsi" w:cstheme="majorBidi"/>
           <w:color w:val="2F5496" w:themeColor="accent1" w:themeShade="BF"/>
@@ -1524,26 +1642,26 @@
           <w:szCs w:val="24"/>
         </w:rPr>
       </w:pPr>
-      <w:r>
-        <w:rPr>
-          <w:sz w:val="28"/>
-          <w:szCs w:val="24"/>
-        </w:rPr>
-        <w:lastRenderedPageBreak/>
-        <w:br w:type="page"/>
-      </w:r>
     </w:p>
     <w:p>
       <w:pPr>
         <w:pStyle w:val="Ttulo1"/>
         <w:rPr>
+          <w:rFonts w:ascii="Times New Roman" w:hAnsi="Times New Roman" w:cs="Times New Roman"/>
+          <w:b/>
+          <w:bCs/>
+          <w:color w:val="auto"/>
           <w:sz w:val="24"/>
           <w:szCs w:val="22"/>
         </w:rPr>
       </w:pPr>
-      <w:bookmarkStart w:id="0" w:name="_Toc189730630"/>
-      <w:r>
-        <w:rPr>
+      <w:bookmarkStart w:id="0" w:name="_Toc189926257"/>
+      <w:r>
+        <w:rPr>
+          <w:rFonts w:ascii="Times New Roman" w:hAnsi="Times New Roman" w:cs="Times New Roman"/>
+          <w:b/>
+          <w:bCs/>
+          <w:color w:val="auto"/>
           <w:sz w:val="28"/>
           <w:szCs w:val="24"/>
         </w:rPr>
@@ -1817,13 +1935,21 @@
         <w:spacing w:line="360" w:lineRule="auto"/>
         <w:jc w:val="center"/>
         <w:rPr>
+          <w:rFonts w:ascii="Times New Roman" w:hAnsi="Times New Roman" w:cs="Times New Roman"/>
+          <w:b/>
+          <w:bCs/>
+          <w:color w:val="auto"/>
           <w:sz w:val="28"/>
           <w:szCs w:val="24"/>
         </w:rPr>
       </w:pPr>
-      <w:bookmarkStart w:id="1" w:name="_Toc189730631"/>
-      <w:r>
-        <w:rPr>
+      <w:bookmarkStart w:id="1" w:name="_Toc189926258"/>
+      <w:r>
+        <w:rPr>
+          <w:rFonts w:ascii="Times New Roman" w:hAnsi="Times New Roman" w:cs="Times New Roman"/>
+          <w:b/>
+          <w:bCs/>
+          <w:color w:val="auto"/>
           <w:sz w:val="28"/>
           <w:szCs w:val="24"/>
         </w:rPr>
@@ -2016,6 +2142,7 @@
           <w14:ligatures w14:val="none"/>
         </w:rPr>
       </w:pPr>
+      <w:proofErr w:type="spellStart"/>
       <w:r>
         <w:rPr>
           <w:rFonts w:eastAsia="Times New Roman" w:cs="Times New Roman"/>
@@ -2026,7 +2153,20 @@
           <w:lang w:eastAsia="es-ES"/>
           <w14:ligatures w14:val="none"/>
         </w:rPr>
-        <w:t xml:space="preserve">User </w:t>
+        <w:t>User</w:t>
+      </w:r>
+      <w:proofErr w:type="spellEnd"/>
+      <w:r>
+        <w:rPr>
+          <w:rFonts w:eastAsia="Times New Roman" w:cs="Times New Roman"/>
+          <w:b/>
+          <w:bCs/>
+          <w:kern w:val="0"/>
+          <w:szCs w:val="24"/>
+          <w:lang w:eastAsia="es-ES"/>
+          <w14:ligatures w14:val="none"/>
+        </w:rPr>
+        <w:t xml:space="preserve"> </w:t>
       </w:r>
       <w:proofErr w:type="spellStart"/>
       <w:r>
@@ -2275,7 +2415,23 @@
           <w:b/>
           <w:bCs/>
         </w:rPr>
-        <w:t xml:space="preserve">JavaScript (ES6) Code </w:t>
+        <w:t xml:space="preserve">JavaScript (ES6) </w:t>
+      </w:r>
+      <w:proofErr w:type="spellStart"/>
+      <w:r>
+        <w:rPr>
+          <w:b/>
+          <w:bCs/>
+        </w:rPr>
+        <w:t>Code</w:t>
+      </w:r>
+      <w:proofErr w:type="spellEnd"/>
+      <w:r>
+        <w:rPr>
+          <w:b/>
+          <w:bCs/>
+        </w:rPr>
+        <w:t xml:space="preserve"> </w:t>
       </w:r>
       <w:proofErr w:type="spellStart"/>
       <w:r>
@@ -2471,10 +2627,122 @@
           <w:b/>
           <w:bCs/>
         </w:rPr>
+        <w:t>MySQL</w:t>
+      </w:r>
+      <w:r>
+        <w:rPr>
+          <w:b/>
+          <w:bCs/>
+        </w:rPr>
+        <w:t>:</w:t>
+      </w:r>
+      <w:r>
+        <w:rPr>
+          <w:b/>
+          <w:bCs/>
+        </w:rPr>
+        <w:t xml:space="preserve"> </w:t>
+      </w:r>
+      <w:r>
+        <w:t>Es un sistema de gestión de bases de datos relacional (RDBMS) que hemos elegido para gestionar la información del proyecto debido a su fiabilidad, estructuración de datos y eficiencia en el manejo de grandes volúmenes de información. MySQL utiliza un modelo basado en tablas con relaciones definidas, lo que nos permite garantizar la integridad de los datos y optimizar las consultas mediante SQL.</w:t>
+      </w:r>
+    </w:p>
+    <w:p>
+      <w:pPr>
+        <w:spacing w:line="360" w:lineRule="auto"/>
+        <w:ind w:firstLine="708"/>
+        <w:jc w:val="both"/>
+      </w:pPr>
+      <w:r>
+        <w:t>En el contexto de nuestro proyecto, hemos utilizado MySQL para:</w:t>
+      </w:r>
+    </w:p>
+    <w:p>
+      <w:pPr>
+        <w:spacing w:line="360" w:lineRule="auto"/>
+        <w:ind w:left="708"/>
+        <w:jc w:val="both"/>
+      </w:pPr>
+      <w:r>
+        <w:t xml:space="preserve">• </w:t>
+      </w:r>
+      <w:r>
+        <w:rPr>
+          <w:b/>
+          <w:bCs/>
+        </w:rPr>
+        <w:t>Gestión de usuarios:</w:t>
+      </w:r>
+      <w:r>
+        <w:t xml:space="preserve"> Almacenar la información de los padres, monitores y administradores del campamento en tablas estructuradas, asegurando la integridad y consistencia de los datos.</w:t>
+      </w:r>
+      <w:r>
+        <w:br/>
+        <w:t xml:space="preserve">• </w:t>
+      </w:r>
+      <w:r>
+        <w:rPr>
+          <w:b/>
+          <w:bCs/>
+        </w:rPr>
+        <w:t xml:space="preserve">Registro de actividades: </w:t>
+      </w:r>
+      <w:r>
+        <w:t>Mantener un sistema ordenado de actividades del campamento con datos como horarios, monitores asignados y descripciones, asegurando relaciones bien definidas entre las tablas.</w:t>
+      </w:r>
+      <w:r>
+        <w:br/>
+        <w:t xml:space="preserve">• </w:t>
+      </w:r>
+      <w:r>
+        <w:rPr>
+          <w:b/>
+          <w:bCs/>
+        </w:rPr>
+        <w:t>Integridad referencial:</w:t>
+      </w:r>
+      <w:r>
+        <w:t xml:space="preserve"> Gracias a las claves primarias y foráneas, podemos garantizar la coherencia de la información, evitando datos duplicados o inconsistentes.</w:t>
+      </w:r>
+      <w:r>
+        <w:br/>
+        <w:t xml:space="preserve">• </w:t>
+      </w:r>
+      <w:r>
+        <w:rPr>
+          <w:b/>
+          <w:bCs/>
+        </w:rPr>
+        <w:t>Eficiencia en consultas:</w:t>
+      </w:r>
+      <w:r>
+        <w:t xml:space="preserve"> MySQL nos permite realizar consultas optimizadas mediante índices y procedimientos almacenados, asegurando tiempos de respuesta rápidos incluso con grandes volúmenes de datos.</w:t>
+      </w:r>
+    </w:p>
+    <w:p>
+      <w:pPr>
+        <w:spacing w:line="360" w:lineRule="auto"/>
+        <w:jc w:val="both"/>
+      </w:pPr>
+    </w:p>
+    <w:p>
+      <w:pPr>
+        <w:spacing w:line="360" w:lineRule="auto"/>
+        <w:jc w:val="both"/>
+      </w:pPr>
+      <w:r>
+        <w:rPr>
+          <w:b/>
+          <w:bCs/>
+        </w:rPr>
         <w:t>MongoDB</w:t>
       </w:r>
       <w:r>
-        <w:t>: Es una base de datos no relacional (NoSQL) que hemos elegido para gestionar la información del proyecto debido a su flexibilidad, escalabilidad y facilidad de uso. MongoDB almacena los datos en formato de documentos JSON, lo que permite manejar estructuras complejas de manera más natural y eficiente en comparación con bases de datos relacionales.</w:t>
+        <w:t xml:space="preserve">: Es una base de datos no relacional (NoSQL) que hemos elegido para gestionar la información del proyecto debido a su flexibilidad, escalabilidad y facilidad de uso. MongoDB almacena los datos en formato de documentos JSON, lo que permite </w:t>
+      </w:r>
+      <w:r>
+        <w:lastRenderedPageBreak/>
+        <w:t>manejar estructuras complejas de manera más natural y eficiente en comparación con bases de datos relacionales.</w:t>
       </w:r>
     </w:p>
     <w:p>
@@ -2577,20 +2845,6 @@
     <w:p>
       <w:pPr>
         <w:spacing w:line="360" w:lineRule="auto"/>
-        <w:ind w:left="720"/>
-        <w:jc w:val="both"/>
-      </w:pPr>
-    </w:p>
-    <w:p>
-      <w:pPr>
-        <w:spacing w:line="360" w:lineRule="auto"/>
-        <w:ind w:left="720"/>
-        <w:jc w:val="both"/>
-      </w:pPr>
-    </w:p>
-    <w:p>
-      <w:pPr>
-        <w:spacing w:line="360" w:lineRule="auto"/>
         <w:jc w:val="both"/>
         <w:rPr>
           <w:b/>
@@ -2606,7 +2860,6 @@
           <w:sz w:val="28"/>
           <w:szCs w:val="24"/>
         </w:rPr>
-        <w:lastRenderedPageBreak/>
         <w:t>LENGUAJES</w:t>
       </w:r>
       <w:r>
@@ -2810,6 +3063,7 @@
           <w:lang w:eastAsia="es-ES"/>
           <w14:ligatures w14:val="none"/>
         </w:rPr>
+        <w:lastRenderedPageBreak/>
         <w:t>Generación de contenido dinámico</w:t>
       </w:r>
       <w:r>
@@ -2980,7 +3234,6 @@
           <w:lang w:eastAsia="es-ES"/>
           <w14:ligatures w14:val="none"/>
         </w:rPr>
-        <w:lastRenderedPageBreak/>
         <w:t>Interactividad dinámica</w:t>
       </w:r>
       <w:r>
@@ -3207,6 +3460,7 @@
       </w:r>
       <w:proofErr w:type="spellStart"/>
       <w:r>
+        <w:lastRenderedPageBreak/>
         <w:t>frontend</w:t>
       </w:r>
       <w:proofErr w:type="spellEnd"/>
@@ -3253,9 +3507,25 @@
     <w:p>
       <w:pPr>
         <w:pStyle w:val="Ttulo1"/>
-      </w:pPr>
-      <w:bookmarkStart w:id="2" w:name="_Toc189730632"/>
-      <w:r>
+        <w:rPr>
+          <w:rFonts w:ascii="Times New Roman" w:hAnsi="Times New Roman" w:cs="Times New Roman"/>
+          <w:b/>
+          <w:bCs/>
+          <w:color w:val="auto"/>
+          <w:sz w:val="28"/>
+          <w:szCs w:val="28"/>
+        </w:rPr>
+      </w:pPr>
+      <w:bookmarkStart w:id="2" w:name="_Toc189926259"/>
+      <w:r>
+        <w:rPr>
+          <w:rFonts w:ascii="Times New Roman" w:hAnsi="Times New Roman" w:cs="Times New Roman"/>
+          <w:b/>
+          <w:bCs/>
+          <w:color w:val="auto"/>
+          <w:sz w:val="28"/>
+          <w:szCs w:val="28"/>
+        </w:rPr>
         <w:t>COMPONENTES DEL EQUIPO Y APORTACIÓN REALIZADA POR CADA ESTUDIANTE</w:t>
       </w:r>
       <w:bookmarkEnd w:id="2"/>
@@ -3265,10 +3535,26 @@
     <w:p>
       <w:pPr>
         <w:pStyle w:val="Ttulo1"/>
-      </w:pPr>
-      <w:bookmarkStart w:id="3" w:name="_Toc189730633"/>
-      <w:r>
-        <w:lastRenderedPageBreak/>
+        <w:jc w:val="center"/>
+        <w:rPr>
+          <w:rFonts w:ascii="Times New Roman" w:hAnsi="Times New Roman" w:cs="Times New Roman"/>
+          <w:b/>
+          <w:bCs/>
+          <w:color w:val="auto"/>
+          <w:sz w:val="28"/>
+          <w:szCs w:val="28"/>
+        </w:rPr>
+      </w:pPr>
+      <w:bookmarkStart w:id="3" w:name="_Toc189926260"/>
+      <w:r>
+        <w:rPr>
+          <w:rFonts w:ascii="Times New Roman" w:hAnsi="Times New Roman" w:cs="Times New Roman"/>
+          <w:b/>
+          <w:bCs/>
+          <w:color w:val="auto"/>
+          <w:sz w:val="28"/>
+          <w:szCs w:val="28"/>
+        </w:rPr>
         <w:t>FASES DEL PROYECTO</w:t>
       </w:r>
       <w:bookmarkEnd w:id="3"/>
@@ -3276,9 +3562,25 @@
     <w:p>
       <w:pPr>
         <w:pStyle w:val="Ttulo2"/>
-      </w:pPr>
-      <w:bookmarkStart w:id="4" w:name="_Toc189730634"/>
-      <w:r>
+        <w:rPr>
+          <w:rFonts w:ascii="Times New Roman" w:hAnsi="Times New Roman" w:cs="Times New Roman"/>
+          <w:b/>
+          <w:bCs/>
+          <w:color w:val="auto"/>
+          <w:sz w:val="28"/>
+          <w:szCs w:val="28"/>
+        </w:rPr>
+      </w:pPr>
+      <w:bookmarkStart w:id="4" w:name="_Toc189926261"/>
+      <w:r>
+        <w:rPr>
+          <w:rFonts w:ascii="Times New Roman" w:hAnsi="Times New Roman" w:cs="Times New Roman"/>
+          <w:b/>
+          <w:bCs/>
+          <w:color w:val="auto"/>
+          <w:sz w:val="28"/>
+          <w:szCs w:val="28"/>
+        </w:rPr>
         <w:t>ESTUDIO DE MERCADO</w:t>
       </w:r>
       <w:bookmarkEnd w:id="4"/>
@@ -3356,9 +3658,14 @@
     </w:p>
     <w:p>
       <w:r>
-        <w:t>La sección de información del campamento urbano mantiene una estética coherente. Las imágenes ilustran bien las actividades y se ofrece una explicación detallada sobre las fechas y ubicación. Se incluye un enlace al PDF del menú, junto con información básica del campamento. La ventana de programación presenta información clara y concisa. En la sección de modalidades y pagos, cada tipo de jornada se diferencia con colores distintos, facilitando la comprensión. Además, se explica de manera sencilla el descuento disponible. La ventana "Sobre Nosotros" ofrece información sobre la empresa y el equipo. También cuentan con una sección de preguntas frecuentes (FAQ) con desplegables para cada consulta, un enlace directo a la reserva y un teléfono de contacto para resolver dudas.</w:t>
-      </w:r>
-    </w:p>
+        <w:t xml:space="preserve">La sección de información del campamento urbano mantiene una estética coherente. Las imágenes ilustran bien las actividades y se ofrece una explicación detallada sobre las </w:t>
+      </w:r>
+      <w:r>
+        <w:lastRenderedPageBreak/>
+        <w:t>fechas y ubicación. Se incluye un enlace al PDF del menú, junto con información básica del campamento. La ventana de programación presenta información clara y concisa. En la sección de modalidades y pagos, cada tipo de jornada se diferencia con colores distintos, facilitando la comprensión. Además, se explica de manera sencilla el descuento disponible. La ventana "Sobre Nosotros" ofrece información sobre la empresa y el equipo. También cuentan con una sección de preguntas frecuentes (FAQ) con desplegables para cada consulta, un enlace directo a la reserva y un teléfono de contacto para resolver dudas.</w:t>
+      </w:r>
+    </w:p>
+    <w:p/>
     <w:p>
       <w:r>
         <w:rPr>
@@ -3414,78 +3721,83 @@
     </w:p>
     <w:p>
       <w:r>
-        <w:t xml:space="preserve">En la primera ventana de registro, la estética no coincide con la página principal. En la segunda ventana, las opciones con plazas agotadas siguen siendo seleccionables, lo que puede generar confusión. En la tercera ventana, la opción de días sueltos no está bien explicada en cuanto al pago, lo que genera incertidumbre. El enlace para consultar información sobre los días de excursión debería ser un desplegable en la misma página </w:t>
-      </w:r>
-      <w:r>
+        <w:t xml:space="preserve">En la primera ventana de registro, la estética no coincide con la página principal. En la segunda ventana, las opciones con plazas agotadas siguen siendo seleccionables, lo que puede generar confusión. En la tercera ventana, la opción de días sueltos no está bien explicada en cuanto al pago, lo que genera incertidumbre. El enlace para consultar información sobre los días de excursión debería ser un desplegable en la misma página en lugar de abrir una nueva pestaña. Además, la información sobre las excursiones es escasa, lo que dificulta la selección de una opción. En la cuarta ventana de registro, no hay </w:t>
+      </w:r>
+      <w:proofErr w:type="spellStart"/>
+      <w:r>
+        <w:t>placeholders</w:t>
+      </w:r>
+      <w:proofErr w:type="spellEnd"/>
+      <w:r>
+        <w:t xml:space="preserve"> que guíen al usuario sobre el formato de los datos requeridos, ni avisos en tiempo real sobre la correcta cumplimentación de los campos.</w:t>
+      </w:r>
+    </w:p>
+    <w:p>
+      <w:r>
+        <w:t xml:space="preserve">En la ventana de información del campamento, podrían incluirse vídeos para mostrar mejor el funcionamiento del campamento, así como una galería de fotos. Un calendario podría facilitar la visualización de fechas y un mapa o enlace a Google </w:t>
+      </w:r>
+      <w:proofErr w:type="spellStart"/>
+      <w:r>
+        <w:t>Maps</w:t>
+      </w:r>
+      <w:proofErr w:type="spellEnd"/>
+      <w:r>
+        <w:t xml:space="preserve"> ayudaría con la ubicación. El enlace a modalidades y precios está mal ubicado, ya que no es específico del comedor. En la ventana de programación, faltan imágenes que ilustren las actividades diarias. En la ventana de modalidades y precios, solo aparecen opciones por quincena, mientras que en el pago también se permite por semana. Al seleccionar una jornada o quincena, no se preselecciona al ingresar en la página de reserva. Además, aparecen como disponibles algunas fechas sin plazas, lo que podría evitarse difuminando o marcando en gris dichas opciones. El descuento debería destacarse desde el principio para captar la atención.</w:t>
+      </w:r>
+    </w:p>
+    <w:p>
+      <w:r>
+        <w:t>En la ventana "Sobre Nosotros", faltan imágenes y descripciones del equipo. En la sección de FAQ, el título podría ser "Preguntas Frecuentes" para mayor claridad y la tipografía debería mejorarse para facilitar la lectura.</w:t>
+      </w:r>
+    </w:p>
+    <w:p/>
+    <w:p/>
+    <w:p>
+      <w:pPr>
+        <w:rPr>
+          <w:b/>
+          <w:bCs/>
+        </w:rPr>
+      </w:pPr>
+      <w:r>
+        <w:rPr>
+          <w:b/>
+          <w:bCs/>
+        </w:rPr>
         <w:lastRenderedPageBreak/>
-        <w:t xml:space="preserve">en lugar de abrir una nueva pestaña. Además, la información sobre las excursiones es escasa, lo que dificulta la selección de una opción. En la cuarta ventana de registro, no hay </w:t>
+        <w:t xml:space="preserve">Campamento La </w:t>
       </w:r>
       <w:proofErr w:type="spellStart"/>
       <w:r>
-        <w:t>placeholders</w:t>
+        <w:rPr>
+          <w:b/>
+          <w:bCs/>
+        </w:rPr>
+        <w:t>Molineta</w:t>
       </w:r>
       <w:proofErr w:type="spellEnd"/>
       <w:r>
-        <w:t xml:space="preserve"> que guíen al usuario sobre el formato de los datos requeridos, ni avisos en tiempo real sobre la correcta cumplimentación de los campos.</w:t>
-      </w:r>
-    </w:p>
-    <w:p>
-      <w:r>
-        <w:t xml:space="preserve">En la ventana de información del campamento, podrían incluirse vídeos para mostrar mejor el funcionamiento del campamento, así como una galería de fotos. Un calendario podría facilitar la visualización de fechas y un mapa o enlace a Google </w:t>
-      </w:r>
-      <w:proofErr w:type="spellStart"/>
-      <w:r>
-        <w:t>Maps</w:t>
-      </w:r>
-      <w:proofErr w:type="spellEnd"/>
-      <w:r>
-        <w:t xml:space="preserve"> ayudaría con la ubicación. El enlace a modalidades y precios está mal ubicado, ya que no es específico del comedor. En la ventana de programación, faltan imágenes que ilustren las actividades diarias. En la ventana de modalidades y precios, solo aparecen opciones por quincena, mientras que en el pago también se permite por semana. Al seleccionar una jornada o quincena, no se preselecciona al ingresar en la página de reserva. Además, aparecen como disponibles algunas fechas sin plazas, lo que podría evitarse difuminando o marcando en gris dichas opciones. El descuento debería destacarse desde el principio para captar la atención.</w:t>
-      </w:r>
-    </w:p>
-    <w:p>
-      <w:r>
-        <w:t>En la ventana "Sobre Nosotros", faltan imágenes y descripciones del equipo. En la sección de FAQ, el título podría ser "Preguntas Frecuentes" para mayor claridad y la tipografía debería mejorarse para facilitar la lectura.</w:t>
+        <w:br/>
+      </w:r>
+      <w:r>
+        <w:rPr>
+          <w:b/>
+          <w:bCs/>
+        </w:rPr>
+        <w:t>Estudio de Mercado</w:t>
+      </w:r>
+      <w:r>
+        <w:br/>
+      </w:r>
+      <w:r>
+        <w:rPr>
+          <w:b/>
+          <w:bCs/>
+        </w:rPr>
+        <w:t>Fecha: 02/12/2024</w:t>
       </w:r>
     </w:p>
     <w:p/>
-    <w:p>
-      <w:r>
-        <w:rPr>
-          <w:b/>
-          <w:bCs/>
-        </w:rPr>
-        <w:t xml:space="preserve">Campamento La </w:t>
-      </w:r>
-      <w:proofErr w:type="spellStart"/>
-      <w:r>
-        <w:rPr>
-          <w:b/>
-          <w:bCs/>
-        </w:rPr>
-        <w:t>Molineta</w:t>
-      </w:r>
-      <w:proofErr w:type="spellEnd"/>
-      <w:r>
-        <w:br/>
-      </w:r>
-      <w:r>
-        <w:rPr>
-          <w:b/>
-          <w:bCs/>
-        </w:rPr>
-        <w:t>Estudio de Mercado</w:t>
-      </w:r>
-      <w:r>
-        <w:br/>
-      </w:r>
-      <w:r>
-        <w:rPr>
-          <w:b/>
-          <w:bCs/>
-        </w:rPr>
-        <w:t>Fecha: 02/12/2024</w:t>
-      </w:r>
-    </w:p>
     <w:p>
       <w:r>
         <w:rPr>
@@ -3504,6 +3816,7 @@
         <w:t>La sección "Conócenos" mantiene la estética general e incluye imágenes del equipo, lo que genera confianza. Los objetivos están bien definidos. En la página de información del campamento urbano, se detallan la edad de los niños y las plazas disponibles, así como tarifas y horarios de manera visualmente accesible. Se incluyen iconos uniformes y una guía de normas descargable. También está disponible el menú para los padres. La ventana de instalaciones contiene un mapa de las infraestructuras. La ventana de contacto cuenta con un formulario sencillo y un mapa de ubicación. En la reserva, las opciones obligatorias están bien señaladas.</w:t>
       </w:r>
     </w:p>
+    <w:p/>
     <w:p>
       <w:r>
         <w:rPr>
@@ -3514,59 +3827,103 @@
       </w:r>
       <w:r>
         <w:br/>
-        <w:t xml:space="preserve">El botón de reserva en el home no contrasta bien con el fondo. El título de inscripción es poco legible sobre fondo amarillo. Faltan imágenes de actividades. El formulario tiene fondo blanco y no resalta. En "Conócenos" falta información del equipo. En la </w:t>
-      </w:r>
-      <w:r>
+        <w:t>El botón de reserva en el home no contrasta bien con el fondo. El título de inscripción es poco legible sobre fondo amarillo. Faltan imágenes de actividades. El formulario tiene fondo blanco y no resalta. En "Conócenos" falta información del equipo. En la información del campamento, el botón de reserva sigue sin contrastar bien y el horario es demasiado pequeño. La galería de imágenes debería ser un carrusel. En "Instalaciones", la leyenda del mapa es demasiado pequeña. La reserva tiene validación insuficiente y falta la sección de FAQ.</w:t>
+      </w:r>
+    </w:p>
+    <w:p/>
+    <w:p>
+      <w:pPr>
+        <w:pStyle w:val="Ttulo2"/>
+        <w:rPr>
+          <w:rFonts w:ascii="Times New Roman" w:hAnsi="Times New Roman" w:cs="Times New Roman"/>
+          <w:b/>
+          <w:bCs/>
+          <w:color w:val="auto"/>
+          <w:sz w:val="28"/>
+          <w:szCs w:val="28"/>
+        </w:rPr>
+      </w:pPr>
+      <w:bookmarkStart w:id="5" w:name="_Toc189926262"/>
+      <w:r>
+        <w:rPr>
+          <w:rFonts w:ascii="Times New Roman" w:hAnsi="Times New Roman" w:cs="Times New Roman"/>
+          <w:b/>
+          <w:bCs/>
+          <w:color w:val="auto"/>
+          <w:sz w:val="28"/>
+          <w:szCs w:val="28"/>
+        </w:rPr>
+        <w:t>ANÁLISIS DE LA APLICACIÓN</w:t>
+      </w:r>
+      <w:bookmarkEnd w:id="5"/>
+    </w:p>
+    <w:p>
+      <w:pPr>
+        <w:rPr>
+          <w:rFonts w:cs="Times New Roman"/>
+          <w:b/>
+          <w:bCs/>
+          <w:sz w:val="22"/>
+          <w:szCs w:val="20"/>
+        </w:rPr>
+      </w:pPr>
+    </w:p>
+    <w:p>
+      <w:pPr>
+        <w:pStyle w:val="Ttulo2"/>
+        <w:rPr>
+          <w:rFonts w:ascii="Times New Roman" w:hAnsi="Times New Roman" w:cs="Times New Roman"/>
+          <w:b/>
+          <w:bCs/>
+          <w:color w:val="auto"/>
+          <w:sz w:val="28"/>
+          <w:szCs w:val="28"/>
+        </w:rPr>
+      </w:pPr>
+      <w:bookmarkStart w:id="6" w:name="_Toc189926263"/>
+      <w:r>
+        <w:rPr>
+          <w:rFonts w:ascii="Times New Roman" w:hAnsi="Times New Roman" w:cs="Times New Roman"/>
+          <w:b/>
+          <w:bCs/>
+          <w:color w:val="auto"/>
+          <w:sz w:val="28"/>
+          <w:szCs w:val="28"/>
+        </w:rPr>
+        <w:t>MODELO DE DATOS</w:t>
+      </w:r>
+      <w:bookmarkEnd w:id="6"/>
+    </w:p>
+    <w:p>
+      <w:r>
+        <w:t xml:space="preserve">El sistema de gestión del campamento escolar se basa en una base de datos estructurada en torno a varias entidades principales: </w:t>
+      </w:r>
+      <w:r>
+        <w:rPr>
+          <w:b/>
+          <w:bCs/>
+        </w:rPr>
+        <w:t>Tutor, Pago, Tarifa, Inscripción, Niño, Grupo, Incidencia, Administrador, Monitor, Cronograma y Actividad</w:t>
+      </w:r>
+      <w:r>
+        <w:t>. Estas entidades están interconectadas mediante relaciones bien definidas que permiten gestionar las inscripciones, pagos, actividades y demás aspectos operativos del campamento.</w:t>
+      </w:r>
+    </w:p>
+    <w:p/>
+    <w:p>
+      <w:pPr>
+        <w:jc w:val="both"/>
+        <w:rPr>
+          <w:b/>
+          <w:bCs/>
+        </w:rPr>
+      </w:pPr>
+      <w:r>
+        <w:rPr>
+          <w:b/>
+          <w:bCs/>
+        </w:rPr>
         <w:lastRenderedPageBreak/>
-        <w:t>información del campamento, el botón de reserva sigue sin contrastar bien y el horario es demasiado pequeño. La galería de imágenes debería ser un carrusel. En "Instalaciones", la leyenda del mapa es demasiado pequeña. La reserva tiene validación insuficiente y falta la sección de FAQ.</w:t>
-      </w:r>
-    </w:p>
-    <w:p/>
-    <w:p>
-      <w:pPr>
-        <w:pStyle w:val="Ttulo2"/>
-      </w:pPr>
-      <w:r>
-        <w:t>ANÁLISIS DE LA APLICACIÓN</w:t>
-      </w:r>
-    </w:p>
-    <w:p/>
-    <w:p>
-      <w:pPr>
-        <w:pStyle w:val="Ttulo2"/>
-      </w:pPr>
-      <w:r>
-        <w:t>MODELO DE DATOS</w:t>
-      </w:r>
-    </w:p>
-    <w:p>
-      <w:r>
-        <w:t xml:space="preserve">El sistema de gestión del campamento escolar se basa en una base de datos estructurada en torno a varias entidades principales: </w:t>
-      </w:r>
-      <w:r>
-        <w:rPr>
-          <w:b/>
-          <w:bCs/>
-        </w:rPr>
-        <w:t>Tutor, Pago, Tarifa, Inscripción, Niño, Grupo, Incidencia, Administrador, Monitor, Cronograma y Actividad</w:t>
-      </w:r>
-      <w:r>
-        <w:t>. Estas entidades están interconectadas mediante relaciones bien definidas que permiten gestionar las inscripciones, pagos, actividades y demás aspectos operativos del campamento.</w:t>
-      </w:r>
-    </w:p>
-    <w:p>
-      <w:pPr>
-        <w:jc w:val="both"/>
-        <w:rPr>
-          <w:b/>
-          <w:bCs/>
-        </w:rPr>
-      </w:pPr>
-      <w:r>
-        <w:rPr>
-          <w:b/>
-          <w:bCs/>
-        </w:rPr>
         <w:t xml:space="preserve">Tabla </w:t>
       </w:r>
       <w:r>
@@ -3634,7 +3991,6 @@
       <w:r>
         <w:t>, pero cada pago está vinculado a un único tutor (</w:t>
       </w:r>
-      <w:proofErr w:type="gramStart"/>
       <w:r>
         <w:rPr>
           <w:i/>
@@ -3642,7 +3998,6 @@
         </w:rPr>
         <w:t>1:N</w:t>
       </w:r>
-      <w:proofErr w:type="gramEnd"/>
       <w:r>
         <w:t>).</w:t>
       </w:r>
@@ -3668,7 +4023,6 @@
       <w:r>
         <w:t>, aunque cada inscripción pertenece a un solo tutor (</w:t>
       </w:r>
-      <w:proofErr w:type="gramStart"/>
       <w:r>
         <w:rPr>
           <w:i/>
@@ -3676,7 +4030,6 @@
         </w:rPr>
         <w:t>1:N</w:t>
       </w:r>
-      <w:proofErr w:type="gramEnd"/>
       <w:r>
         <w:t>).</w:t>
       </w:r>
@@ -3702,7 +4055,6 @@
       <w:r>
         <w:t>, que serán gestionadas posteriormente por un administrador (</w:t>
       </w:r>
-      <w:proofErr w:type="gramStart"/>
       <w:r>
         <w:rPr>
           <w:i/>
@@ -3710,7 +4062,6 @@
         </w:rPr>
         <w:t>1:N</w:t>
       </w:r>
-      <w:proofErr w:type="gramEnd"/>
       <w:r>
         <w:t>).</w:t>
       </w:r>
@@ -3890,7 +4241,6 @@
         </w:rPr>
       </w:pPr>
       <w:r>
-        <w:lastRenderedPageBreak/>
         <w:t xml:space="preserve">Se asocia </w:t>
       </w:r>
       <w:r>
@@ -3913,7 +4263,6 @@
       <w:r>
         <w:t>(</w:t>
       </w:r>
-      <w:proofErr w:type="gramStart"/>
       <w:r>
         <w:rPr>
           <w:i/>
@@ -3921,32 +4270,9 @@
         </w:rPr>
         <w:t>1:N</w:t>
       </w:r>
-      <w:proofErr w:type="gramEnd"/>
       <w:r>
         <w:t>).</w:t>
       </w:r>
-    </w:p>
-    <w:p>
-      <w:pPr>
-        <w:ind w:left="720"/>
-        <w:jc w:val="both"/>
-      </w:pPr>
-    </w:p>
-    <w:p>
-      <w:pPr>
-        <w:ind w:left="720"/>
-        <w:jc w:val="both"/>
-      </w:pPr>
-    </w:p>
-    <w:p>
-      <w:pPr>
-        <w:ind w:left="720"/>
-        <w:jc w:val="both"/>
-        <w:rPr>
-          <w:b/>
-          <w:bCs/>
-        </w:rPr>
-      </w:pPr>
     </w:p>
     <w:p>
       <w:pPr>
@@ -4038,7 +4364,6 @@
       <w:r>
         <w:t>, pero cada pago solo tiene una tarifa (</w:t>
       </w:r>
-      <w:proofErr w:type="gramStart"/>
       <w:r>
         <w:rPr>
           <w:i/>
@@ -4046,7 +4371,6 @@
         </w:rPr>
         <w:t>1:N</w:t>
       </w:r>
-      <w:proofErr w:type="gramEnd"/>
       <w:r>
         <w:t>).</w:t>
       </w:r>
@@ -4054,16 +4378,42 @@
     <w:p>
       <w:pPr>
         <w:jc w:val="both"/>
-        <w:rPr>
-          <w:b/>
-          <w:bCs/>
-        </w:rPr>
-      </w:pPr>
-      <w:r>
-        <w:rPr>
-          <w:b/>
-          <w:bCs/>
-        </w:rPr>
+      </w:pPr>
+    </w:p>
+    <w:p>
+      <w:pPr>
+        <w:jc w:val="both"/>
+      </w:pPr>
+    </w:p>
+    <w:p>
+      <w:pPr>
+        <w:jc w:val="both"/>
+      </w:pPr>
+    </w:p>
+    <w:p>
+      <w:pPr>
+        <w:jc w:val="both"/>
+      </w:pPr>
+    </w:p>
+    <w:p>
+      <w:pPr>
+        <w:jc w:val="both"/>
+      </w:pPr>
+    </w:p>
+    <w:p>
+      <w:pPr>
+        <w:jc w:val="both"/>
+        <w:rPr>
+          <w:b/>
+          <w:bCs/>
+        </w:rPr>
+      </w:pPr>
+      <w:r>
+        <w:rPr>
+          <w:b/>
+          <w:bCs/>
+        </w:rPr>
+        <w:lastRenderedPageBreak/>
         <w:t>Tabla Inscripción</w:t>
       </w:r>
     </w:p>
@@ -4394,7 +4744,6 @@
       <w:r>
         <w:t>(</w:t>
       </w:r>
-      <w:proofErr w:type="gramStart"/>
       <w:r>
         <w:rPr>
           <w:i/>
@@ -4402,30 +4751,9 @@
         </w:rPr>
         <w:t>1:N</w:t>
       </w:r>
-      <w:proofErr w:type="gramEnd"/>
       <w:r>
         <w:t>).</w:t>
       </w:r>
-    </w:p>
-    <w:p>
-      <w:pPr>
-        <w:jc w:val="both"/>
-      </w:pPr>
-    </w:p>
-    <w:p>
-      <w:pPr>
-        <w:jc w:val="both"/>
-      </w:pPr>
-    </w:p>
-    <w:p>
-      <w:pPr>
-        <w:jc w:val="both"/>
-      </w:pPr>
-    </w:p>
-    <w:p>
-      <w:pPr>
-        <w:jc w:val="both"/>
-      </w:pPr>
     </w:p>
     <w:p>
       <w:pPr>
@@ -4670,6 +4998,7 @@
         </w:rPr>
       </w:pPr>
       <w:r>
+        <w:lastRenderedPageBreak/>
         <w:t xml:space="preserve">Un administrador </w:t>
       </w:r>
       <w:r>
@@ -4692,7 +5021,6 @@
       <w:r>
         <w:t>(</w:t>
       </w:r>
-      <w:proofErr w:type="gramStart"/>
       <w:r>
         <w:rPr>
           <w:i/>
@@ -4700,7 +5028,6 @@
         </w:rPr>
         <w:t>1:N</w:t>
       </w:r>
-      <w:proofErr w:type="gramEnd"/>
       <w:r>
         <w:t>).</w:t>
       </w:r>
@@ -4867,7 +5194,6 @@
       <w:r>
         <w:t>(</w:t>
       </w:r>
-      <w:proofErr w:type="gramStart"/>
       <w:r>
         <w:rPr>
           <w:i/>
@@ -4875,7 +5201,6 @@
         </w:rPr>
         <w:t>1:N</w:t>
       </w:r>
-      <w:proofErr w:type="gramEnd"/>
       <w:r>
         <w:t>).</w:t>
       </w:r>
@@ -4915,7 +5240,6 @@
       <w:r>
         <w:t>(</w:t>
       </w:r>
-      <w:proofErr w:type="gramStart"/>
       <w:r>
         <w:rPr>
           <w:i/>
@@ -4923,7 +5247,6 @@
         </w:rPr>
         <w:t>1:N</w:t>
       </w:r>
-      <w:proofErr w:type="gramEnd"/>
       <w:r>
         <w:t>).</w:t>
       </w:r>
@@ -4997,7 +5320,6 @@
           <w:b/>
           <w:bCs/>
         </w:rPr>
-        <w:lastRenderedPageBreak/>
         <w:t>Relaciones:</w:t>
       </w:r>
     </w:p>
@@ -5036,7 +5358,6 @@
       <w:r>
         <w:t>(</w:t>
       </w:r>
-      <w:proofErr w:type="gramStart"/>
       <w:r>
         <w:rPr>
           <w:i/>
@@ -5044,7 +5365,6 @@
         </w:rPr>
         <w:t>1:N</w:t>
       </w:r>
-      <w:proofErr w:type="gramEnd"/>
       <w:r>
         <w:t>).</w:t>
       </w:r>
@@ -5070,7 +5390,6 @@
       <w:r>
         <w:t>grupos dentro del sistema (</w:t>
       </w:r>
-      <w:proofErr w:type="gramStart"/>
       <w:r>
         <w:rPr>
           <w:i/>
@@ -5078,7 +5397,6 @@
         </w:rPr>
         <w:t>1:N</w:t>
       </w:r>
-      <w:proofErr w:type="gramEnd"/>
       <w:r>
         <w:t>).</w:t>
       </w:r>
@@ -5118,7 +5436,6 @@
       <w:r>
         <w:t>(</w:t>
       </w:r>
-      <w:proofErr w:type="gramStart"/>
       <w:r>
         <w:rPr>
           <w:i/>
@@ -5126,15 +5443,9 @@
         </w:rPr>
         <w:t>1:N</w:t>
       </w:r>
-      <w:proofErr w:type="gramEnd"/>
       <w:r>
         <w:t>).</w:t>
       </w:r>
-    </w:p>
-    <w:p>
-      <w:pPr>
-        <w:jc w:val="both"/>
-      </w:pPr>
     </w:p>
     <w:p>
       <w:pPr>
@@ -5265,7 +5576,6 @@
       <w:r>
         <w:t>(</w:t>
       </w:r>
-      <w:proofErr w:type="gramStart"/>
       <w:r>
         <w:rPr>
           <w:i/>
@@ -5273,7 +5583,6 @@
         </w:rPr>
         <w:t>1:N</w:t>
       </w:r>
-      <w:proofErr w:type="gramEnd"/>
       <w:r>
         <w:t>).</w:t>
       </w:r>
@@ -5291,6 +5600,7 @@
         </w:rPr>
       </w:pPr>
       <w:r>
+        <w:lastRenderedPageBreak/>
         <w:t xml:space="preserve">Puede crear </w:t>
       </w:r>
       <w:r>
@@ -5594,7 +5904,6 @@
         <w:jc w:val="both"/>
       </w:pPr>
       <w:r>
-        <w:lastRenderedPageBreak/>
         <w:t>Una actividad puede estar dentro de varios cronogramas, y un cronograma puede contener varias actividades (</w:t>
       </w:r>
       <w:r>
@@ -5757,16 +6066,32 @@
     <w:p>
       <w:pPr>
         <w:jc w:val="both"/>
-        <w:rPr>
-          <w:b/>
-          <w:bCs/>
-        </w:rPr>
-      </w:pPr>
-      <w:r>
-        <w:rPr>
-          <w:b/>
-          <w:bCs/>
-        </w:rPr>
+      </w:pPr>
+    </w:p>
+    <w:p>
+      <w:pPr>
+        <w:jc w:val="both"/>
+      </w:pPr>
+    </w:p>
+    <w:p>
+      <w:pPr>
+        <w:jc w:val="both"/>
+      </w:pPr>
+    </w:p>
+    <w:p>
+      <w:pPr>
+        <w:jc w:val="both"/>
+        <w:rPr>
+          <w:b/>
+          <w:bCs/>
+        </w:rPr>
+      </w:pPr>
+      <w:r>
+        <w:rPr>
+          <w:b/>
+          <w:bCs/>
+        </w:rPr>
+        <w:lastRenderedPageBreak/>
         <w:t>Actividad-Cronograma</w:t>
       </w:r>
     </w:p>
@@ -5916,18 +6241,22 @@
         </w:drawing>
       </w:r>
     </w:p>
-    <w:p>
-      <w:pPr>
-        <w:rPr>
-          <w:b/>
-          <w:bCs/>
-        </w:rPr>
-      </w:pPr>
-      <w:r>
-        <w:rPr>
-          <w:b/>
-          <w:bCs/>
-        </w:rPr>
+    <w:p/>
+    <w:p/>
+    <w:p/>
+    <w:p>
+      <w:pPr>
+        <w:rPr>
+          <w:b/>
+          <w:bCs/>
+        </w:rPr>
+      </w:pPr>
+      <w:r>
+        <w:rPr>
+          <w:b/>
+          <w:bCs/>
+        </w:rPr>
+        <w:lastRenderedPageBreak/>
         <w:t>Tutor / Pago</w:t>
       </w:r>
     </w:p>
@@ -5968,7 +6297,6 @@
           <w:b/>
           <w:bCs/>
         </w:rPr>
-        <w:lastRenderedPageBreak/>
         <w:t>Explicación</w:t>
       </w:r>
       <w:r>
@@ -6094,8 +6422,6 @@
       </w:r>
     </w:p>
     <w:p/>
-    <w:p/>
-    <w:p/>
     <w:p>
       <w:pPr>
         <w:rPr>
@@ -6431,10 +6757,7 @@
         <w:t>.</w:t>
       </w:r>
       <w:r>
-        <w:t xml:space="preserve"> </w:t>
-      </w:r>
-      <w:r>
-        <w:t xml:space="preserve">Si eliminamos el </w:t>
+        <w:t xml:space="preserve"> Si eliminamos el </w:t>
       </w:r>
       <w:r>
         <w:rPr>
@@ -6467,18 +6790,22 @@
         <w:t>.</w:t>
       </w:r>
     </w:p>
-    <w:p>
-      <w:pPr>
-        <w:rPr>
-          <w:b/>
-          <w:bCs/>
-        </w:rPr>
-      </w:pPr>
-      <w:r>
-        <w:rPr>
-          <w:b/>
-          <w:bCs/>
-        </w:rPr>
+    <w:p/>
+    <w:p/>
+    <w:p/>
+    <w:p>
+      <w:pPr>
+        <w:rPr>
+          <w:b/>
+          <w:bCs/>
+        </w:rPr>
+      </w:pPr>
+      <w:r>
+        <w:rPr>
+          <w:b/>
+          <w:bCs/>
+        </w:rPr>
+        <w:lastRenderedPageBreak/>
         <w:t>Inscripción / Niño</w:t>
       </w:r>
     </w:p>
@@ -6519,7 +6846,6 @@
           <w:b/>
           <w:bCs/>
         </w:rPr>
-        <w:lastRenderedPageBreak/>
         <w:t>Explicación</w:t>
       </w:r>
       <w:r>
@@ -7114,6 +7440,7 @@
           <w:b/>
           <w:bCs/>
         </w:rPr>
+        <w:lastRenderedPageBreak/>
         <w:t>Administrador / Cronograma</w:t>
       </w:r>
     </w:p>
@@ -7154,7 +7481,6 @@
           <w:b/>
           <w:bCs/>
         </w:rPr>
-        <w:lastRenderedPageBreak/>
         <w:t>Explicación</w:t>
       </w:r>
       <w:r>
@@ -7280,10 +7606,6 @@
         <w:t>.</w:t>
       </w:r>
     </w:p>
-    <w:p/>
-    <w:p/>
-    <w:p/>
-    <w:p/>
     <w:p>
       <w:pPr>
         <w:rPr>
@@ -7352,43 +7674,269 @@
     </w:p>
     <w:p>
       <w:pPr>
+        <w:rPr>
+          <w:b/>
+          <w:bCs/>
+        </w:rPr>
+      </w:pPr>
+    </w:p>
+    <w:p>
+      <w:pPr>
+        <w:rPr>
+          <w:rFonts w:cs="Times New Roman"/>
+          <w:b/>
+          <w:bCs/>
+          <w:sz w:val="22"/>
+          <w:szCs w:val="20"/>
+        </w:rPr>
+      </w:pPr>
+      <w:r>
+        <w:rPr>
+          <w:rFonts w:eastAsiaTheme="majorEastAsia" w:cs="Times New Roman"/>
+          <w:b/>
+          <w:bCs/>
+          <w:sz w:val="28"/>
+          <w:szCs w:val="28"/>
+        </w:rPr>
+        <w:t>DISEÑO DE INTERFACES</w:t>
+      </w:r>
+    </w:p>
+    <w:p>
+      <w:pPr>
+        <w:rPr>
+          <w:b/>
+          <w:bCs/>
+        </w:rPr>
+      </w:pPr>
+    </w:p>
+    <w:p>
+      <w:pPr>
+        <w:rPr>
+          <w:b/>
+          <w:bCs/>
+        </w:rPr>
+      </w:pPr>
+      <w:r>
+        <w:rPr>
+          <w:b/>
+          <w:bCs/>
+        </w:rPr>
+        <w:t>Diseño y estructura de la página web del campamento</w:t>
+      </w:r>
+    </w:p>
+    <w:p>
+      <w:r>
+        <w:t xml:space="preserve">Para el sistema de diseño, hemos elegido colores azules que nos trasladan al azul del océano, un color que consideramos imprescindible para una temática pirata. En el home, hemos optado por poner un barco pirata surcando los mares, seguido de una estructura con un degradado que inicia en un azul suave y se va oscureciendo conforme haces </w:t>
+      </w:r>
+      <w:proofErr w:type="spellStart"/>
+      <w:r>
+        <w:t>scroll</w:t>
+      </w:r>
+      <w:proofErr w:type="spellEnd"/>
+      <w:r>
+        <w:t xml:space="preserve"> vertical, tal y como lo hace el fondo oceánico.</w:t>
+      </w:r>
+    </w:p>
+    <w:p/>
+    <w:p>
+      <w:r>
+        <w:t xml:space="preserve">Hemos optado por el mismo azul suave para el apartado del </w:t>
+      </w:r>
+      <w:proofErr w:type="spellStart"/>
+      <w:r>
+        <w:t>login</w:t>
+      </w:r>
+      <w:proofErr w:type="spellEnd"/>
+      <w:r>
+        <w:t>, registro y las inscripciones. El resto de la web continúa con el degradado, tal y como se emplea en el home. De la misma forma, tenemos un apartado visual muy similar para la vista del monitor y la del administrador.</w:t>
+      </w:r>
+    </w:p>
+    <w:p/>
+    <w:p>
+      <w:r>
+        <w:t xml:space="preserve">La estructura de la web está dividida en tres partes. La primera sería la vista que puede tener cualquier usuario (especialmente orientada a tutores de los niños), que consta </w:t>
+      </w:r>
+      <w:r>
+        <w:t>del home</w:t>
+      </w:r>
+      <w:r>
+        <w:t>, el apartado de la inscripción del niño, la programación, donde se muestran algunas de las actividades que pueden realizar los niños en el campamento mediante un carrusel de imágenes, y el horario, con algunas de las actividades que se hacen a la semana.</w:t>
+      </w:r>
+    </w:p>
+    <w:p/>
+    <w:p>
+      <w:r>
+        <w:t>También cuenta con un apartado de tarifas del campamento, donde los usuarios pueden informarse acerca de las mismas según el horario que deseen. Además, contamos con un apartado "¿Quiénes somos?", donde se muestran la misión, visión y valores de nuestro campamento, así como una pequeña carta de presentación con información sobre nuestros monitores.</w:t>
+      </w:r>
+    </w:p>
+    <w:p/>
+    <w:p>
+      <w:r>
+        <w:t>Por último, en esta sección tenemos el apartado de preguntas frecuentes, donde los usuarios podrán ver algunas de las preguntas y respuestas más interesantes acerca del campamento o del propio funcionamiento de la web. Después, el usuario cuenta con un apartado de contacto, donde podrá llamar por teléfono o enviar un mail para consultar más información.</w:t>
+      </w:r>
+    </w:p>
+    <w:p/>
+    <w:p>
+      <w:r>
+        <w:t>En el lado del monitor, contamos con un apartado principal donde puede consultar las próximas actividades a realizar, así como los materiales que va a necesitar o la posibilidad de cambiar las actividades. También contará con una sección donde puede pasar lista para saber qué niños no han acudido ese día al campamento y poder llevar un buen control sobre el funcionamiento del campamento.</w:t>
+      </w:r>
+    </w:p>
+    <w:p/>
+    <w:p>
+      <w:r>
+        <w:t>Además, cuenta con un cronograma donde puede ver de una forma muy visual las actividades que se van a realizar, e incluso añadirlas o eliminarlas. Por último, tiene una sección con más información de su grupo de alumnos, donde puede consultar información sobre el contacto de los tutores de los niños de una forma muy sencilla, así como realizar anotaciones sobre los alumnos.</w:t>
+      </w:r>
+    </w:p>
+    <w:p/>
+    <w:p>
+      <w:r>
+        <w:t>En el lado del administrador, este podrá consultar las actividades tal y como lo hace el monitor, pero desde un punto de vista más logístico, ya que podrá ver también las últimas conexiones de los monitores, los pagos pendientes, actualizaciones de tarifas o incluso la posibilidad de realizar descuentos.</w:t>
+      </w:r>
+    </w:p>
+    <w:p/>
+    <w:p>
+      <w:r>
+        <w:t>Además, cuenta con una sección donde puede crear o eliminar monitores y grupos de alumnos, controlar las inscripciones y crear excursiones o actividades en el cronograma.</w:t>
+      </w:r>
+    </w:p>
+    <w:p/>
+    <w:p>
+      <w:pPr>
+        <w:rPr>
+          <w:rFonts w:eastAsiaTheme="majorEastAsia" w:cs="Times New Roman"/>
+          <w:b/>
+          <w:bCs/>
+          <w:sz w:val="28"/>
+          <w:szCs w:val="28"/>
+        </w:rPr>
+      </w:pPr>
+      <w:r>
+        <w:rPr>
+          <w:rFonts w:eastAsiaTheme="majorEastAsia" w:cs="Times New Roman"/>
+          <w:b/>
+          <w:bCs/>
+          <w:sz w:val="28"/>
+          <w:szCs w:val="28"/>
+        </w:rPr>
+        <w:t>PLANIFICACIÓN DEL DESARROLLO</w:t>
+      </w:r>
+    </w:p>
+    <w:p>
+      <w:pPr>
+        <w:rPr>
+          <w:rFonts w:asciiTheme="majorHAnsi" w:eastAsiaTheme="majorEastAsia" w:hAnsiTheme="majorHAnsi" w:cstheme="majorBidi"/>
+          <w:color w:val="2F5496" w:themeColor="accent1" w:themeShade="BF"/>
+          <w:sz w:val="32"/>
+          <w:szCs w:val="32"/>
+        </w:rPr>
+      </w:pPr>
+      <w:r>
+        <w:t xml:space="preserve">Para organizar el desarrollo de la web, hemos trabajado diariamente en sesiones de 5 a 6 horas a través de </w:t>
+      </w:r>
+      <w:proofErr w:type="spellStart"/>
+      <w:r>
+        <w:t>Discord</w:t>
+      </w:r>
+      <w:proofErr w:type="spellEnd"/>
+      <w:r>
+        <w:t xml:space="preserve">, asegurando una comunicación fluida y un trabajo colaborativo eficiente. Al inicio de cada sesión, revisábamos los objetivos semanales, estableciendo las tareas a completar para cumplir con las entregas planificadas. Nos íbamos dividiendo el trabajo según las necesidades del proyecto, lo que nos permitía </w:t>
+      </w:r>
+      <w:r>
+        <w:lastRenderedPageBreak/>
+        <w:t>avanzar de manera estructurada y optimizada. Para gestionar el código de forma eficiente, hemos utilizado Git y GitHub, subiendo nuestros cambios y descargando los del resto del equipo. Hemos trabajado con diferentes ramas, lo que nos permitió desarrollar nuevas funcionalidades sin afectar la versión principal, facilitando la integración y evitando conflictos en el código.</w:t>
+      </w:r>
+    </w:p>
+    <w:p/>
+    <w:p/>
+    <w:p>
+      <w:pPr>
         <w:pStyle w:val="Ttulo1"/>
-      </w:pPr>
-      <w:bookmarkStart w:id="5" w:name="_Toc189730635"/>
-      <w:r>
+        <w:rPr>
+          <w:rFonts w:ascii="Times New Roman" w:hAnsi="Times New Roman" w:cs="Times New Roman"/>
+          <w:b/>
+          <w:bCs/>
+          <w:color w:val="auto"/>
+          <w:sz w:val="28"/>
+          <w:szCs w:val="28"/>
+        </w:rPr>
+      </w:pPr>
+      <w:bookmarkStart w:id="7" w:name="_Toc189926264"/>
+      <w:r>
+        <w:rPr>
+          <w:rFonts w:ascii="Times New Roman" w:hAnsi="Times New Roman" w:cs="Times New Roman"/>
+          <w:b/>
+          <w:bCs/>
+          <w:color w:val="auto"/>
+          <w:sz w:val="28"/>
+          <w:szCs w:val="28"/>
+        </w:rPr>
         <w:t>CONCLUSIONES Y MEJORAS DEL PROYECTO</w:t>
       </w:r>
-      <w:bookmarkEnd w:id="5"/>
+      <w:bookmarkEnd w:id="7"/>
     </w:p>
     <w:p/>
     <w:p>
       <w:pPr>
         <w:pStyle w:val="Ttulo1"/>
-      </w:pPr>
-      <w:bookmarkStart w:id="6" w:name="_Toc189730636"/>
-      <w:r>
+        <w:rPr>
+          <w:rFonts w:ascii="Times New Roman" w:hAnsi="Times New Roman" w:cs="Times New Roman"/>
+          <w:b/>
+          <w:bCs/>
+          <w:color w:val="auto"/>
+          <w:sz w:val="28"/>
+          <w:szCs w:val="28"/>
+        </w:rPr>
+      </w:pPr>
+      <w:bookmarkStart w:id="8" w:name="_Toc189926265"/>
+      <w:r>
+        <w:rPr>
+          <w:rFonts w:ascii="Times New Roman" w:hAnsi="Times New Roman" w:cs="Times New Roman"/>
+          <w:b/>
+          <w:bCs/>
+          <w:color w:val="auto"/>
+          <w:sz w:val="28"/>
+          <w:szCs w:val="28"/>
+        </w:rPr>
         <w:t>BIBLIOGRAFÍA</w:t>
       </w:r>
-      <w:bookmarkEnd w:id="6"/>
-    </w:p>
-    <w:p/>
+      <w:bookmarkEnd w:id="8"/>
+    </w:p>
+    <w:p>
+      <w:pPr>
+        <w:rPr>
+          <w:rFonts w:eastAsiaTheme="majorEastAsia" w:cs="Times New Roman"/>
+          <w:b/>
+          <w:bCs/>
+          <w:sz w:val="28"/>
+          <w:szCs w:val="28"/>
+        </w:rPr>
+      </w:pPr>
+    </w:p>
     <w:p>
       <w:pPr>
         <w:pStyle w:val="Ttulo1"/>
-      </w:pPr>
-      <w:bookmarkStart w:id="7" w:name="_Toc189730637"/>
-      <w:r>
+        <w:rPr>
+          <w:rFonts w:ascii="Times New Roman" w:hAnsi="Times New Roman" w:cs="Times New Roman"/>
+          <w:b/>
+          <w:bCs/>
+          <w:color w:val="auto"/>
+          <w:sz w:val="28"/>
+          <w:szCs w:val="28"/>
+        </w:rPr>
+      </w:pPr>
+      <w:bookmarkStart w:id="9" w:name="_Toc189926266"/>
+      <w:r>
+        <w:rPr>
+          <w:rFonts w:ascii="Times New Roman" w:hAnsi="Times New Roman" w:cs="Times New Roman"/>
+          <w:b/>
+          <w:bCs/>
+          <w:color w:val="auto"/>
+          <w:sz w:val="28"/>
+          <w:szCs w:val="28"/>
+        </w:rPr>
         <w:t>ANEXOS</w:t>
       </w:r>
-      <w:bookmarkEnd w:id="7"/>
-    </w:p>
-    <w:p>
-      <w:pPr>
-        <w:rPr>
-          <w:sz w:val="28"/>
-          <w:szCs w:val="24"/>
-        </w:rPr>
-      </w:pPr>
+      <w:bookmarkEnd w:id="9"/>
     </w:p>
     <w:p>
       <w:pPr>
@@ -7400,11 +7948,11 @@
       </w:pPr>
     </w:p>
     <w:p>
-      <w:bookmarkStart w:id="8" w:name="_Toc188296911"/>
+      <w:bookmarkStart w:id="10" w:name="_Toc188296911"/>
       <w:r>
         <w:t>DIAGRAMA ENTIDAD-RELACIÓN</w:t>
       </w:r>
-      <w:bookmarkEnd w:id="8"/>
+      <w:bookmarkEnd w:id="10"/>
     </w:p>
     <w:p>
       <w:pPr>
@@ -7506,12 +8054,12 @@
       </w:r>
     </w:p>
     <w:p>
-      <w:bookmarkStart w:id="9" w:name="_Toc188296912"/>
+      <w:bookmarkStart w:id="11" w:name="_Toc188296912"/>
       <w:r>
         <w:lastRenderedPageBreak/>
         <w:t>MODELO RELACIONAL</w:t>
       </w:r>
-      <w:bookmarkEnd w:id="9"/>
+      <w:bookmarkEnd w:id="11"/>
     </w:p>
     <w:p>
       <w:r>
@@ -7794,7 +8342,7 @@
           <w:noProof/>
         </w:rPr>
       </w:pPr>
-      <w:bookmarkStart w:id="10" w:name="_Toc188296913"/>
+      <w:bookmarkStart w:id="12" w:name="_Toc188296913"/>
       <w:r>
         <w:rPr>
           <w:noProof/>
@@ -7802,7 +8350,7 @@
         <w:lastRenderedPageBreak/>
         <w:t>DIAGRAMA DE CASOS DE USO</w:t>
       </w:r>
-      <w:bookmarkEnd w:id="10"/>
+      <w:bookmarkEnd w:id="12"/>
     </w:p>
     <w:p>
       <w:pPr>
@@ -7816,15 +8364,17 @@
       <w:pPr>
         <w:jc w:val="center"/>
       </w:pPr>
-      <w:r>
-        <w:rPr>
-          <w:noProof/>
-        </w:rPr>
+    </w:p>
+    <w:p>
+      <w:pPr>
+        <w:jc w:val="center"/>
+      </w:pPr>
+      <w:r>
         <w:drawing>
-          <wp:inline distT="0" distB="0" distL="0" distR="0" wp14:anchorId="63654749" wp14:editId="794DCDEB">
-            <wp:extent cx="5400675" cy="6048375"/>
-            <wp:effectExtent l="0" t="0" r="9525" b="9525"/>
-            <wp:docPr id="306866644" name="Imagen 13"/>
+          <wp:inline distT="0" distB="0" distL="0" distR="0" wp14:anchorId="65B3FE1B" wp14:editId="2958558B">
+            <wp:extent cx="5400040" cy="5843270"/>
+            <wp:effectExtent l="0" t="0" r="0" b="5080"/>
+            <wp:docPr id="1902279999" name="Imagen 2" descr="Diagrama&#10;&#10;El contenido generado por IA puede ser incorrecto."/>
             <wp:cNvGraphicFramePr>
               <a:graphicFrameLocks xmlns:a="http://schemas.openxmlformats.org/drawingml/2006/main" noChangeAspect="1"/>
             </wp:cNvGraphicFramePr>
@@ -7832,7 +8382,7 @@
               <a:graphicData uri="http://schemas.openxmlformats.org/drawingml/2006/picture">
                 <pic:pic xmlns:pic="http://schemas.openxmlformats.org/drawingml/2006/picture">
                   <pic:nvPicPr>
-                    <pic:cNvPr id="0" name="Picture 13"/>
+                    <pic:cNvPr id="1902279999" name="Imagen 2" descr="Diagrama&#10;&#10;El contenido generado por IA puede ser incorrecto."/>
                     <pic:cNvPicPr>
                       <a:picLocks noChangeAspect="1" noChangeArrowheads="1"/>
                     </pic:cNvPicPr>
@@ -7853,7 +8403,7 @@
                   <pic:spPr bwMode="auto">
                     <a:xfrm>
                       <a:off x="0" y="0"/>
-                      <a:ext cx="5400675" cy="6048375"/>
+                      <a:ext cx="5400040" cy="5843270"/>
                     </a:xfrm>
                     <a:prstGeom prst="rect">
                       <a:avLst/>
@@ -7909,8 +8459,12 @@
       <w:pPr>
         <w:jc w:val="center"/>
       </w:pPr>
-      <w:r>
-        <w:lastRenderedPageBreak/>
+    </w:p>
+    <w:p>
+      <w:pPr>
+        <w:jc w:val="center"/>
+      </w:pPr>
+      <w:r>
         <w:t>DIAGRAMA UML</w:t>
       </w:r>
     </w:p>
@@ -10965,6 +11519,119 @@
     </w:lvl>
   </w:abstractNum>
   <w:abstractNum w:abstractNumId="20" w15:restartNumberingAfterBreak="0">
+    <w:nsid w:val="2F021A90"/>
+    <w:multiLevelType w:val="multilevel"/>
+    <w:tmpl w:val="69DA611C"/>
+    <w:lvl w:ilvl="0">
+      <w:start w:val="1"/>
+      <w:numFmt w:val="decimal"/>
+      <w:lvlText w:val="%1."/>
+      <w:lvlJc w:val="left"/>
+      <w:pPr>
+        <w:tabs>
+          <w:tab w:val="num" w:pos="720"/>
+        </w:tabs>
+        <w:ind w:left="720" w:hanging="360"/>
+      </w:pPr>
+    </w:lvl>
+    <w:lvl w:ilvl="1" w:tentative="1">
+      <w:start w:val="1"/>
+      <w:numFmt w:val="decimal"/>
+      <w:lvlText w:val="%2."/>
+      <w:lvlJc w:val="left"/>
+      <w:pPr>
+        <w:tabs>
+          <w:tab w:val="num" w:pos="1440"/>
+        </w:tabs>
+        <w:ind w:left="1440" w:hanging="360"/>
+      </w:pPr>
+    </w:lvl>
+    <w:lvl w:ilvl="2" w:tentative="1">
+      <w:start w:val="1"/>
+      <w:numFmt w:val="decimal"/>
+      <w:lvlText w:val="%3."/>
+      <w:lvlJc w:val="left"/>
+      <w:pPr>
+        <w:tabs>
+          <w:tab w:val="num" w:pos="2160"/>
+        </w:tabs>
+        <w:ind w:left="2160" w:hanging="360"/>
+      </w:pPr>
+    </w:lvl>
+    <w:lvl w:ilvl="3" w:tentative="1">
+      <w:start w:val="1"/>
+      <w:numFmt w:val="decimal"/>
+      <w:lvlText w:val="%4."/>
+      <w:lvlJc w:val="left"/>
+      <w:pPr>
+        <w:tabs>
+          <w:tab w:val="num" w:pos="2880"/>
+        </w:tabs>
+        <w:ind w:left="2880" w:hanging="360"/>
+      </w:pPr>
+    </w:lvl>
+    <w:lvl w:ilvl="4" w:tentative="1">
+      <w:start w:val="1"/>
+      <w:numFmt w:val="decimal"/>
+      <w:lvlText w:val="%5."/>
+      <w:lvlJc w:val="left"/>
+      <w:pPr>
+        <w:tabs>
+          <w:tab w:val="num" w:pos="3600"/>
+        </w:tabs>
+        <w:ind w:left="3600" w:hanging="360"/>
+      </w:pPr>
+    </w:lvl>
+    <w:lvl w:ilvl="5" w:tentative="1">
+      <w:start w:val="1"/>
+      <w:numFmt w:val="decimal"/>
+      <w:lvlText w:val="%6."/>
+      <w:lvlJc w:val="left"/>
+      <w:pPr>
+        <w:tabs>
+          <w:tab w:val="num" w:pos="4320"/>
+        </w:tabs>
+        <w:ind w:left="4320" w:hanging="360"/>
+      </w:pPr>
+    </w:lvl>
+    <w:lvl w:ilvl="6" w:tentative="1">
+      <w:start w:val="1"/>
+      <w:numFmt w:val="decimal"/>
+      <w:lvlText w:val="%7."/>
+      <w:lvlJc w:val="left"/>
+      <w:pPr>
+        <w:tabs>
+          <w:tab w:val="num" w:pos="5040"/>
+        </w:tabs>
+        <w:ind w:left="5040" w:hanging="360"/>
+      </w:pPr>
+    </w:lvl>
+    <w:lvl w:ilvl="7" w:tentative="1">
+      <w:start w:val="1"/>
+      <w:numFmt w:val="decimal"/>
+      <w:lvlText w:val="%8."/>
+      <w:lvlJc w:val="left"/>
+      <w:pPr>
+        <w:tabs>
+          <w:tab w:val="num" w:pos="5760"/>
+        </w:tabs>
+        <w:ind w:left="5760" w:hanging="360"/>
+      </w:pPr>
+    </w:lvl>
+    <w:lvl w:ilvl="8" w:tentative="1">
+      <w:start w:val="1"/>
+      <w:numFmt w:val="decimal"/>
+      <w:lvlText w:val="%9."/>
+      <w:lvlJc w:val="left"/>
+      <w:pPr>
+        <w:tabs>
+          <w:tab w:val="num" w:pos="6480"/>
+        </w:tabs>
+        <w:ind w:left="6480" w:hanging="360"/>
+      </w:pPr>
+    </w:lvl>
+  </w:abstractNum>
+  <w:abstractNum w:abstractNumId="21" w15:restartNumberingAfterBreak="0">
     <w:nsid w:val="31030B9E"/>
     <w:multiLevelType w:val="multilevel"/>
     <w:tmpl w:val="95F8F27C"/>
@@ -11113,7 +11780,7 @@
       </w:rPr>
     </w:lvl>
   </w:abstractNum>
-  <w:abstractNum w:abstractNumId="21" w15:restartNumberingAfterBreak="0">
+  <w:abstractNum w:abstractNumId="22" w15:restartNumberingAfterBreak="0">
     <w:nsid w:val="329D6149"/>
     <w:multiLevelType w:val="multilevel"/>
     <w:tmpl w:val="F746FB94"/>
@@ -11262,7 +11929,7 @@
       </w:rPr>
     </w:lvl>
   </w:abstractNum>
-  <w:abstractNum w:abstractNumId="22" w15:restartNumberingAfterBreak="0">
+  <w:abstractNum w:abstractNumId="23" w15:restartNumberingAfterBreak="0">
     <w:nsid w:val="35164E78"/>
     <w:multiLevelType w:val="multilevel"/>
     <w:tmpl w:val="0BA2B4AC"/>
@@ -11411,7 +12078,7 @@
       </w:rPr>
     </w:lvl>
   </w:abstractNum>
-  <w:abstractNum w:abstractNumId="23" w15:restartNumberingAfterBreak="0">
+  <w:abstractNum w:abstractNumId="24" w15:restartNumberingAfterBreak="0">
     <w:nsid w:val="36AE771F"/>
     <w:multiLevelType w:val="multilevel"/>
     <w:tmpl w:val="88E43850"/>
@@ -11560,7 +12227,7 @@
       </w:rPr>
     </w:lvl>
   </w:abstractNum>
-  <w:abstractNum w:abstractNumId="24" w15:restartNumberingAfterBreak="0">
+  <w:abstractNum w:abstractNumId="25" w15:restartNumberingAfterBreak="0">
     <w:nsid w:val="37A8730E"/>
     <w:multiLevelType w:val="multilevel"/>
     <w:tmpl w:val="67E43424"/>
@@ -11709,7 +12376,7 @@
       </w:rPr>
     </w:lvl>
   </w:abstractNum>
-  <w:abstractNum w:abstractNumId="25" w15:restartNumberingAfterBreak="0">
+  <w:abstractNum w:abstractNumId="26" w15:restartNumberingAfterBreak="0">
     <w:nsid w:val="3C997C17"/>
     <w:multiLevelType w:val="hybridMultilevel"/>
     <w:tmpl w:val="12E8A334"/>
@@ -11821,7 +12488,7 @@
       </w:rPr>
     </w:lvl>
   </w:abstractNum>
-  <w:abstractNum w:abstractNumId="26" w15:restartNumberingAfterBreak="0">
+  <w:abstractNum w:abstractNumId="27" w15:restartNumberingAfterBreak="0">
     <w:nsid w:val="3DD43BBB"/>
     <w:multiLevelType w:val="multilevel"/>
     <w:tmpl w:val="6D607234"/>
@@ -11970,7 +12637,7 @@
       </w:rPr>
     </w:lvl>
   </w:abstractNum>
-  <w:abstractNum w:abstractNumId="27" w15:restartNumberingAfterBreak="0">
+  <w:abstractNum w:abstractNumId="28" w15:restartNumberingAfterBreak="0">
     <w:nsid w:val="3F735020"/>
     <w:multiLevelType w:val="multilevel"/>
     <w:tmpl w:val="69A43860"/>
@@ -12119,7 +12786,7 @@
       </w:rPr>
     </w:lvl>
   </w:abstractNum>
-  <w:abstractNum w:abstractNumId="28" w15:restartNumberingAfterBreak="0">
+  <w:abstractNum w:abstractNumId="29" w15:restartNumberingAfterBreak="0">
     <w:nsid w:val="41B87DBB"/>
     <w:multiLevelType w:val="multilevel"/>
     <w:tmpl w:val="657A634C"/>
@@ -12268,7 +12935,7 @@
       </w:rPr>
     </w:lvl>
   </w:abstractNum>
-  <w:abstractNum w:abstractNumId="29" w15:restartNumberingAfterBreak="0">
+  <w:abstractNum w:abstractNumId="30" w15:restartNumberingAfterBreak="0">
     <w:nsid w:val="433D4A73"/>
     <w:multiLevelType w:val="multilevel"/>
     <w:tmpl w:val="DC126338"/>
@@ -12417,7 +13084,7 @@
       </w:rPr>
     </w:lvl>
   </w:abstractNum>
-  <w:abstractNum w:abstractNumId="30" w15:restartNumberingAfterBreak="0">
+  <w:abstractNum w:abstractNumId="31" w15:restartNumberingAfterBreak="0">
     <w:nsid w:val="46DB0766"/>
     <w:multiLevelType w:val="multilevel"/>
     <w:tmpl w:val="0D48C60A"/>
@@ -12566,7 +13233,7 @@
       </w:rPr>
     </w:lvl>
   </w:abstractNum>
-  <w:abstractNum w:abstractNumId="31" w15:restartNumberingAfterBreak="0">
+  <w:abstractNum w:abstractNumId="32" w15:restartNumberingAfterBreak="0">
     <w:nsid w:val="48066189"/>
     <w:multiLevelType w:val="multilevel"/>
     <w:tmpl w:val="2D5ECD5E"/>
@@ -12715,7 +13382,7 @@
       </w:rPr>
     </w:lvl>
   </w:abstractNum>
-  <w:abstractNum w:abstractNumId="32" w15:restartNumberingAfterBreak="0">
+  <w:abstractNum w:abstractNumId="33" w15:restartNumberingAfterBreak="0">
     <w:nsid w:val="49E642E0"/>
     <w:multiLevelType w:val="multilevel"/>
     <w:tmpl w:val="93BCFCA6"/>
@@ -12864,7 +13531,7 @@
       </w:rPr>
     </w:lvl>
   </w:abstractNum>
-  <w:abstractNum w:abstractNumId="33" w15:restartNumberingAfterBreak="0">
+  <w:abstractNum w:abstractNumId="34" w15:restartNumberingAfterBreak="0">
     <w:nsid w:val="4A6C512B"/>
     <w:multiLevelType w:val="multilevel"/>
     <w:tmpl w:val="37C4E4C0"/>
@@ -13013,7 +13680,7 @@
       </w:rPr>
     </w:lvl>
   </w:abstractNum>
-  <w:abstractNum w:abstractNumId="34" w15:restartNumberingAfterBreak="0">
+  <w:abstractNum w:abstractNumId="35" w15:restartNumberingAfterBreak="0">
     <w:nsid w:val="569971EF"/>
     <w:multiLevelType w:val="multilevel"/>
     <w:tmpl w:val="72EEB7C8"/>
@@ -13162,7 +13829,7 @@
       </w:rPr>
     </w:lvl>
   </w:abstractNum>
-  <w:abstractNum w:abstractNumId="35" w15:restartNumberingAfterBreak="0">
+  <w:abstractNum w:abstractNumId="36" w15:restartNumberingAfterBreak="0">
     <w:nsid w:val="5A41451D"/>
     <w:multiLevelType w:val="multilevel"/>
     <w:tmpl w:val="3D428610"/>
@@ -13311,7 +13978,7 @@
       </w:rPr>
     </w:lvl>
   </w:abstractNum>
-  <w:abstractNum w:abstractNumId="36" w15:restartNumberingAfterBreak="0">
+  <w:abstractNum w:abstractNumId="37" w15:restartNumberingAfterBreak="0">
     <w:nsid w:val="5ABB781A"/>
     <w:multiLevelType w:val="multilevel"/>
     <w:tmpl w:val="9A7E49B4"/>
@@ -13460,7 +14127,7 @@
       </w:rPr>
     </w:lvl>
   </w:abstractNum>
-  <w:abstractNum w:abstractNumId="37" w15:restartNumberingAfterBreak="0">
+  <w:abstractNum w:abstractNumId="38" w15:restartNumberingAfterBreak="0">
     <w:nsid w:val="5BF762E6"/>
     <w:multiLevelType w:val="multilevel"/>
     <w:tmpl w:val="CE4CBDEC"/>
@@ -13609,7 +14276,7 @@
       </w:rPr>
     </w:lvl>
   </w:abstractNum>
-  <w:abstractNum w:abstractNumId="38" w15:restartNumberingAfterBreak="0">
+  <w:abstractNum w:abstractNumId="39" w15:restartNumberingAfterBreak="0">
     <w:nsid w:val="5D6C4BCA"/>
     <w:multiLevelType w:val="multilevel"/>
     <w:tmpl w:val="893432CC"/>
@@ -13758,7 +14425,7 @@
       </w:rPr>
     </w:lvl>
   </w:abstractNum>
-  <w:abstractNum w:abstractNumId="39" w15:restartNumberingAfterBreak="0">
+  <w:abstractNum w:abstractNumId="40" w15:restartNumberingAfterBreak="0">
     <w:nsid w:val="5F4E70D3"/>
     <w:multiLevelType w:val="multilevel"/>
     <w:tmpl w:val="5B728E84"/>
@@ -13907,7 +14574,7 @@
       </w:rPr>
     </w:lvl>
   </w:abstractNum>
-  <w:abstractNum w:abstractNumId="40" w15:restartNumberingAfterBreak="0">
+  <w:abstractNum w:abstractNumId="41" w15:restartNumberingAfterBreak="0">
     <w:nsid w:val="61582D42"/>
     <w:multiLevelType w:val="multilevel"/>
     <w:tmpl w:val="ED4C181C"/>
@@ -14056,7 +14723,7 @@
       </w:rPr>
     </w:lvl>
   </w:abstractNum>
-  <w:abstractNum w:abstractNumId="41" w15:restartNumberingAfterBreak="0">
+  <w:abstractNum w:abstractNumId="42" w15:restartNumberingAfterBreak="0">
     <w:nsid w:val="64374F62"/>
     <w:multiLevelType w:val="multilevel"/>
     <w:tmpl w:val="405C71E4"/>
@@ -14205,7 +14872,7 @@
       </w:rPr>
     </w:lvl>
   </w:abstractNum>
-  <w:abstractNum w:abstractNumId="42" w15:restartNumberingAfterBreak="0">
+  <w:abstractNum w:abstractNumId="43" w15:restartNumberingAfterBreak="0">
     <w:nsid w:val="64FF5BCB"/>
     <w:multiLevelType w:val="multilevel"/>
     <w:tmpl w:val="89982AD0"/>
@@ -14354,7 +15021,7 @@
       </w:rPr>
     </w:lvl>
   </w:abstractNum>
-  <w:abstractNum w:abstractNumId="43" w15:restartNumberingAfterBreak="0">
+  <w:abstractNum w:abstractNumId="44" w15:restartNumberingAfterBreak="0">
     <w:nsid w:val="7162154B"/>
     <w:multiLevelType w:val="multilevel"/>
     <w:tmpl w:val="2108B1C6"/>
@@ -14503,7 +15170,7 @@
       </w:rPr>
     </w:lvl>
   </w:abstractNum>
-  <w:abstractNum w:abstractNumId="44" w15:restartNumberingAfterBreak="0">
+  <w:abstractNum w:abstractNumId="45" w15:restartNumberingAfterBreak="0">
     <w:nsid w:val="761978DA"/>
     <w:multiLevelType w:val="multilevel"/>
     <w:tmpl w:val="47A27D16"/>
@@ -14652,7 +15319,7 @@
       </w:rPr>
     </w:lvl>
   </w:abstractNum>
-  <w:abstractNum w:abstractNumId="45" w15:restartNumberingAfterBreak="0">
+  <w:abstractNum w:abstractNumId="46" w15:restartNumberingAfterBreak="0">
     <w:nsid w:val="76F32B78"/>
     <w:multiLevelType w:val="multilevel"/>
     <w:tmpl w:val="A7B41008"/>
@@ -14801,7 +15468,7 @@
       </w:rPr>
     </w:lvl>
   </w:abstractNum>
-  <w:abstractNum w:abstractNumId="46" w15:restartNumberingAfterBreak="0">
+  <w:abstractNum w:abstractNumId="47" w15:restartNumberingAfterBreak="0">
     <w:nsid w:val="7CA1008D"/>
     <w:multiLevelType w:val="multilevel"/>
     <w:tmpl w:val="8CA0800C"/>
@@ -14950,7 +15617,7 @@
       </w:rPr>
     </w:lvl>
   </w:abstractNum>
-  <w:abstractNum w:abstractNumId="47" w15:restartNumberingAfterBreak="0">
+  <w:abstractNum w:abstractNumId="48" w15:restartNumberingAfterBreak="0">
     <w:nsid w:val="7D9B770A"/>
     <w:multiLevelType w:val="multilevel"/>
     <w:tmpl w:val="06AA0D38"/>
@@ -15100,16 +15767,16 @@
     </w:lvl>
   </w:abstractNum>
   <w:num w:numId="1" w16cid:durableId="1706321385">
-    <w:abstractNumId w:val="24"/>
+    <w:abstractNumId w:val="25"/>
   </w:num>
   <w:num w:numId="2" w16cid:durableId="1998990886">
     <w:abstractNumId w:val="18"/>
   </w:num>
   <w:num w:numId="3" w16cid:durableId="1547444810">
-    <w:abstractNumId w:val="37"/>
+    <w:abstractNumId w:val="38"/>
   </w:num>
   <w:num w:numId="4" w16cid:durableId="132261882">
-    <w:abstractNumId w:val="21"/>
+    <w:abstractNumId w:val="22"/>
   </w:num>
   <w:num w:numId="5" w16cid:durableId="389311108">
     <w:abstractNumId w:val="8"/>
@@ -15118,28 +15785,28 @@
     <w:abstractNumId w:val="13"/>
   </w:num>
   <w:num w:numId="7" w16cid:durableId="1140610280">
-    <w:abstractNumId w:val="25"/>
+    <w:abstractNumId w:val="26"/>
   </w:num>
   <w:num w:numId="8" w16cid:durableId="1097408594">
-    <w:abstractNumId w:val="43"/>
+    <w:abstractNumId w:val="44"/>
   </w:num>
   <w:num w:numId="9" w16cid:durableId="752093048">
-    <w:abstractNumId w:val="44"/>
+    <w:abstractNumId w:val="45"/>
   </w:num>
   <w:num w:numId="10" w16cid:durableId="1423450230">
-    <w:abstractNumId w:val="23"/>
+    <w:abstractNumId w:val="24"/>
   </w:num>
   <w:num w:numId="11" w16cid:durableId="662701983">
-    <w:abstractNumId w:val="45"/>
+    <w:abstractNumId w:val="46"/>
   </w:num>
   <w:num w:numId="12" w16cid:durableId="805047612">
     <w:abstractNumId w:val="17"/>
   </w:num>
   <w:num w:numId="13" w16cid:durableId="1942910472">
-    <w:abstractNumId w:val="29"/>
+    <w:abstractNumId w:val="30"/>
   </w:num>
   <w:num w:numId="14" w16cid:durableId="2133009884">
-    <w:abstractNumId w:val="36"/>
+    <w:abstractNumId w:val="37"/>
   </w:num>
   <w:num w:numId="15" w16cid:durableId="1305429313">
     <w:abstractNumId w:val="15"/>
@@ -15154,31 +15821,31 @@
     <w:abstractNumId w:val="11"/>
   </w:num>
   <w:num w:numId="19" w16cid:durableId="96369467">
-    <w:abstractNumId w:val="27"/>
+    <w:abstractNumId w:val="28"/>
   </w:num>
   <w:num w:numId="20" w16cid:durableId="1764641433">
-    <w:abstractNumId w:val="39"/>
+    <w:abstractNumId w:val="40"/>
   </w:num>
   <w:num w:numId="21" w16cid:durableId="878131270">
     <w:abstractNumId w:val="2"/>
   </w:num>
   <w:num w:numId="22" w16cid:durableId="1276524916">
-    <w:abstractNumId w:val="35"/>
+    <w:abstractNumId w:val="36"/>
   </w:num>
   <w:num w:numId="23" w16cid:durableId="526792883">
-    <w:abstractNumId w:val="33"/>
+    <w:abstractNumId w:val="34"/>
   </w:num>
   <w:num w:numId="24" w16cid:durableId="1060440165">
     <w:abstractNumId w:val="10"/>
   </w:num>
   <w:num w:numId="25" w16cid:durableId="219052618">
-    <w:abstractNumId w:val="31"/>
+    <w:abstractNumId w:val="32"/>
   </w:num>
   <w:num w:numId="26" w16cid:durableId="2074959881">
     <w:abstractNumId w:val="14"/>
   </w:num>
   <w:num w:numId="27" w16cid:durableId="1911231352">
-    <w:abstractNumId w:val="42"/>
+    <w:abstractNumId w:val="43"/>
   </w:num>
   <w:num w:numId="28" w16cid:durableId="400447277">
     <w:abstractNumId w:val="0"/>
@@ -15187,7 +15854,7 @@
     <w:abstractNumId w:val="16"/>
   </w:num>
   <w:num w:numId="30" w16cid:durableId="263461747">
-    <w:abstractNumId w:val="32"/>
+    <w:abstractNumId w:val="33"/>
   </w:num>
   <w:num w:numId="31" w16cid:durableId="1739671730">
     <w:abstractNumId w:val="4"/>
@@ -15196,52 +15863,55 @@
     <w:abstractNumId w:val="12"/>
   </w:num>
   <w:num w:numId="33" w16cid:durableId="523062294">
-    <w:abstractNumId w:val="20"/>
+    <w:abstractNumId w:val="21"/>
   </w:num>
   <w:num w:numId="34" w16cid:durableId="1172649657">
     <w:abstractNumId w:val="9"/>
   </w:num>
   <w:num w:numId="35" w16cid:durableId="1586377328">
-    <w:abstractNumId w:val="41"/>
+    <w:abstractNumId w:val="42"/>
   </w:num>
   <w:num w:numId="36" w16cid:durableId="492335753">
-    <w:abstractNumId w:val="38"/>
+    <w:abstractNumId w:val="39"/>
   </w:num>
   <w:num w:numId="37" w16cid:durableId="1706053369">
-    <w:abstractNumId w:val="26"/>
+    <w:abstractNumId w:val="27"/>
   </w:num>
   <w:num w:numId="38" w16cid:durableId="903612188">
-    <w:abstractNumId w:val="47"/>
+    <w:abstractNumId w:val="48"/>
   </w:num>
   <w:num w:numId="39" w16cid:durableId="2012483911">
     <w:abstractNumId w:val="5"/>
   </w:num>
   <w:num w:numId="40" w16cid:durableId="128330091">
-    <w:abstractNumId w:val="34"/>
+    <w:abstractNumId w:val="35"/>
   </w:num>
   <w:num w:numId="41" w16cid:durableId="548492">
-    <w:abstractNumId w:val="30"/>
+    <w:abstractNumId w:val="31"/>
   </w:num>
   <w:num w:numId="42" w16cid:durableId="1705328654">
-    <w:abstractNumId w:val="46"/>
+    <w:abstractNumId w:val="47"/>
   </w:num>
   <w:num w:numId="43" w16cid:durableId="1468619378">
-    <w:abstractNumId w:val="22"/>
+    <w:abstractNumId w:val="23"/>
   </w:num>
   <w:num w:numId="44" w16cid:durableId="86076537">
     <w:abstractNumId w:val="19"/>
   </w:num>
   <w:num w:numId="45" w16cid:durableId="836730689">
-    <w:abstractNumId w:val="40"/>
+    <w:abstractNumId w:val="41"/>
   </w:num>
   <w:num w:numId="46" w16cid:durableId="1827356203">
     <w:abstractNumId w:val="3"/>
   </w:num>
   <w:num w:numId="47" w16cid:durableId="1704476891">
-    <w:abstractNumId w:val="28"/>
+    <w:abstractNumId w:val="29"/>
   </w:num>
   <w:num w:numId="48" w16cid:durableId="1637183156">
     <w:abstractNumId w:val="1"/>
+  </w:num>
+  <w:num w:numId="49" w16cid:durableId="1891837672">
+    <w:abstractNumId w:val="20"/>
   </w:num>
 </w:numbering>
 </file>

</xml_diff>

<commit_message>
Actualización memoria segunda entrega, y creación del archivo en pdf
</commit_message>
<xml_diff>
--- a/docs/memoria.docx
+++ b/docs/memoria.docx
@@ -371,19 +371,19 @@
           <w:bCs/>
           <w:sz w:val="28"/>
           <w:szCs w:val="24"/>
-          <w:lang w:val="en-US"/>
-        </w:rPr>
-      </w:pPr>
+        </w:rPr>
+      </w:pPr>
+      <w:proofErr w:type="spellStart"/>
       <w:r>
         <w:rPr>
           <w:b/>
           <w:bCs/>
           <w:sz w:val="28"/>
           <w:szCs w:val="24"/>
-          <w:lang w:val="en-US"/>
         </w:rPr>
         <w:t>Frontend</w:t>
       </w:r>
+      <w:proofErr w:type="spellEnd"/>
     </w:p>
     <w:p>
       <w:pPr>
@@ -888,7 +888,7 @@
                 <w:noProof/>
                 <w:webHidden/>
               </w:rPr>
-              <w:t>6</w:t>
+              <w:t>5</w:t>
             </w:r>
             <w:r>
               <w:rPr>
@@ -959,7 +959,7 @@
                 <w:noProof/>
                 <w:webHidden/>
               </w:rPr>
-              <w:t>7</w:t>
+              <w:t>6</w:t>
             </w:r>
             <w:r>
               <w:rPr>
@@ -1030,7 +1030,7 @@
                 <w:noProof/>
                 <w:webHidden/>
               </w:rPr>
-              <w:t>12</w:t>
+              <w:t>11</w:t>
             </w:r>
             <w:r>
               <w:rPr>
@@ -1101,7 +1101,7 @@
                 <w:noProof/>
                 <w:webHidden/>
               </w:rPr>
-              <w:t>12</w:t>
+              <w:t>11</w:t>
             </w:r>
             <w:r>
               <w:rPr>
@@ -1172,7 +1172,7 @@
                 <w:noProof/>
                 <w:webHidden/>
               </w:rPr>
-              <w:t>12</w:t>
+              <w:t>11</w:t>
             </w:r>
             <w:r>
               <w:rPr>
@@ -1243,7 +1243,7 @@
                 <w:noProof/>
                 <w:webHidden/>
               </w:rPr>
-              <w:t>14</w:t>
+              <w:t>13</w:t>
             </w:r>
             <w:r>
               <w:rPr>
@@ -1314,7 +1314,7 @@
                 <w:noProof/>
                 <w:webHidden/>
               </w:rPr>
-              <w:t>14</w:t>
+              <w:t>13</w:t>
             </w:r>
             <w:r>
               <w:rPr>
@@ -1385,7 +1385,7 @@
                 <w:noProof/>
                 <w:webHidden/>
               </w:rPr>
-              <w:t>25</w:t>
+              <w:t>24</w:t>
             </w:r>
             <w:r>
               <w:rPr>
@@ -1456,7 +1456,7 @@
                 <w:noProof/>
                 <w:webHidden/>
               </w:rPr>
-              <w:t>25</w:t>
+              <w:t>24</w:t>
             </w:r>
             <w:r>
               <w:rPr>
@@ -1527,7 +1527,7 @@
                 <w:noProof/>
                 <w:webHidden/>
               </w:rPr>
-              <w:t>25</w:t>
+              <w:t>24</w:t>
             </w:r>
             <w:r>
               <w:rPr>
@@ -3991,6 +3991,7 @@
       <w:r>
         <w:t>, pero cada pago está vinculado a un único tutor (</w:t>
       </w:r>
+      <w:proofErr w:type="gramStart"/>
       <w:r>
         <w:rPr>
           <w:i/>
@@ -3998,6 +3999,7 @@
         </w:rPr>
         <w:t>1:N</w:t>
       </w:r>
+      <w:proofErr w:type="gramEnd"/>
       <w:r>
         <w:t>).</w:t>
       </w:r>
@@ -4023,6 +4025,7 @@
       <w:r>
         <w:t>, aunque cada inscripción pertenece a un solo tutor (</w:t>
       </w:r>
+      <w:proofErr w:type="gramStart"/>
       <w:r>
         <w:rPr>
           <w:i/>
@@ -4030,6 +4033,7 @@
         </w:rPr>
         <w:t>1:N</w:t>
       </w:r>
+      <w:proofErr w:type="gramEnd"/>
       <w:r>
         <w:t>).</w:t>
       </w:r>
@@ -4055,6 +4059,7 @@
       <w:r>
         <w:t>, que serán gestionadas posteriormente por un administrador (</w:t>
       </w:r>
+      <w:proofErr w:type="gramStart"/>
       <w:r>
         <w:rPr>
           <w:i/>
@@ -4062,6 +4067,7 @@
         </w:rPr>
         <w:t>1:N</w:t>
       </w:r>
+      <w:proofErr w:type="gramEnd"/>
       <w:r>
         <w:t>).</w:t>
       </w:r>
@@ -4263,6 +4269,7 @@
       <w:r>
         <w:t>(</w:t>
       </w:r>
+      <w:proofErr w:type="gramStart"/>
       <w:r>
         <w:rPr>
           <w:i/>
@@ -4270,6 +4277,7 @@
         </w:rPr>
         <w:t>1:N</w:t>
       </w:r>
+      <w:proofErr w:type="gramEnd"/>
       <w:r>
         <w:t>).</w:t>
       </w:r>
@@ -4364,6 +4372,7 @@
       <w:r>
         <w:t>, pero cada pago solo tiene una tarifa (</w:t>
       </w:r>
+      <w:proofErr w:type="gramStart"/>
       <w:r>
         <w:rPr>
           <w:i/>
@@ -4371,6 +4380,7 @@
         </w:rPr>
         <w:t>1:N</w:t>
       </w:r>
+      <w:proofErr w:type="gramEnd"/>
       <w:r>
         <w:t>).</w:t>
       </w:r>
@@ -4744,6 +4754,7 @@
       <w:r>
         <w:t>(</w:t>
       </w:r>
+      <w:proofErr w:type="gramStart"/>
       <w:r>
         <w:rPr>
           <w:i/>
@@ -4751,6 +4762,7 @@
         </w:rPr>
         <w:t>1:N</w:t>
       </w:r>
+      <w:proofErr w:type="gramEnd"/>
       <w:r>
         <w:t>).</w:t>
       </w:r>
@@ -5021,6 +5033,7 @@
       <w:r>
         <w:t>(</w:t>
       </w:r>
+      <w:proofErr w:type="gramStart"/>
       <w:r>
         <w:rPr>
           <w:i/>
@@ -5028,6 +5041,7 @@
         </w:rPr>
         <w:t>1:N</w:t>
       </w:r>
+      <w:proofErr w:type="gramEnd"/>
       <w:r>
         <w:t>).</w:t>
       </w:r>
@@ -5194,6 +5208,7 @@
       <w:r>
         <w:t>(</w:t>
       </w:r>
+      <w:proofErr w:type="gramStart"/>
       <w:r>
         <w:rPr>
           <w:i/>
@@ -5201,6 +5216,7 @@
         </w:rPr>
         <w:t>1:N</w:t>
       </w:r>
+      <w:proofErr w:type="gramEnd"/>
       <w:r>
         <w:t>).</w:t>
       </w:r>
@@ -5240,6 +5256,7 @@
       <w:r>
         <w:t>(</w:t>
       </w:r>
+      <w:proofErr w:type="gramStart"/>
       <w:r>
         <w:rPr>
           <w:i/>
@@ -5247,6 +5264,7 @@
         </w:rPr>
         <w:t>1:N</w:t>
       </w:r>
+      <w:proofErr w:type="gramEnd"/>
       <w:r>
         <w:t>).</w:t>
       </w:r>
@@ -5358,6 +5376,7 @@
       <w:r>
         <w:t>(</w:t>
       </w:r>
+      <w:proofErr w:type="gramStart"/>
       <w:r>
         <w:rPr>
           <w:i/>
@@ -5365,6 +5384,7 @@
         </w:rPr>
         <w:t>1:N</w:t>
       </w:r>
+      <w:proofErr w:type="gramEnd"/>
       <w:r>
         <w:t>).</w:t>
       </w:r>
@@ -5390,6 +5410,7 @@
       <w:r>
         <w:t>grupos dentro del sistema (</w:t>
       </w:r>
+      <w:proofErr w:type="gramStart"/>
       <w:r>
         <w:rPr>
           <w:i/>
@@ -5397,6 +5418,7 @@
         </w:rPr>
         <w:t>1:N</w:t>
       </w:r>
+      <w:proofErr w:type="gramEnd"/>
       <w:r>
         <w:t>).</w:t>
       </w:r>
@@ -5436,6 +5458,7 @@
       <w:r>
         <w:t>(</w:t>
       </w:r>
+      <w:proofErr w:type="gramStart"/>
       <w:r>
         <w:rPr>
           <w:i/>
@@ -5443,6 +5466,7 @@
         </w:rPr>
         <w:t>1:N</w:t>
       </w:r>
+      <w:proofErr w:type="gramEnd"/>
       <w:r>
         <w:t>).</w:t>
       </w:r>
@@ -5576,6 +5600,7 @@
       <w:r>
         <w:t>(</w:t>
       </w:r>
+      <w:proofErr w:type="gramStart"/>
       <w:r>
         <w:rPr>
           <w:i/>
@@ -5583,6 +5608,7 @@
         </w:rPr>
         <w:t>1:N</w:t>
       </w:r>
+      <w:proofErr w:type="gramEnd"/>
       <w:r>
         <w:t>).</w:t>
       </w:r>
@@ -7754,13 +7780,7 @@
     <w:p/>
     <w:p>
       <w:r>
-        <w:t xml:space="preserve">La estructura de la web está dividida en tres partes. La primera sería la vista que puede tener cualquier usuario (especialmente orientada a tutores de los niños), que consta </w:t>
-      </w:r>
-      <w:r>
-        <w:t>del home</w:t>
-      </w:r>
-      <w:r>
-        <w:t>, el apartado de la inscripción del niño, la programación, donde se muestran algunas de las actividades que pueden realizar los niños en el campamento mediante un carrusel de imágenes, y el horario, con algunas de las actividades que se hacen a la semana.</w:t>
+        <w:t>La estructura de la web está dividida en tres partes. La primera sería la vista que puede tener cualquier usuario (especialmente orientada a tutores de los niños), que consta del home, el apartado de la inscripción del niño, la programación, donde se muestran algunas de las actividades que pueden realizar los niños en el campamento mediante un carrusel de imágenes, y el horario, con algunas de las actividades que se hacen a la semana.</w:t>
       </w:r>
     </w:p>
     <w:p/>
@@ -8370,6 +8390,9 @@
         <w:jc w:val="center"/>
       </w:pPr>
       <w:r>
+        <w:rPr>
+          <w:noProof/>
+        </w:rPr>
         <w:drawing>
           <wp:inline distT="0" distB="0" distL="0" distR="0" wp14:anchorId="65B3FE1B" wp14:editId="2958558B">
             <wp:extent cx="5400040" cy="5843270"/>
@@ -16523,6 +16546,7 @@
   <w:style w:type="character" w:default="1" w:styleId="Fuentedeprrafopredeter">
     <w:name w:val="Default Paragraph Font"/>
     <w:uiPriority w:val="1"/>
+    <w:semiHidden/>
     <w:unhideWhenUsed/>
   </w:style>
   <w:style w:type="table" w:default="1" w:styleId="Tablanormal">

</xml_diff>

<commit_message>
Comienzo análisis de la aplicación
</commit_message>
<xml_diff>
--- a/docs/memoria.docx
+++ b/docs/memoria.docx
@@ -3,6 +3,10 @@
 <w:document xmlns:wpc="http://schemas.microsoft.com/office/word/2010/wordprocessingCanvas" xmlns:cx="http://schemas.microsoft.com/office/drawing/2014/chartex" xmlns:cx1="http://schemas.microsoft.com/office/drawing/2015/9/8/chartex" xmlns:cx2="http://schemas.microsoft.com/office/drawing/2015/10/21/chartex" xmlns:cx3="http://schemas.microsoft.com/office/drawing/2016/5/9/chartex" xmlns:cx4="http://schemas.microsoft.com/office/drawing/2016/5/10/chartex" xmlns:cx5="http://schemas.microsoft.com/office/drawing/2016/5/11/chartex" xmlns:cx6="http://schemas.microsoft.com/office/drawing/2016/5/12/chartex" xmlns:cx7="http://schemas.microsoft.com/office/drawing/2016/5/13/chartex" xmlns:cx8="http://schemas.microsoft.com/office/drawing/2016/5/14/chartex" xmlns:mc="http://schemas.openxmlformats.org/markup-compatibility/2006" xmlns:aink="http://schemas.microsoft.com/office/drawing/2016/ink" xmlns:am3d="http://schemas.microsoft.com/office/drawing/2017/model3d" xmlns:o="urn:schemas-microsoft-com:office:office" xmlns:oel="http://schemas.microsoft.com/office/2019/extlst" xmlns:r="http://schemas.openxmlformats.org/officeDocument/2006/relationships" xmlns:m="http://schemas.openxmlformats.org/officeDocument/2006/math" xmlns:v="urn:schemas-microsoft-com:vml" xmlns:wp14="http://schemas.microsoft.com/office/word/2010/wordprocessingDrawing" xmlns:wp="http://schemas.openxmlformats.org/drawingml/2006/wordprocessingDrawing" xmlns:w10="urn:schemas-microsoft-com:office:word" xmlns:w="http://schemas.openxmlformats.org/wordprocessingml/2006/main" xmlns:w14="http://schemas.microsoft.com/office/word/2010/wordml" xmlns:w15="http://schemas.microsoft.com/office/word/2012/wordml" xmlns:w16cex="http://schemas.microsoft.com/office/word/2018/wordml/cex" xmlns:w16cid="http://schemas.microsoft.com/office/word/2016/wordml/cid" xmlns:w16="http://schemas.microsoft.com/office/word/2018/wordml" xmlns:w16du="http://schemas.microsoft.com/office/word/2023/wordml/word16du" xmlns:w16sdtdh="http://schemas.microsoft.com/office/word/2020/wordml/sdtdatahash" xmlns:w16sdtfl="http://schemas.microsoft.com/office/word/2024/wordml/sdtformatlock" xmlns:w16se="http://schemas.microsoft.com/office/word/2015/wordml/symex" xmlns:wpg="http://schemas.microsoft.com/office/word/2010/wordprocessingGroup" xmlns:wpi="http://schemas.microsoft.com/office/word/2010/wordprocessingInk" xmlns:wne="http://schemas.microsoft.com/office/word/2006/wordml" xmlns:wps="http://schemas.microsoft.com/office/word/2010/wordprocessingShape" mc:Ignorable="w14 w15 w16se w16cid w16 w16cex w16sdtdh w16sdtfl w16du wp14">
   <w:body>
     <w:p>
+      <w:pPr>
+        <w:spacing w:line="360" w:lineRule="auto"/>
+        <w:jc w:val="both"/>
+      </w:pPr>
       <w:r>
         <w:rPr>
           <w:noProof/>
@@ -71,38 +75,184 @@
         </w:drawing>
       </w:r>
     </w:p>
-    <w:p/>
-    <w:p/>
-    <w:p/>
-    <w:p/>
-    <w:p/>
-    <w:p/>
-    <w:p/>
-    <w:p/>
-    <w:p/>
-    <w:p/>
-    <w:p/>
-    <w:p/>
-    <w:p/>
-    <w:p/>
-    <w:p/>
-    <w:p/>
-    <w:p/>
-    <w:p/>
-    <w:p/>
-    <w:p/>
-    <w:p/>
-    <w:p/>
-    <w:p/>
-    <w:p/>
-    <w:p/>
-    <w:p/>
-    <w:p/>
-    <w:p/>
-    <w:p/>
-    <w:p>
-      <w:pPr>
-        <w:jc w:val="center"/>
+    <w:p>
+      <w:pPr>
+        <w:spacing w:line="360" w:lineRule="auto"/>
+        <w:jc w:val="both"/>
+      </w:pPr>
+    </w:p>
+    <w:p>
+      <w:pPr>
+        <w:spacing w:line="360" w:lineRule="auto"/>
+        <w:jc w:val="both"/>
+      </w:pPr>
+    </w:p>
+    <w:p>
+      <w:pPr>
+        <w:spacing w:line="360" w:lineRule="auto"/>
+        <w:jc w:val="both"/>
+      </w:pPr>
+    </w:p>
+    <w:p>
+      <w:pPr>
+        <w:spacing w:line="360" w:lineRule="auto"/>
+        <w:jc w:val="both"/>
+      </w:pPr>
+    </w:p>
+    <w:p>
+      <w:pPr>
+        <w:spacing w:line="360" w:lineRule="auto"/>
+        <w:jc w:val="both"/>
+      </w:pPr>
+    </w:p>
+    <w:p>
+      <w:pPr>
+        <w:spacing w:line="360" w:lineRule="auto"/>
+        <w:jc w:val="both"/>
+      </w:pPr>
+    </w:p>
+    <w:p>
+      <w:pPr>
+        <w:spacing w:line="360" w:lineRule="auto"/>
+        <w:jc w:val="both"/>
+      </w:pPr>
+    </w:p>
+    <w:p>
+      <w:pPr>
+        <w:spacing w:line="360" w:lineRule="auto"/>
+        <w:jc w:val="both"/>
+      </w:pPr>
+    </w:p>
+    <w:p>
+      <w:pPr>
+        <w:spacing w:line="360" w:lineRule="auto"/>
+        <w:jc w:val="both"/>
+      </w:pPr>
+    </w:p>
+    <w:p>
+      <w:pPr>
+        <w:spacing w:line="360" w:lineRule="auto"/>
+        <w:jc w:val="both"/>
+      </w:pPr>
+    </w:p>
+    <w:p>
+      <w:pPr>
+        <w:spacing w:line="360" w:lineRule="auto"/>
+        <w:jc w:val="both"/>
+      </w:pPr>
+    </w:p>
+    <w:p>
+      <w:pPr>
+        <w:spacing w:line="360" w:lineRule="auto"/>
+        <w:jc w:val="both"/>
+      </w:pPr>
+    </w:p>
+    <w:p>
+      <w:pPr>
+        <w:spacing w:line="360" w:lineRule="auto"/>
+        <w:jc w:val="both"/>
+      </w:pPr>
+    </w:p>
+    <w:p>
+      <w:pPr>
+        <w:spacing w:line="360" w:lineRule="auto"/>
+        <w:jc w:val="both"/>
+      </w:pPr>
+    </w:p>
+    <w:p>
+      <w:pPr>
+        <w:spacing w:line="360" w:lineRule="auto"/>
+        <w:jc w:val="both"/>
+      </w:pPr>
+    </w:p>
+    <w:p>
+      <w:pPr>
+        <w:spacing w:line="360" w:lineRule="auto"/>
+        <w:jc w:val="both"/>
+      </w:pPr>
+    </w:p>
+    <w:p>
+      <w:pPr>
+        <w:spacing w:line="360" w:lineRule="auto"/>
+        <w:jc w:val="both"/>
+      </w:pPr>
+    </w:p>
+    <w:p>
+      <w:pPr>
+        <w:spacing w:line="360" w:lineRule="auto"/>
+        <w:jc w:val="both"/>
+      </w:pPr>
+    </w:p>
+    <w:p>
+      <w:pPr>
+        <w:spacing w:line="360" w:lineRule="auto"/>
+        <w:jc w:val="both"/>
+      </w:pPr>
+    </w:p>
+    <w:p>
+      <w:pPr>
+        <w:spacing w:line="360" w:lineRule="auto"/>
+        <w:jc w:val="both"/>
+      </w:pPr>
+    </w:p>
+    <w:p>
+      <w:pPr>
+        <w:spacing w:line="360" w:lineRule="auto"/>
+        <w:jc w:val="both"/>
+      </w:pPr>
+    </w:p>
+    <w:p>
+      <w:pPr>
+        <w:spacing w:line="360" w:lineRule="auto"/>
+        <w:jc w:val="both"/>
+      </w:pPr>
+    </w:p>
+    <w:p>
+      <w:pPr>
+        <w:spacing w:line="360" w:lineRule="auto"/>
+        <w:jc w:val="both"/>
+      </w:pPr>
+    </w:p>
+    <w:p>
+      <w:pPr>
+        <w:spacing w:line="360" w:lineRule="auto"/>
+        <w:jc w:val="both"/>
+      </w:pPr>
+    </w:p>
+    <w:p>
+      <w:pPr>
+        <w:spacing w:line="360" w:lineRule="auto"/>
+        <w:jc w:val="both"/>
+      </w:pPr>
+    </w:p>
+    <w:p>
+      <w:pPr>
+        <w:spacing w:line="360" w:lineRule="auto"/>
+        <w:jc w:val="both"/>
+      </w:pPr>
+    </w:p>
+    <w:p>
+      <w:pPr>
+        <w:spacing w:line="360" w:lineRule="auto"/>
+        <w:jc w:val="both"/>
+      </w:pPr>
+    </w:p>
+    <w:p>
+      <w:pPr>
+        <w:spacing w:line="360" w:lineRule="auto"/>
+        <w:jc w:val="both"/>
+      </w:pPr>
+    </w:p>
+    <w:p>
+      <w:pPr>
+        <w:spacing w:line="360" w:lineRule="auto"/>
+        <w:jc w:val="both"/>
+      </w:pPr>
+    </w:p>
+    <w:p>
+      <w:pPr>
+        <w:spacing w:line="360" w:lineRule="auto"/>
+        <w:jc w:val="both"/>
         <w:rPr>
           <w:sz w:val="28"/>
           <w:szCs w:val="24"/>
@@ -113,13 +263,13 @@
           <w:sz w:val="28"/>
           <w:szCs w:val="24"/>
         </w:rPr>
-        <w:lastRenderedPageBreak/>
         <w:t>INTRODUCCIÓN</w:t>
       </w:r>
     </w:p>
     <w:p>
       <w:pPr>
-        <w:jc w:val="center"/>
+        <w:spacing w:line="360" w:lineRule="auto"/>
+        <w:jc w:val="both"/>
         <w:rPr>
           <w:sz w:val="28"/>
           <w:szCs w:val="24"/>
@@ -267,7 +417,7 @@
     <w:p>
       <w:pPr>
         <w:spacing w:line="360" w:lineRule="auto"/>
-        <w:jc w:val="center"/>
+        <w:jc w:val="both"/>
         <w:rPr>
           <w:sz w:val="28"/>
           <w:szCs w:val="24"/>
@@ -278,7 +428,6 @@
           <w:sz w:val="28"/>
           <w:szCs w:val="24"/>
         </w:rPr>
-        <w:lastRenderedPageBreak/>
         <w:t>PALABRAS CLAVE</w:t>
       </w:r>
     </w:p>
@@ -798,6 +947,8 @@
         <w:p>
           <w:pPr>
             <w:pStyle w:val="TtuloTDC"/>
+            <w:spacing w:line="360" w:lineRule="auto"/>
+            <w:jc w:val="both"/>
             <w:rPr>
               <w:rFonts w:ascii="Times New Roman" w:hAnsi="Times New Roman" w:cs="Times New Roman"/>
               <w:b/>
@@ -825,6 +976,8 @@
             <w:tabs>
               <w:tab w:val="right" w:leader="dot" w:pos="8494"/>
             </w:tabs>
+            <w:spacing w:line="360" w:lineRule="auto"/>
+            <w:jc w:val="both"/>
             <w:rPr>
               <w:rFonts w:asciiTheme="minorHAnsi" w:eastAsiaTheme="minorEastAsia" w:hAnsiTheme="minorHAnsi"/>
               <w:noProof/>
@@ -905,6 +1058,8 @@
             <w:tabs>
               <w:tab w:val="right" w:leader="dot" w:pos="8494"/>
             </w:tabs>
+            <w:spacing w:line="360" w:lineRule="auto"/>
+            <w:jc w:val="both"/>
             <w:rPr>
               <w:rFonts w:asciiTheme="minorHAnsi" w:eastAsiaTheme="minorEastAsia" w:hAnsiTheme="minorHAnsi"/>
               <w:noProof/>
@@ -976,6 +1131,8 @@
             <w:tabs>
               <w:tab w:val="right" w:leader="dot" w:pos="8494"/>
             </w:tabs>
+            <w:spacing w:line="360" w:lineRule="auto"/>
+            <w:jc w:val="both"/>
             <w:rPr>
               <w:rFonts w:asciiTheme="minorHAnsi" w:eastAsiaTheme="minorEastAsia" w:hAnsiTheme="minorHAnsi"/>
               <w:noProof/>
@@ -1047,6 +1204,8 @@
             <w:tabs>
               <w:tab w:val="right" w:leader="dot" w:pos="8494"/>
             </w:tabs>
+            <w:spacing w:line="360" w:lineRule="auto"/>
+            <w:jc w:val="both"/>
             <w:rPr>
               <w:rFonts w:asciiTheme="minorHAnsi" w:eastAsiaTheme="minorEastAsia" w:hAnsiTheme="minorHAnsi"/>
               <w:noProof/>
@@ -1118,6 +1277,8 @@
             <w:tabs>
               <w:tab w:val="right" w:leader="dot" w:pos="8494"/>
             </w:tabs>
+            <w:spacing w:line="360" w:lineRule="auto"/>
+            <w:jc w:val="both"/>
             <w:rPr>
               <w:rFonts w:asciiTheme="minorHAnsi" w:eastAsiaTheme="minorEastAsia" w:hAnsiTheme="minorHAnsi"/>
               <w:noProof/>
@@ -1189,6 +1350,8 @@
             <w:tabs>
               <w:tab w:val="right" w:leader="dot" w:pos="8494"/>
             </w:tabs>
+            <w:spacing w:line="360" w:lineRule="auto"/>
+            <w:jc w:val="both"/>
             <w:rPr>
               <w:rFonts w:asciiTheme="minorHAnsi" w:eastAsiaTheme="minorEastAsia" w:hAnsiTheme="minorHAnsi"/>
               <w:noProof/>
@@ -1260,6 +1423,8 @@
             <w:tabs>
               <w:tab w:val="right" w:leader="dot" w:pos="8494"/>
             </w:tabs>
+            <w:spacing w:line="360" w:lineRule="auto"/>
+            <w:jc w:val="both"/>
             <w:rPr>
               <w:rFonts w:asciiTheme="minorHAnsi" w:eastAsiaTheme="minorEastAsia" w:hAnsiTheme="minorHAnsi"/>
               <w:noProof/>
@@ -1331,6 +1496,8 @@
             <w:tabs>
               <w:tab w:val="right" w:leader="dot" w:pos="8494"/>
             </w:tabs>
+            <w:spacing w:line="360" w:lineRule="auto"/>
+            <w:jc w:val="both"/>
             <w:rPr>
               <w:rFonts w:asciiTheme="minorHAnsi" w:eastAsiaTheme="minorEastAsia" w:hAnsiTheme="minorHAnsi"/>
               <w:noProof/>
@@ -1402,6 +1569,8 @@
             <w:tabs>
               <w:tab w:val="right" w:leader="dot" w:pos="8494"/>
             </w:tabs>
+            <w:spacing w:line="360" w:lineRule="auto"/>
+            <w:jc w:val="both"/>
             <w:rPr>
               <w:rFonts w:asciiTheme="minorHAnsi" w:eastAsiaTheme="minorEastAsia" w:hAnsiTheme="minorHAnsi"/>
               <w:noProof/>
@@ -1473,6 +1642,8 @@
             <w:tabs>
               <w:tab w:val="right" w:leader="dot" w:pos="8494"/>
             </w:tabs>
+            <w:spacing w:line="360" w:lineRule="auto"/>
+            <w:jc w:val="both"/>
             <w:rPr>
               <w:rFonts w:asciiTheme="minorHAnsi" w:eastAsiaTheme="minorEastAsia" w:hAnsiTheme="minorHAnsi"/>
               <w:noProof/>
@@ -1539,6 +1710,10 @@
           </w:hyperlink>
         </w:p>
         <w:p>
+          <w:pPr>
+            <w:spacing w:line="360" w:lineRule="auto"/>
+            <w:jc w:val="both"/>
+          </w:pPr>
           <w:r>
             <w:rPr>
               <w:b/>
@@ -1635,6 +1810,8 @@
     </w:p>
     <w:p>
       <w:pPr>
+        <w:spacing w:line="360" w:lineRule="auto"/>
+        <w:jc w:val="both"/>
         <w:rPr>
           <w:rFonts w:asciiTheme="majorHAnsi" w:eastAsiaTheme="majorEastAsia" w:hAnsiTheme="majorHAnsi" w:cstheme="majorBidi"/>
           <w:color w:val="2F5496" w:themeColor="accent1" w:themeShade="BF"/>
@@ -1646,6 +1823,8 @@
     <w:p>
       <w:pPr>
         <w:pStyle w:val="Ttulo1"/>
+        <w:spacing w:line="360" w:lineRule="auto"/>
+        <w:jc w:val="both"/>
         <w:rPr>
           <w:rFonts w:ascii="Times New Roman" w:hAnsi="Times New Roman" w:cs="Times New Roman"/>
           <w:b/>
@@ -1665,7 +1844,6 @@
           <w:sz w:val="28"/>
           <w:szCs w:val="24"/>
         </w:rPr>
-        <w:lastRenderedPageBreak/>
         <w:t>MÓDULOS FORMATIVOS APLICADOS EN EL TRABAJO</w:t>
       </w:r>
       <w:bookmarkEnd w:id="0"/>
@@ -1872,6 +2050,7 @@
           <w:b/>
           <w:bCs/>
         </w:rPr>
+        <w:lastRenderedPageBreak/>
         <w:t>Despliegue de aplicaciones web</w:t>
       </w:r>
       <w:r>
@@ -1880,6 +2059,7 @@
     </w:p>
     <w:p>
       <w:pPr>
+        <w:spacing w:line="360" w:lineRule="auto"/>
         <w:jc w:val="both"/>
         <w:rPr>
           <w:sz w:val="28"/>
@@ -1889,7 +2069,8 @@
     </w:p>
     <w:p>
       <w:pPr>
-        <w:jc w:val="center"/>
+        <w:spacing w:line="360" w:lineRule="auto"/>
+        <w:jc w:val="both"/>
         <w:rPr>
           <w:sz w:val="28"/>
           <w:szCs w:val="24"/>
@@ -1898,7 +2079,8 @@
     </w:p>
     <w:p>
       <w:pPr>
-        <w:jc w:val="center"/>
+        <w:spacing w:line="360" w:lineRule="auto"/>
+        <w:jc w:val="both"/>
         <w:rPr>
           <w:sz w:val="28"/>
           <w:szCs w:val="24"/>
@@ -1907,6 +2089,8 @@
     </w:p>
     <w:p>
       <w:pPr>
+        <w:spacing w:line="360" w:lineRule="auto"/>
+        <w:jc w:val="both"/>
         <w:rPr>
           <w:sz w:val="28"/>
           <w:szCs w:val="24"/>
@@ -1915,6 +2099,8 @@
     </w:p>
     <w:p>
       <w:pPr>
+        <w:spacing w:line="360" w:lineRule="auto"/>
+        <w:jc w:val="both"/>
         <w:rPr>
           <w:sz w:val="28"/>
           <w:szCs w:val="24"/>
@@ -1923,6 +2109,8 @@
     </w:p>
     <w:p>
       <w:pPr>
+        <w:spacing w:line="360" w:lineRule="auto"/>
+        <w:jc w:val="both"/>
         <w:rPr>
           <w:sz w:val="28"/>
           <w:szCs w:val="24"/>
@@ -1933,7 +2121,7 @@
       <w:pPr>
         <w:pStyle w:val="Ttulo1"/>
         <w:spacing w:line="360" w:lineRule="auto"/>
-        <w:jc w:val="center"/>
+        <w:jc w:val="both"/>
         <w:rPr>
           <w:rFonts w:ascii="Times New Roman" w:hAnsi="Times New Roman" w:cs="Times New Roman"/>
           <w:b/>
@@ -1953,7 +2141,6 @@
           <w:sz w:val="28"/>
           <w:szCs w:val="24"/>
         </w:rPr>
-        <w:lastRenderedPageBreak/>
         <w:t>HERRAMIENTAS Y LENGUAJES</w:t>
       </w:r>
       <w:bookmarkEnd w:id="1"/>
@@ -1961,6 +2148,7 @@
     <w:p>
       <w:pPr>
         <w:spacing w:line="360" w:lineRule="auto"/>
+        <w:jc w:val="both"/>
         <w:rPr>
           <w:b/>
           <w:bCs/>
@@ -1996,6 +2184,7 @@
     <w:p>
       <w:pPr>
         <w:spacing w:before="100" w:beforeAutospacing="1" w:after="100" w:afterAutospacing="1" w:line="360" w:lineRule="auto"/>
+        <w:jc w:val="both"/>
         <w:rPr>
           <w:rFonts w:eastAsia="Times New Roman" w:cs="Times New Roman"/>
           <w:kern w:val="0"/>
@@ -2058,6 +2247,7 @@
           <w:numId w:val="8"/>
         </w:numPr>
         <w:spacing w:before="100" w:beforeAutospacing="1" w:after="100" w:afterAutospacing="1" w:line="360" w:lineRule="auto"/>
+        <w:jc w:val="both"/>
         <w:rPr>
           <w:rFonts w:eastAsia="Times New Roman" w:cs="Times New Roman"/>
           <w:kern w:val="0"/>
@@ -2096,6 +2286,7 @@
           <w:numId w:val="8"/>
         </w:numPr>
         <w:spacing w:before="100" w:beforeAutospacing="1" w:after="100" w:afterAutospacing="1" w:line="360" w:lineRule="auto"/>
+        <w:jc w:val="both"/>
         <w:rPr>
           <w:rFonts w:eastAsia="Times New Roman" w:cs="Times New Roman"/>
           <w:kern w:val="0"/>
@@ -2134,6 +2325,7 @@
           <w:numId w:val="8"/>
         </w:numPr>
         <w:spacing w:before="100" w:beforeAutospacing="1" w:after="100" w:afterAutospacing="1" w:line="360" w:lineRule="auto"/>
+        <w:jc w:val="both"/>
         <w:rPr>
           <w:rFonts w:eastAsia="Times New Roman" w:cs="Times New Roman"/>
           <w:kern w:val="0"/>
@@ -2226,6 +2418,7 @@
           <w:numId w:val="8"/>
         </w:numPr>
         <w:spacing w:before="100" w:beforeAutospacing="1" w:after="100" w:afterAutospacing="1" w:line="360" w:lineRule="auto"/>
+        <w:jc w:val="both"/>
         <w:rPr>
           <w:rFonts w:eastAsia="Times New Roman" w:cs="Times New Roman"/>
           <w:kern w:val="0"/>
@@ -2290,7 +2483,11 @@
         <w:t xml:space="preserve">: </w:t>
       </w:r>
       <w:r>
-        <w:t xml:space="preserve">Utilizamos esta herramienta para dar color y estilo a los diseños y dibujos de la página web, asegurando una estética atractiva y personalizada que refuerza la temática pirata del campamento. </w:t>
+        <w:t xml:space="preserve">Utilizamos esta herramienta para dar color y estilo a los diseños y dibujos de la página web, asegurando una estética atractiva y personalizada que refuerza </w:t>
+      </w:r>
+      <w:r>
+        <w:lastRenderedPageBreak/>
+        <w:t xml:space="preserve">la temática pirata del campamento. </w:t>
       </w:r>
       <w:proofErr w:type="spellStart"/>
       <w:r>
@@ -2364,7 +2561,6 @@
       </w:r>
       <w:proofErr w:type="spellStart"/>
       <w:r>
-        <w:lastRenderedPageBreak/>
         <w:t>frontend</w:t>
       </w:r>
       <w:proofErr w:type="spellEnd"/>
@@ -2506,6 +2702,7 @@
           <w:b/>
           <w:bCs/>
         </w:rPr>
+        <w:lastRenderedPageBreak/>
         <w:t>Configurar entornos de desarrollo</w:t>
       </w:r>
       <w:r>
@@ -2575,7 +2772,6 @@
         <w:jc w:val="both"/>
       </w:pPr>
       <w:r>
-        <w:lastRenderedPageBreak/>
         <w:t>En este proyecto, hemos aplicado Draw.io para:</w:t>
       </w:r>
     </w:p>
@@ -2688,7 +2884,11 @@
         <w:t xml:space="preserve">Registro de actividades: </w:t>
       </w:r>
       <w:r>
-        <w:t>Mantener un sistema ordenado de actividades del campamento con datos como horarios, monitores asignados y descripciones, asegurando relaciones bien definidas entre las tablas.</w:t>
+        <w:t xml:space="preserve">Mantener un sistema ordenado de actividades del campamento con datos como horarios, monitores asignados y descripciones, </w:t>
+      </w:r>
+      <w:r>
+        <w:lastRenderedPageBreak/>
+        <w:t>asegurando relaciones bien definidas entre las tablas.</w:t>
       </w:r>
       <w:r>
         <w:br/>
@@ -2738,11 +2938,7 @@
         <w:t>MongoDB</w:t>
       </w:r>
       <w:r>
-        <w:t xml:space="preserve">: Es una base de datos no relacional (NoSQL) que hemos elegido para gestionar la información del proyecto debido a su flexibilidad, escalabilidad y facilidad de uso. MongoDB almacena los datos en formato de documentos JSON, lo que permite </w:t>
-      </w:r>
-      <w:r>
-        <w:lastRenderedPageBreak/>
-        <w:t>manejar estructuras complejas de manera más natural y eficiente en comparación con bases de datos relacionales.</w:t>
+        <w:t>: Es una base de datos no relacional (NoSQL) que hemos elegido para gestionar la información del proyecto debido a su flexibilidad, escalabilidad y facilidad de uso. MongoDB almacena los datos en formato de documentos JSON, lo que permite manejar estructuras complejas de manera más natural y eficiente en comparación con bases de datos relacionales.</w:t>
       </w:r>
     </w:p>
     <w:p>
@@ -2899,12 +3095,17 @@
       </w:r>
       <w:proofErr w:type="spellEnd"/>
       <w:r>
-        <w:t xml:space="preserve"> del proyecto. Su integración sencilla con bases de datos y su capacidad para generar contenido dinámico lo hacen ideal para desarrollar aplicaciones web como la nuestra.</w:t>
+        <w:t xml:space="preserve"> del proyecto. Su integración sencilla con bases de datos y </w:t>
+      </w:r>
+      <w:r>
+        <w:lastRenderedPageBreak/>
+        <w:t>su capacidad para generar contenido dinámico lo hacen ideal para desarrollar aplicaciones web como la nuestra.</w:t>
       </w:r>
     </w:p>
     <w:p>
       <w:pPr>
         <w:spacing w:before="100" w:beforeAutospacing="1" w:after="100" w:afterAutospacing="1" w:line="360" w:lineRule="auto"/>
+        <w:jc w:val="both"/>
         <w:rPr>
           <w:rFonts w:eastAsia="Times New Roman" w:cs="Times New Roman"/>
           <w:kern w:val="0"/>
@@ -2931,6 +3132,7 @@
           <w:numId w:val="8"/>
         </w:numPr>
         <w:spacing w:before="100" w:beforeAutospacing="1" w:after="100" w:afterAutospacing="1" w:line="360" w:lineRule="auto"/>
+        <w:jc w:val="both"/>
         <w:rPr>
           <w:rFonts w:eastAsia="Times New Roman" w:cs="Times New Roman"/>
           <w:kern w:val="0"/>
@@ -2969,6 +3171,7 @@
           <w:numId w:val="8"/>
         </w:numPr>
         <w:spacing w:before="100" w:beforeAutospacing="1" w:after="100" w:afterAutospacing="1" w:line="360" w:lineRule="auto"/>
+        <w:jc w:val="both"/>
         <w:rPr>
           <w:rFonts w:eastAsia="Times New Roman" w:cs="Times New Roman"/>
           <w:kern w:val="0"/>
@@ -3007,6 +3210,7 @@
           <w:numId w:val="8"/>
         </w:numPr>
         <w:spacing w:before="100" w:beforeAutospacing="1" w:after="100" w:afterAutospacing="1" w:line="360" w:lineRule="auto"/>
+        <w:jc w:val="both"/>
         <w:rPr>
           <w:rFonts w:eastAsia="Times New Roman" w:cs="Times New Roman"/>
           <w:kern w:val="0"/>
@@ -3045,6 +3249,7 @@
           <w:numId w:val="8"/>
         </w:numPr>
         <w:spacing w:before="100" w:beforeAutospacing="1" w:after="100" w:afterAutospacing="1" w:line="360" w:lineRule="auto"/>
+        <w:jc w:val="both"/>
         <w:rPr>
           <w:rFonts w:eastAsia="Times New Roman" w:cs="Times New Roman"/>
           <w:kern w:val="0"/>
@@ -3063,7 +3268,6 @@
           <w:lang w:eastAsia="es-ES"/>
           <w14:ligatures w14:val="none"/>
         </w:rPr>
-        <w:lastRenderedPageBreak/>
         <w:t>Generación de contenido dinámico</w:t>
       </w:r>
       <w:r>
@@ -3084,6 +3288,7 @@
           <w:numId w:val="8"/>
         </w:numPr>
         <w:spacing w:before="100" w:beforeAutospacing="1" w:after="100" w:afterAutospacing="1" w:line="360" w:lineRule="auto"/>
+        <w:jc w:val="both"/>
         <w:rPr>
           <w:rFonts w:eastAsia="Times New Roman" w:cs="Times New Roman"/>
           <w:kern w:val="0"/>
@@ -3118,6 +3323,7 @@
     <w:p>
       <w:pPr>
         <w:spacing w:before="100" w:beforeAutospacing="1" w:after="100" w:afterAutospacing="1" w:line="360" w:lineRule="auto"/>
+        <w:jc w:val="both"/>
         <w:rPr>
           <w:rFonts w:eastAsia="Times New Roman" w:cs="Times New Roman"/>
           <w:kern w:val="0"/>
@@ -3152,6 +3358,7 @@
     <w:p>
       <w:pPr>
         <w:spacing w:before="100" w:beforeAutospacing="1" w:after="100" w:afterAutospacing="1" w:line="360" w:lineRule="auto"/>
+        <w:jc w:val="both"/>
         <w:rPr>
           <w:rFonts w:eastAsia="Times New Roman" w:cs="Times New Roman"/>
           <w:kern w:val="0"/>
@@ -3178,6 +3385,7 @@
           <w:numId w:val="17"/>
         </w:numPr>
         <w:spacing w:before="100" w:beforeAutospacing="1" w:after="100" w:afterAutospacing="1" w:line="360" w:lineRule="auto"/>
+        <w:jc w:val="both"/>
         <w:rPr>
           <w:rFonts w:eastAsia="Times New Roman" w:cs="Times New Roman"/>
           <w:kern w:val="0"/>
@@ -3216,6 +3424,7 @@
           <w:numId w:val="17"/>
         </w:numPr>
         <w:spacing w:before="100" w:beforeAutospacing="1" w:after="100" w:afterAutospacing="1" w:line="360" w:lineRule="auto"/>
+        <w:jc w:val="both"/>
         <w:rPr>
           <w:rFonts w:eastAsia="Times New Roman" w:cs="Times New Roman"/>
           <w:kern w:val="0"/>
@@ -3254,6 +3463,7 @@
           <w:numId w:val="17"/>
         </w:numPr>
         <w:spacing w:before="100" w:beforeAutospacing="1" w:after="100" w:afterAutospacing="1" w:line="360" w:lineRule="auto"/>
+        <w:jc w:val="both"/>
         <w:rPr>
           <w:rFonts w:eastAsia="Times New Roman" w:cs="Times New Roman"/>
           <w:kern w:val="0"/>
@@ -3272,6 +3482,7 @@
           <w:lang w:eastAsia="es-ES"/>
           <w14:ligatures w14:val="none"/>
         </w:rPr>
+        <w:lastRenderedPageBreak/>
         <w:t>Control de la interfaz</w:t>
       </w:r>
       <w:r>
@@ -3292,6 +3503,7 @@
           <w:numId w:val="17"/>
         </w:numPr>
         <w:spacing w:before="100" w:beforeAutospacing="1" w:after="100" w:afterAutospacing="1" w:line="360" w:lineRule="auto"/>
+        <w:jc w:val="both"/>
         <w:rPr>
           <w:rFonts w:eastAsia="Times New Roman" w:cs="Times New Roman"/>
           <w:kern w:val="0"/>
@@ -3376,6 +3588,7 @@
           <w:numId w:val="17"/>
         </w:numPr>
         <w:spacing w:before="100" w:beforeAutospacing="1" w:after="100" w:afterAutospacing="1" w:line="360" w:lineRule="auto"/>
+        <w:jc w:val="both"/>
         <w:rPr>
           <w:rFonts w:eastAsia="Times New Roman" w:cs="Times New Roman"/>
           <w:kern w:val="0"/>
@@ -3438,6 +3651,7 @@
           <w:numId w:val="18"/>
         </w:numPr>
         <w:spacing w:before="100" w:beforeAutospacing="1" w:after="100" w:afterAutospacing="1" w:line="360" w:lineRule="auto"/>
+        <w:jc w:val="both"/>
       </w:pPr>
       <w:proofErr w:type="spellStart"/>
       <w:r>
@@ -3460,7 +3674,6 @@
       </w:r>
       <w:proofErr w:type="spellStart"/>
       <w:r>
-        <w:lastRenderedPageBreak/>
         <w:t>frontend</w:t>
       </w:r>
       <w:proofErr w:type="spellEnd"/>
@@ -3475,6 +3688,7 @@
           <w:numId w:val="18"/>
         </w:numPr>
         <w:spacing w:before="100" w:beforeAutospacing="1" w:after="100" w:afterAutospacing="1" w:line="360" w:lineRule="auto"/>
+        <w:jc w:val="both"/>
       </w:pPr>
       <w:r>
         <w:rPr>
@@ -3507,6 +3721,8 @@
     <w:p>
       <w:pPr>
         <w:pStyle w:val="Ttulo1"/>
+        <w:spacing w:line="360" w:lineRule="auto"/>
+        <w:jc w:val="both"/>
         <w:rPr>
           <w:rFonts w:ascii="Times New Roman" w:hAnsi="Times New Roman" w:cs="Times New Roman"/>
           <w:b/>
@@ -3530,12 +3746,23 @@
       </w:r>
       <w:bookmarkEnd w:id="2"/>
     </w:p>
-    <w:p/>
-    <w:p/>
+    <w:p>
+      <w:pPr>
+        <w:spacing w:line="360" w:lineRule="auto"/>
+        <w:jc w:val="both"/>
+      </w:pPr>
+    </w:p>
+    <w:p>
+      <w:pPr>
+        <w:spacing w:line="360" w:lineRule="auto"/>
+        <w:jc w:val="both"/>
+      </w:pPr>
+    </w:p>
     <w:p>
       <w:pPr>
         <w:pStyle w:val="Ttulo1"/>
-        <w:jc w:val="center"/>
+        <w:spacing w:line="360" w:lineRule="auto"/>
+        <w:jc w:val="both"/>
         <w:rPr>
           <w:rFonts w:ascii="Times New Roman" w:hAnsi="Times New Roman" w:cs="Times New Roman"/>
           <w:b/>
@@ -3555,6 +3782,7 @@
           <w:sz w:val="28"/>
           <w:szCs w:val="28"/>
         </w:rPr>
+        <w:lastRenderedPageBreak/>
         <w:t>FASES DEL PROYECTO</w:t>
       </w:r>
       <w:bookmarkEnd w:id="3"/>
@@ -3562,6 +3790,8 @@
     <w:p>
       <w:pPr>
         <w:pStyle w:val="Ttulo2"/>
+        <w:spacing w:line="360" w:lineRule="auto"/>
+        <w:jc w:val="both"/>
         <w:rPr>
           <w:rFonts w:ascii="Times New Roman" w:hAnsi="Times New Roman" w:cs="Times New Roman"/>
           <w:b/>
@@ -3586,6 +3816,10 @@
       <w:bookmarkEnd w:id="4"/>
     </w:p>
     <w:p>
+      <w:pPr>
+        <w:spacing w:line="360" w:lineRule="auto"/>
+        <w:jc w:val="both"/>
+      </w:pPr>
       <w:r>
         <w:rPr>
           <w:b/>
@@ -3631,6 +3865,10 @@
       </w:r>
     </w:p>
     <w:p>
+      <w:pPr>
+        <w:spacing w:line="360" w:lineRule="auto"/>
+        <w:jc w:val="both"/>
+      </w:pPr>
       <w:r>
         <w:rPr>
           <w:b/>
@@ -3652,31 +3890,62 @@
       </w:r>
     </w:p>
     <w:p>
+      <w:pPr>
+        <w:spacing w:line="360" w:lineRule="auto"/>
+        <w:jc w:val="both"/>
+      </w:pPr>
       <w:r>
         <w:t>El proceso de registro está dividido en varias páginas, permitiendo que los usuarios avancen poco a poco. El aviso de "últimas plazas" podría mejorarse con un contador más llamativo, pero es positivo que se indique. Además, el mensaje sobre la formalización de la reserva tras el pago es claro gracias al uso de un color resaltante en la página de registro. En la segunda ventana del registro, las fechas están bien organizadas al diferenciar entre quincenas y semanas. En la tercera ventana, se recuerda al usuario la semana seleccionada y solo permite elegir un horario, evitando errores. La última ventana de registro se centra en los campos obligatorios y solicita solo la información esencial.</w:t>
       </w:r>
     </w:p>
     <w:p>
-      <w:r>
-        <w:t xml:space="preserve">La sección de información del campamento urbano mantiene una estética coherente. Las imágenes ilustran bien las actividades y se ofrece una explicación detallada sobre las </w:t>
+      <w:pPr>
+        <w:spacing w:line="360" w:lineRule="auto"/>
+        <w:jc w:val="both"/>
+      </w:pPr>
+      <w:r>
+        <w:t>La sección de información del campamento urbano mantiene una estética coherente. Las imágenes ilustran bien las actividades y se ofrece una explicación detallada sobre las fechas y ubicación. Se incluye un enlace al PDF del menú, junto con información básica del campamento. La ventana de programación presenta información clara y concisa. En la sección de modalidades y pagos, cada tipo de jornada se diferencia con colores distintos, facilitando la comprensión. Además, se explica de manera sencilla el descuento disponible. La ventana "Sobre Nosotros" ofrece información sobre la empresa y el equipo. También cuentan con una sección de preguntas frecuentes (FAQ) con desplegables para cada consulta, un enlace directo a la reserva y un teléfono de contacto para resolver dudas.</w:t>
+      </w:r>
+    </w:p>
+    <w:p>
+      <w:pPr>
+        <w:spacing w:line="360" w:lineRule="auto"/>
+        <w:jc w:val="both"/>
+      </w:pPr>
+    </w:p>
+    <w:p>
+      <w:pPr>
+        <w:spacing w:line="360" w:lineRule="auto"/>
+        <w:jc w:val="both"/>
+      </w:pPr>
+      <w:r>
+        <w:rPr>
+          <w:b/>
+          <w:bCs/>
+        </w:rPr>
+        <w:t>Aspectos Negativos</w:t>
+      </w:r>
+      <w:r>
+        <w:br/>
+        <w:t>El menú de</w:t>
+      </w:r>
+      <w:r>
+        <w:t xml:space="preserve"> la página de inicio </w:t>
+      </w:r>
+      <w:r>
+        <w:t xml:space="preserve">tiene problemas de visibilidad, ya que el color de la fuente no contrasta lo suficiente con el fondo azul. El </w:t>
+      </w:r>
+      <w:proofErr w:type="spellStart"/>
+      <w:r>
+        <w:t>hover</w:t>
+      </w:r>
+      <w:proofErr w:type="spellEnd"/>
+      <w:r>
+        <w:t xml:space="preserve"> del correo y el teléfono presenta el </w:t>
       </w:r>
       <w:r>
         <w:lastRenderedPageBreak/>
-        <w:t>fechas y ubicación. Se incluye un enlace al PDF del menú, junto con información básica del campamento. La ventana de programación presenta información clara y concisa. En la sección de modalidades y pagos, cada tipo de jornada se diferencia con colores distintos, facilitando la comprensión. Además, se explica de manera sencilla el descuento disponible. La ventana "Sobre Nosotros" ofrece información sobre la empresa y el equipo. También cuentan con una sección de preguntas frecuentes (FAQ) con desplegables para cada consulta, un enlace directo a la reserva y un teléfono de contacto para resolver dudas.</w:t>
-      </w:r>
-    </w:p>
-    <w:p/>
-    <w:p>
-      <w:r>
-        <w:rPr>
-          <w:b/>
-          <w:bCs/>
-        </w:rPr>
-        <w:t>Aspectos Negativos</w:t>
-      </w:r>
-      <w:r>
-        <w:br/>
-        <w:t xml:space="preserve">El menú del home tiene problemas de visibilidad, ya que el color de la fuente no contrasta lo suficiente con el fondo azul. El </w:t>
+        <w:t xml:space="preserve">mismo problema, ya que adopta el mismo color que el fondo. El </w:t>
       </w:r>
       <w:proofErr w:type="spellStart"/>
       <w:r>
@@ -3684,76 +3953,92 @@
       </w:r>
       <w:proofErr w:type="spellEnd"/>
       <w:r>
-        <w:t xml:space="preserve"> del correo y el teléfono presenta el mismo problema, ya que adopta el mismo color que el fondo. El </w:t>
+        <w:t xml:space="preserve"> de las imágenes no tiene una funcionalidad clara y debería aplicarse también al texto. Además, en las imágenes de excursión, </w:t>
       </w:r>
       <w:proofErr w:type="spellStart"/>
       <w:r>
+        <w:t>gymkana</w:t>
+      </w:r>
+      <w:proofErr w:type="spellEnd"/>
+      <w:r>
+        <w:t xml:space="preserve">, manualidades y piscina no hay información adicional; podría incorporarse un </w:t>
+      </w:r>
+      <w:proofErr w:type="spellStart"/>
+      <w:r>
         <w:t>hover</w:t>
       </w:r>
       <w:proofErr w:type="spellEnd"/>
       <w:r>
-        <w:t xml:space="preserve"> de las imágenes no tiene una funcionalidad clara y debería aplicarse también al texto. Además, en las imágenes de excursión, </w:t>
+        <w:t xml:space="preserve"> o un </w:t>
       </w:r>
       <w:proofErr w:type="spellStart"/>
       <w:r>
-        <w:t>gymkana</w:t>
+        <w:t>grid</w:t>
       </w:r>
       <w:proofErr w:type="spellEnd"/>
       <w:r>
-        <w:t xml:space="preserve">, manualidades y piscina no hay información adicional; podría incorporarse un </w:t>
+        <w:t xml:space="preserve"> con detalles sobre cada actividad. En el footer, la tipografía de los números del teléfono dificulta su lectura.</w:t>
+      </w:r>
+    </w:p>
+    <w:p>
+      <w:pPr>
+        <w:spacing w:line="360" w:lineRule="auto"/>
+        <w:jc w:val="both"/>
+      </w:pPr>
+      <w:r>
+        <w:t xml:space="preserve">En la primera ventana de registro, la estética no coincide con la página principal. En la segunda ventana, las opciones con plazas agotadas siguen siendo seleccionables, lo que puede generar confusión. En la tercera ventana, la opción de días sueltos no está bien explicada en cuanto al pago, lo que genera incertidumbre. El enlace para consultar información sobre los días de excursión debería ser un desplegable en la misma página en lugar de abrir una nueva pestaña. Además, la información sobre las excursiones es escasa, lo que dificulta la selección de una opción. En la cuarta ventana de registro, no hay </w:t>
       </w:r>
       <w:proofErr w:type="spellStart"/>
       <w:r>
-        <w:t>hover</w:t>
+        <w:t>placeholders</w:t>
       </w:r>
       <w:proofErr w:type="spellEnd"/>
       <w:r>
-        <w:t xml:space="preserve"> o un </w:t>
+        <w:t xml:space="preserve"> que guíen al usuario sobre el formato de los datos requeridos, ni avisos en tiempo real sobre la correcta cumplimentación de los campos.</w:t>
+      </w:r>
+    </w:p>
+    <w:p>
+      <w:pPr>
+        <w:spacing w:line="360" w:lineRule="auto"/>
+        <w:jc w:val="both"/>
+      </w:pPr>
+      <w:r>
+        <w:t xml:space="preserve">En la ventana de información del campamento, podrían incluirse vídeos para mostrar mejor el funcionamiento del campamento, así como una galería de fotos. Un calendario podría facilitar la visualización de fechas y un mapa o enlace a Google </w:t>
       </w:r>
       <w:proofErr w:type="spellStart"/>
       <w:r>
-        <w:t>grid</w:t>
+        <w:t>Maps</w:t>
       </w:r>
       <w:proofErr w:type="spellEnd"/>
       <w:r>
-        <w:t xml:space="preserve"> con detalles sobre cada actividad. En el footer, la tipografía de los números del teléfono dificulta su lectura.</w:t>
-      </w:r>
-    </w:p>
-    <w:p>
-      <w:r>
-        <w:t xml:space="preserve">En la primera ventana de registro, la estética no coincide con la página principal. En la segunda ventana, las opciones con plazas agotadas siguen siendo seleccionables, lo que puede generar confusión. En la tercera ventana, la opción de días sueltos no está bien explicada en cuanto al pago, lo que genera incertidumbre. El enlace para consultar información sobre los días de excursión debería ser un desplegable en la misma página en lugar de abrir una nueva pestaña. Además, la información sobre las excursiones es escasa, lo que dificulta la selección de una opción. En la cuarta ventana de registro, no hay </w:t>
-      </w:r>
-      <w:proofErr w:type="spellStart"/>
-      <w:r>
-        <w:t>placeholders</w:t>
-      </w:r>
-      <w:proofErr w:type="spellEnd"/>
-      <w:r>
-        <w:t xml:space="preserve"> que guíen al usuario sobre el formato de los datos requeridos, ni avisos en tiempo real sobre la correcta cumplimentación de los campos.</w:t>
-      </w:r>
-    </w:p>
-    <w:p>
-      <w:r>
-        <w:t xml:space="preserve">En la ventana de información del campamento, podrían incluirse vídeos para mostrar mejor el funcionamiento del campamento, así como una galería de fotos. Un calendario podría facilitar la visualización de fechas y un mapa o enlace a Google </w:t>
-      </w:r>
-      <w:proofErr w:type="spellStart"/>
-      <w:r>
-        <w:t>Maps</w:t>
-      </w:r>
-      <w:proofErr w:type="spellEnd"/>
-      <w:r>
         <w:t xml:space="preserve"> ayudaría con la ubicación. El enlace a modalidades y precios está mal ubicado, ya que no es específico del comedor. En la ventana de programación, faltan imágenes que ilustren las actividades diarias. En la ventana de modalidades y precios, solo aparecen opciones por quincena, mientras que en el pago también se permite por semana. Al seleccionar una jornada o quincena, no se preselecciona al ingresar en la página de reserva. Además, aparecen como disponibles algunas fechas sin plazas, lo que podría evitarse difuminando o marcando en gris dichas opciones. El descuento debería destacarse desde el principio para captar la atención.</w:t>
       </w:r>
     </w:p>
     <w:p>
+      <w:pPr>
+        <w:spacing w:line="360" w:lineRule="auto"/>
+        <w:jc w:val="both"/>
+      </w:pPr>
       <w:r>
         <w:t>En la ventana "Sobre Nosotros", faltan imágenes y descripciones del equipo. En la sección de FAQ, el título podría ser "Preguntas Frecuentes" para mayor claridad y la tipografía debería mejorarse para facilitar la lectura.</w:t>
       </w:r>
     </w:p>
-    <w:p/>
-    <w:p/>
-    <w:p>
-      <w:pPr>
+    <w:p>
+      <w:pPr>
+        <w:spacing w:line="360" w:lineRule="auto"/>
+        <w:jc w:val="both"/>
+      </w:pPr>
+    </w:p>
+    <w:p>
+      <w:pPr>
+        <w:spacing w:line="360" w:lineRule="auto"/>
+        <w:jc w:val="both"/>
+      </w:pPr>
+    </w:p>
+    <w:p>
+      <w:pPr>
+        <w:spacing w:line="360" w:lineRule="auto"/>
+        <w:jc w:val="both"/>
         <w:rPr>
           <w:b/>
           <w:bCs/>
@@ -3797,8 +4082,17 @@
         <w:t>Fecha: 02/12/2024</w:t>
       </w:r>
     </w:p>
-    <w:p/>
-    <w:p>
+    <w:p>
+      <w:pPr>
+        <w:spacing w:line="360" w:lineRule="auto"/>
+        <w:jc w:val="both"/>
+      </w:pPr>
+    </w:p>
+    <w:p>
+      <w:pPr>
+        <w:spacing w:line="360" w:lineRule="auto"/>
+        <w:jc w:val="both"/>
+      </w:pPr>
       <w:r>
         <w:rPr>
           <w:b/>
@@ -3808,16 +4102,35 @@
       </w:r>
       <w:r>
         <w:br/>
-        <w:t>En el home, los colores armonizan con el logo del campamento y el menú tiene un buen contraste con el fondo. El logo es original. Disponen de un botón fijo de WhatsApp y otro para ajustes de cookies. Los botones son visibles y llaman la atención del usuario. Se incluye un video que muestra el campamento y una buena selección de imágenes. Se explica de forma clara la temática del campamento y las actividades que se realizan. Podría incorporarse la opinión de los niños y clientes, así como una galería de fotos y recomendaciones de terceros. La información de contacto es accesible. El footer contiene datos relevantes.</w:t>
-      </w:r>
-    </w:p>
-    <w:p>
+        <w:t xml:space="preserve">En </w:t>
+      </w:r>
+      <w:r>
+        <w:t>la página de inicio</w:t>
+      </w:r>
+      <w:r>
+        <w:t>, los colores armonizan con el logo del campamento y el menú tiene un buen contraste con el fondo. El logo es original. Disponen de un botón fijo de WhatsApp y otro para ajustes de cookies. Los botones son visibles y llaman la atención del usuario. Se incluye un video que muestra el campamento y una buena selección de imágenes. Se explica de forma clara la temática del campamento y las actividades que se realizan. Podría incorporarse la opinión de los niños y clientes, así como una galería de fotos y recomendaciones de terceros. La información de contacto es accesible. El footer contiene datos relevantes.</w:t>
+      </w:r>
+    </w:p>
+    <w:p>
+      <w:pPr>
+        <w:spacing w:line="360" w:lineRule="auto"/>
+        <w:jc w:val="both"/>
+      </w:pPr>
       <w:r>
         <w:t>La sección "Conócenos" mantiene la estética general e incluye imágenes del equipo, lo que genera confianza. Los objetivos están bien definidos. En la página de información del campamento urbano, se detallan la edad de los niños y las plazas disponibles, así como tarifas y horarios de manera visualmente accesible. Se incluyen iconos uniformes y una guía de normas descargable. También está disponible el menú para los padres. La ventana de instalaciones contiene un mapa de las infraestructuras. La ventana de contacto cuenta con un formulario sencillo y un mapa de ubicación. En la reserva, las opciones obligatorias están bien señaladas.</w:t>
       </w:r>
     </w:p>
-    <w:p/>
-    <w:p>
+    <w:p>
+      <w:pPr>
+        <w:spacing w:line="360" w:lineRule="auto"/>
+        <w:jc w:val="both"/>
+      </w:pPr>
+    </w:p>
+    <w:p>
+      <w:pPr>
+        <w:spacing w:line="360" w:lineRule="auto"/>
+        <w:jc w:val="both"/>
+      </w:pPr>
       <w:r>
         <w:rPr>
           <w:b/>
@@ -3827,13 +4140,20 @@
       </w:r>
       <w:r>
         <w:br/>
-        <w:t>El botón de reserva en el home no contrasta bien con el fondo. El título de inscripción es poco legible sobre fondo amarillo. Faltan imágenes de actividades. El formulario tiene fondo blanco y no resalta. En "Conócenos" falta información del equipo. En la información del campamento, el botón de reserva sigue sin contrastar bien y el horario es demasiado pequeño. La galería de imágenes debería ser un carrusel. En "Instalaciones", la leyenda del mapa es demasiado pequeña. La reserva tiene validación insuficiente y falta la sección de FAQ.</w:t>
-      </w:r>
-    </w:p>
-    <w:p/>
+        <w:t xml:space="preserve">El botón de reserva en </w:t>
+      </w:r>
+      <w:r>
+        <w:t xml:space="preserve">la página de inicio </w:t>
+      </w:r>
+      <w:r>
+        <w:t>no contrasta bien con el fondo. El título de inscripción es poco legible sobre fondo amarillo. Faltan imágenes de actividades. El formulario tiene fondo blanco y no resalta. En "Conócenos" falta información del equipo. En la información del campamento, el botón de reserva sigue sin contrastar bien y el horario es demasiado pequeño. La galería de imágenes debería ser un carrusel. En "Instalaciones", la leyenda del mapa es demasiado pequeña. La reserva tiene validación insuficiente y falta la sección de FAQ.</w:t>
+      </w:r>
+    </w:p>
     <w:p>
       <w:pPr>
         <w:pStyle w:val="Ttulo2"/>
+        <w:spacing w:line="360" w:lineRule="auto"/>
+        <w:jc w:val="both"/>
         <w:rPr>
           <w:rFonts w:ascii="Times New Roman" w:hAnsi="Times New Roman" w:cs="Times New Roman"/>
           <w:b/>
@@ -3853,12 +4173,232 @@
           <w:sz w:val="28"/>
           <w:szCs w:val="28"/>
         </w:rPr>
+        <w:lastRenderedPageBreak/>
         <w:t>ANÁLISIS DE LA APLICACIÓN</w:t>
       </w:r>
       <w:bookmarkEnd w:id="5"/>
     </w:p>
     <w:p>
       <w:pPr>
+        <w:spacing w:line="360" w:lineRule="auto"/>
+        <w:jc w:val="both"/>
+      </w:pPr>
+      <w:r>
+        <w:t xml:space="preserve">La plataforma web del campamento </w:t>
+      </w:r>
+      <w:r>
+        <w:t>pirata</w:t>
+      </w:r>
+      <w:r>
+        <w:t xml:space="preserve"> ha sido diseñada con un enfoque integral que permite a los distintos usuarios interactuar de manera eficiente con el sistema, garantizando una experiencia fluida desde el proceso de inscripción hasta la gestión diaria de actividades. La estructura de la plataforma se ha concebido para atender las necesidades específicas de padres y tutores, monitores y administradores, ofreciendo una interfaz intuitiva respaldada por una arquitectura robusta.</w:t>
+      </w:r>
+    </w:p>
+    <w:p>
+      <w:pPr>
+        <w:pStyle w:val="Ttulo2"/>
+        <w:spacing w:line="360" w:lineRule="auto"/>
+        <w:jc w:val="both"/>
+        <w:rPr>
+          <w:rFonts w:ascii="Times New Roman" w:hAnsi="Times New Roman" w:cs="Times New Roman"/>
+          <w:b/>
+          <w:bCs/>
+          <w:color w:val="auto"/>
+          <w:sz w:val="24"/>
+          <w:szCs w:val="24"/>
+        </w:rPr>
+      </w:pPr>
+      <w:r>
+        <w:rPr>
+          <w:rFonts w:ascii="Times New Roman" w:hAnsi="Times New Roman" w:cs="Times New Roman"/>
+          <w:b/>
+          <w:bCs/>
+          <w:color w:val="auto"/>
+          <w:sz w:val="24"/>
+          <w:szCs w:val="24"/>
+        </w:rPr>
+        <w:t>TUTOR</w:t>
+      </w:r>
+    </w:p>
+    <w:p>
+      <w:pPr>
+        <w:spacing w:line="360" w:lineRule="auto"/>
+        <w:jc w:val="both"/>
+      </w:pPr>
+      <w:r>
+        <w:t>Desde la perspectiva de los padres o tutores, la web ofrece una serie de herramientas que permiten conocer el campamento en profundidad antes de tomar la decisión de inscribir a su hijo. A través de</w:t>
+      </w:r>
+      <w:r>
+        <w:t xml:space="preserve"> la página de inicio</w:t>
+      </w:r>
+      <w:r>
+        <w:t>, pueden acceder a información detallada sobre la metodología Montessori aplicada en el campamento, la temática pirata que lo caracteriza, y las diversas actividades que se llevan a cabo.</w:t>
+      </w:r>
+    </w:p>
+    <w:p>
+      <w:pPr>
+        <w:spacing w:line="360" w:lineRule="auto"/>
+        <w:jc w:val="both"/>
+      </w:pPr>
+      <w:r>
+        <w:t xml:space="preserve">Una de las funcionalidades clave para ellos es la inscripción en línea, la cual permite registrar a su hijo de manera rápida y sencilla, seleccionando fechas y horarios según disponibilidad. </w:t>
+      </w:r>
+      <w:r>
+        <w:t xml:space="preserve">Para facilitar su inscripción, los elementos del formulario cuentan con unas validaciones en tiempo real, hechas mediante JS, que no permiten el envío de dicho formulario. Para cada uno de los elementos, se hace una validación independiente, ya que la estructura que puede llegar a tener el </w:t>
+      </w:r>
+      <w:r>
+        <w:t>correo</w:t>
+      </w:r>
+      <w:r>
+        <w:t xml:space="preserve"> no es la misma que puede llegar a haber en el teléfono.</w:t>
+      </w:r>
+    </w:p>
+    <w:p>
+      <w:pPr>
+        <w:spacing w:line="360" w:lineRule="auto"/>
+        <w:jc w:val="both"/>
+      </w:pPr>
+      <w:r>
+        <w:t>Además, la web cuenta con un apartado específico donde los tutores pueden consultar las tarifas según el horario elegido.</w:t>
+      </w:r>
+      <w:r>
+        <w:t xml:space="preserve"> Para seleccionar una de las tarifas, se hace uso de unas tarjetas interactivas, que al seleccionarlas cambian para saber que ha sido seleccionada. Esto está hecho haciendo uso tanto de CSS como del JS.</w:t>
+      </w:r>
+    </w:p>
+    <w:p>
+      <w:pPr>
+        <w:spacing w:line="360" w:lineRule="auto"/>
+        <w:jc w:val="both"/>
+      </w:pPr>
+      <w:r>
+        <w:t>Para resolver cualquier duda adicional, existe una sección de preguntas frecuentes y un formulario de contacto que permite el envío de consultas por correo electrónico o la comunicación telefónica directa con la administración del campamento.</w:t>
+      </w:r>
+      <w:r>
+        <w:t xml:space="preserve"> La sección de preguntas </w:t>
+      </w:r>
+      <w:proofErr w:type="gramStart"/>
+      <w:r>
+        <w:t>frecuentes,</w:t>
+      </w:r>
+      <w:proofErr w:type="gramEnd"/>
+      <w:r>
+        <w:t xml:space="preserve"> </w:t>
+      </w:r>
+      <w:r>
+        <w:t>consiste en</w:t>
+      </w:r>
+      <w:r>
+        <w:t xml:space="preserve"> unos elementos con una imagen de una flecha en al que el usuario podrá clicar, y aparecerá un elemento interactivo en el que aparecerá la respuesta. Para ello se ha utilizado JS, que añade un evento a la imagen de la flecha que hay en el contenedor, para que cuando haya un elemento </w:t>
+      </w:r>
+      <w:proofErr w:type="spellStart"/>
+      <w:proofErr w:type="gramStart"/>
+      <w:r>
+        <w:t>click</w:t>
+      </w:r>
+      <w:proofErr w:type="spellEnd"/>
+      <w:proofErr w:type="gramEnd"/>
+      <w:r>
+        <w:t>, la acción tenga lugar.</w:t>
+      </w:r>
+    </w:p>
+    <w:p>
+      <w:pPr>
+        <w:spacing w:line="360" w:lineRule="auto"/>
+        <w:jc w:val="both"/>
+      </w:pPr>
+      <w:r>
+        <w:lastRenderedPageBreak/>
+        <w:t>Para realizar la gestión de la incidencia hay un apartado al final del quienes somos. Dicho formulario consta de dos elementos a rellenar</w:t>
+      </w:r>
+      <w:r>
+        <w:t>:</w:t>
+      </w:r>
+      <w:r>
+        <w:t xml:space="preserve"> un asunto de la incidencia, acompañado de un texto informativo para aclarar cuál es el problema. El formulario será enviado a la tabla incidencias de la base de datos</w:t>
+      </w:r>
+      <w:r>
+        <w:t>,</w:t>
+      </w:r>
+      <w:r>
+        <w:t xml:space="preserve"> </w:t>
+      </w:r>
+      <w:r>
+        <w:t>d</w:t>
+      </w:r>
+      <w:r>
+        <w:t xml:space="preserve">icha incidencia le </w:t>
+      </w:r>
+      <w:r>
+        <w:t xml:space="preserve">aparecerá al administrador en su dashboard y podrá ser gestionada desde el apartado de soporte, en el que podrá responder al usuario para solucionar la incidencia. La incidencia aparecerá mediante el uso de un </w:t>
+      </w:r>
+      <w:proofErr w:type="spellStart"/>
+      <w:r>
+        <w:t>fetch</w:t>
+      </w:r>
+      <w:proofErr w:type="spellEnd"/>
+      <w:r>
+        <w:t>, el cual obtendrá la incidencia de la base de datos, y haciendo uso de JS para mostrarla en la página.</w:t>
+      </w:r>
+    </w:p>
+    <w:p>
+      <w:pPr>
+        <w:spacing w:line="360" w:lineRule="auto"/>
+        <w:jc w:val="both"/>
+      </w:pPr>
+    </w:p>
+    <w:p>
+      <w:pPr>
+        <w:pStyle w:val="Ttulo2"/>
+        <w:spacing w:line="360" w:lineRule="auto"/>
+        <w:jc w:val="both"/>
+        <w:rPr>
+          <w:rFonts w:ascii="Times New Roman" w:hAnsi="Times New Roman" w:cs="Times New Roman"/>
+          <w:b/>
+          <w:bCs/>
+          <w:color w:val="auto"/>
+          <w:sz w:val="24"/>
+          <w:szCs w:val="24"/>
+        </w:rPr>
+      </w:pPr>
+      <w:r>
+        <w:rPr>
+          <w:rFonts w:ascii="Times New Roman" w:hAnsi="Times New Roman" w:cs="Times New Roman"/>
+          <w:b/>
+          <w:bCs/>
+          <w:color w:val="auto"/>
+          <w:sz w:val="24"/>
+          <w:szCs w:val="24"/>
+        </w:rPr>
+        <w:t>MONITOR</w:t>
+      </w:r>
+    </w:p>
+    <w:p>
+      <w:pPr>
+        <w:spacing w:line="360" w:lineRule="auto"/>
+        <w:jc w:val="both"/>
+      </w:pPr>
+      <w:r>
+        <w:t>Los monitores cuentan con un espacio propio dentro de la plataforma, el cual les permite llevar un control preciso de sus actividades diarias. Desde su panel de usuario, pueden consultar el cronograma del campamento y conocer con antelación las actividades programadas, así como los materiales necesarios para su realización. Una de las funciones más importantes que ofrece la web para ellos es la posibilidad de modificar actividades o añadir nuevas según las necesidades del grupo. Además, los monitores tienen acceso a una herramienta para pasar lista, lo que les permite registrar de manera digital la asistencia de los niños y detectar cualquier ausencia al instante. Asimismo, disponen de una sección específica donde pueden consultar información relevante sobre los alumnos a su cargo, incluyendo datos de contacto de sus tutores y la posibilidad de realizar anotaciones sobre el desempeño de cada niño.</w:t>
+      </w:r>
+    </w:p>
+    <w:p>
+      <w:pPr>
+        <w:spacing w:line="360" w:lineRule="auto"/>
+        <w:jc w:val="both"/>
+      </w:pPr>
+    </w:p>
+    <w:p>
+      <w:pPr>
+        <w:spacing w:line="360" w:lineRule="auto"/>
+        <w:jc w:val="both"/>
+      </w:pPr>
+      <w:r>
+        <w:t>El administrador del campamento tiene un control aún más amplio sobre el funcionamiento de la web y del programa en general. Su panel le permite supervisar las actividades de los monitores, gestionar la inscripción de los alumnos y controlar aspectos logísticos esenciales, como los pagos pendientes o la creación de nuevos grupos. Además, cuenta con una herramienta para gestionar descuentos y actualizar tarifas según sea necesario. Otra funcionalidad clave del administrador es la capacidad de crear o eliminar monitores y organizar la estructura del campamento de manera flexible, asegurando un funcionamiento eficiente y adaptado a las necesidades de cada edición.</w:t>
+      </w:r>
+    </w:p>
+    <w:p>
+      <w:pPr>
+        <w:spacing w:line="360" w:lineRule="auto"/>
+        <w:jc w:val="both"/>
         <w:rPr>
           <w:rFonts w:cs="Times New Roman"/>
           <w:b/>
@@ -3871,6 +4411,8 @@
     <w:p>
       <w:pPr>
         <w:pStyle w:val="Ttulo2"/>
+        <w:spacing w:line="360" w:lineRule="auto"/>
+        <w:jc w:val="both"/>
         <w:rPr>
           <w:rFonts w:ascii="Times New Roman" w:hAnsi="Times New Roman" w:cs="Times New Roman"/>
           <w:b/>
@@ -3890,11 +4432,16 @@
           <w:sz w:val="28"/>
           <w:szCs w:val="28"/>
         </w:rPr>
+        <w:lastRenderedPageBreak/>
         <w:t>MODELO DE DATOS</w:t>
       </w:r>
       <w:bookmarkEnd w:id="6"/>
     </w:p>
     <w:p>
+      <w:pPr>
+        <w:spacing w:line="360" w:lineRule="auto"/>
+        <w:jc w:val="both"/>
+      </w:pPr>
       <w:r>
         <w:t xml:space="preserve">El sistema de gestión del campamento escolar se basa en una base de datos estructurada en torno a varias entidades principales: </w:t>
       </w:r>
@@ -3909,21 +4456,26 @@
         <w:t>. Estas entidades están interconectadas mediante relaciones bien definidas que permiten gestionar las inscripciones, pagos, actividades y demás aspectos operativos del campamento.</w:t>
       </w:r>
     </w:p>
-    <w:p/>
-    <w:p>
-      <w:pPr>
-        <w:jc w:val="both"/>
-        <w:rPr>
-          <w:b/>
-          <w:bCs/>
-        </w:rPr>
-      </w:pPr>
-      <w:r>
-        <w:rPr>
-          <w:b/>
-          <w:bCs/>
-        </w:rPr>
-        <w:lastRenderedPageBreak/>
+    <w:p>
+      <w:pPr>
+        <w:spacing w:line="360" w:lineRule="auto"/>
+        <w:jc w:val="both"/>
+      </w:pPr>
+    </w:p>
+    <w:p>
+      <w:pPr>
+        <w:spacing w:line="360" w:lineRule="auto"/>
+        <w:jc w:val="both"/>
+        <w:rPr>
+          <w:b/>
+          <w:bCs/>
+        </w:rPr>
+      </w:pPr>
+      <w:r>
+        <w:rPr>
+          <w:b/>
+          <w:bCs/>
+        </w:rPr>
         <w:t xml:space="preserve">Tabla </w:t>
       </w:r>
       <w:r>
@@ -3936,6 +4488,7 @@
     </w:p>
     <w:p>
       <w:pPr>
+        <w:spacing w:line="360" w:lineRule="auto"/>
         <w:jc w:val="both"/>
       </w:pPr>
       <w:r>
@@ -3944,6 +4497,7 @@
     </w:p>
     <w:p>
       <w:pPr>
+        <w:spacing w:line="360" w:lineRule="auto"/>
         <w:jc w:val="both"/>
         <w:rPr>
           <w:b/>
@@ -3960,6 +4514,7 @@
     </w:p>
     <w:p>
       <w:pPr>
+        <w:spacing w:line="360" w:lineRule="auto"/>
         <w:jc w:val="both"/>
       </w:pPr>
       <w:r>
@@ -3976,6 +4531,7 @@
           <w:ilvl w:val="0"/>
           <w:numId w:val="19"/>
         </w:numPr>
+        <w:spacing w:line="360" w:lineRule="auto"/>
         <w:jc w:val="both"/>
       </w:pPr>
       <w:r>
@@ -4010,6 +4566,7 @@
           <w:ilvl w:val="0"/>
           <w:numId w:val="19"/>
         </w:numPr>
+        <w:spacing w:line="360" w:lineRule="auto"/>
         <w:jc w:val="both"/>
       </w:pPr>
       <w:r>
@@ -4044,6 +4601,7 @@
           <w:ilvl w:val="0"/>
           <w:numId w:val="19"/>
         </w:numPr>
+        <w:spacing w:line="360" w:lineRule="auto"/>
         <w:jc w:val="both"/>
       </w:pPr>
       <w:r>
@@ -4074,6 +4632,7 @@
     </w:p>
     <w:p>
       <w:pPr>
+        <w:spacing w:line="360" w:lineRule="auto"/>
         <w:jc w:val="both"/>
         <w:rPr>
           <w:b/>
@@ -4090,6 +4649,7 @@
     </w:p>
     <w:p>
       <w:pPr>
+        <w:spacing w:line="360" w:lineRule="auto"/>
         <w:jc w:val="both"/>
       </w:pPr>
       <w:r>
@@ -4098,6 +4658,7 @@
     </w:p>
     <w:p>
       <w:pPr>
+        <w:spacing w:line="360" w:lineRule="auto"/>
         <w:jc w:val="both"/>
         <w:rPr>
           <w:b/>
@@ -4117,6 +4678,7 @@
     </w:p>
     <w:p>
       <w:pPr>
+        <w:spacing w:line="360" w:lineRule="auto"/>
         <w:jc w:val="both"/>
         <w:rPr>
           <w:b/>
@@ -4137,6 +4699,7 @@
           <w:ilvl w:val="0"/>
           <w:numId w:val="20"/>
         </w:numPr>
+        <w:spacing w:line="360" w:lineRule="auto"/>
         <w:jc w:val="both"/>
       </w:pPr>
       <w:proofErr w:type="spellStart"/>
@@ -4154,6 +4717,7 @@
           <w:ilvl w:val="0"/>
           <w:numId w:val="20"/>
         </w:numPr>
+        <w:spacing w:line="360" w:lineRule="auto"/>
         <w:jc w:val="both"/>
       </w:pPr>
       <w:proofErr w:type="spellStart"/>
@@ -4171,6 +4735,7 @@
           <w:ilvl w:val="0"/>
           <w:numId w:val="20"/>
         </w:numPr>
+        <w:spacing w:line="360" w:lineRule="auto"/>
         <w:jc w:val="both"/>
       </w:pPr>
       <w:proofErr w:type="spellStart"/>
@@ -4184,6 +4749,7 @@
     </w:p>
     <w:p>
       <w:pPr>
+        <w:spacing w:line="360" w:lineRule="auto"/>
         <w:jc w:val="both"/>
         <w:rPr>
           <w:b/>
@@ -4204,6 +4770,7 @@
           <w:ilvl w:val="0"/>
           <w:numId w:val="21"/>
         </w:numPr>
+        <w:spacing w:line="360" w:lineRule="auto"/>
         <w:jc w:val="both"/>
         <w:rPr>
           <w:b/>
@@ -4240,13 +4807,15 @@
           <w:ilvl w:val="0"/>
           <w:numId w:val="21"/>
         </w:numPr>
-        <w:jc w:val="both"/>
-        <w:rPr>
-          <w:b/>
-          <w:bCs/>
-        </w:rPr>
-      </w:pPr>
-      <w:r>
+        <w:spacing w:line="360" w:lineRule="auto"/>
+        <w:jc w:val="both"/>
+        <w:rPr>
+          <w:b/>
+          <w:bCs/>
+        </w:rPr>
+      </w:pPr>
+      <w:r>
+        <w:lastRenderedPageBreak/>
         <w:t xml:space="preserve">Se asocia </w:t>
       </w:r>
       <w:r>
@@ -4284,6 +4853,7 @@
     </w:p>
     <w:p>
       <w:pPr>
+        <w:spacing w:line="360" w:lineRule="auto"/>
         <w:jc w:val="both"/>
         <w:rPr>
           <w:b/>
@@ -4300,6 +4870,7 @@
     </w:p>
     <w:p>
       <w:pPr>
+        <w:spacing w:line="360" w:lineRule="auto"/>
         <w:jc w:val="both"/>
       </w:pPr>
       <w:r>
@@ -4322,6 +4893,7 @@
           <w:ilvl w:val="0"/>
           <w:numId w:val="22"/>
         </w:numPr>
+        <w:spacing w:line="360" w:lineRule="auto"/>
         <w:jc w:val="both"/>
       </w:pPr>
       <w:r>
@@ -4341,6 +4913,7 @@
           <w:ilvl w:val="0"/>
           <w:numId w:val="22"/>
         </w:numPr>
+        <w:spacing w:line="360" w:lineRule="auto"/>
         <w:jc w:val="both"/>
       </w:pPr>
       <w:r>
@@ -4357,6 +4930,7 @@
           <w:ilvl w:val="1"/>
           <w:numId w:val="22"/>
         </w:numPr>
+        <w:spacing w:line="360" w:lineRule="auto"/>
         <w:jc w:val="both"/>
       </w:pPr>
       <w:r>
@@ -4387,48 +4961,54 @@
     </w:p>
     <w:p>
       <w:pPr>
-        <w:jc w:val="both"/>
-      </w:pPr>
-    </w:p>
-    <w:p>
-      <w:pPr>
-        <w:jc w:val="both"/>
-      </w:pPr>
-    </w:p>
-    <w:p>
-      <w:pPr>
-        <w:jc w:val="both"/>
-      </w:pPr>
-    </w:p>
-    <w:p>
-      <w:pPr>
-        <w:jc w:val="both"/>
-      </w:pPr>
-    </w:p>
-    <w:p>
-      <w:pPr>
-        <w:jc w:val="both"/>
-      </w:pPr>
-    </w:p>
-    <w:p>
-      <w:pPr>
-        <w:jc w:val="both"/>
-        <w:rPr>
-          <w:b/>
-          <w:bCs/>
-        </w:rPr>
-      </w:pPr>
-      <w:r>
-        <w:rPr>
-          <w:b/>
-          <w:bCs/>
-        </w:rPr>
-        <w:lastRenderedPageBreak/>
+        <w:spacing w:line="360" w:lineRule="auto"/>
+        <w:jc w:val="both"/>
+      </w:pPr>
+    </w:p>
+    <w:p>
+      <w:pPr>
+        <w:spacing w:line="360" w:lineRule="auto"/>
+        <w:jc w:val="both"/>
+      </w:pPr>
+    </w:p>
+    <w:p>
+      <w:pPr>
+        <w:spacing w:line="360" w:lineRule="auto"/>
+        <w:jc w:val="both"/>
+      </w:pPr>
+    </w:p>
+    <w:p>
+      <w:pPr>
+        <w:spacing w:line="360" w:lineRule="auto"/>
+        <w:jc w:val="both"/>
+      </w:pPr>
+    </w:p>
+    <w:p>
+      <w:pPr>
+        <w:spacing w:line="360" w:lineRule="auto"/>
+        <w:jc w:val="both"/>
+      </w:pPr>
+    </w:p>
+    <w:p>
+      <w:pPr>
+        <w:spacing w:line="360" w:lineRule="auto"/>
+        <w:jc w:val="both"/>
+        <w:rPr>
+          <w:b/>
+          <w:bCs/>
+        </w:rPr>
+      </w:pPr>
+      <w:r>
+        <w:rPr>
+          <w:b/>
+          <w:bCs/>
+        </w:rPr>
         <w:t>Tabla Inscripción</w:t>
       </w:r>
     </w:p>
     <w:p>
       <w:pPr>
+        <w:spacing w:line="360" w:lineRule="auto"/>
         <w:jc w:val="both"/>
       </w:pPr>
       <w:r>
@@ -4441,6 +5021,7 @@
           <w:ilvl w:val="0"/>
           <w:numId w:val="23"/>
         </w:numPr>
+        <w:spacing w:line="360" w:lineRule="auto"/>
         <w:jc w:val="both"/>
         <w:rPr>
           <w:b/>
@@ -4466,6 +5047,7 @@
           <w:ilvl w:val="0"/>
           <w:numId w:val="23"/>
         </w:numPr>
+        <w:spacing w:line="360" w:lineRule="auto"/>
         <w:jc w:val="both"/>
         <w:rPr>
           <w:b/>
@@ -4486,6 +5068,7 @@
           <w:ilvl w:val="1"/>
           <w:numId w:val="23"/>
         </w:numPr>
+        <w:spacing w:line="360" w:lineRule="auto"/>
         <w:jc w:val="both"/>
       </w:pPr>
       <w:proofErr w:type="spellStart"/>
@@ -4503,6 +5086,7 @@
           <w:ilvl w:val="1"/>
           <w:numId w:val="23"/>
         </w:numPr>
+        <w:spacing w:line="360" w:lineRule="auto"/>
         <w:jc w:val="both"/>
       </w:pPr>
       <w:proofErr w:type="spellStart"/>
@@ -4520,6 +5104,7 @@
           <w:ilvl w:val="0"/>
           <w:numId w:val="23"/>
         </w:numPr>
+        <w:spacing w:line="360" w:lineRule="auto"/>
         <w:jc w:val="both"/>
         <w:rPr>
           <w:b/>
@@ -4540,6 +5125,7 @@
           <w:ilvl w:val="1"/>
           <w:numId w:val="23"/>
         </w:numPr>
+        <w:spacing w:line="360" w:lineRule="auto"/>
         <w:jc w:val="both"/>
         <w:rPr>
           <w:b/>
@@ -4576,6 +5162,7 @@
           <w:ilvl w:val="1"/>
           <w:numId w:val="23"/>
         </w:numPr>
+        <w:spacing w:line="360" w:lineRule="auto"/>
         <w:jc w:val="both"/>
         <w:rPr>
           <w:b/>
@@ -4608,15 +5195,17 @@
     </w:p>
     <w:p>
       <w:pPr>
-        <w:jc w:val="both"/>
-        <w:rPr>
-          <w:b/>
-          <w:bCs/>
-        </w:rPr>
-      </w:pPr>
-    </w:p>
-    <w:p>
-      <w:pPr>
+        <w:spacing w:line="360" w:lineRule="auto"/>
+        <w:jc w:val="both"/>
+        <w:rPr>
+          <w:b/>
+          <w:bCs/>
+        </w:rPr>
+      </w:pPr>
+    </w:p>
+    <w:p>
+      <w:pPr>
+        <w:spacing w:line="360" w:lineRule="auto"/>
         <w:jc w:val="both"/>
         <w:rPr>
           <w:b/>
@@ -4633,9 +5222,11 @@
     </w:p>
     <w:p>
       <w:pPr>
-        <w:jc w:val="both"/>
-      </w:pPr>
-      <w:r>
+        <w:spacing w:line="360" w:lineRule="auto"/>
+        <w:jc w:val="both"/>
+      </w:pPr>
+      <w:r>
+        <w:lastRenderedPageBreak/>
         <w:t>Los niños son los participantes del campamento y están organizados en grupos.</w:t>
       </w:r>
     </w:p>
@@ -4645,6 +5236,7 @@
           <w:ilvl w:val="0"/>
           <w:numId w:val="24"/>
         </w:numPr>
+        <w:spacing w:line="360" w:lineRule="auto"/>
         <w:jc w:val="both"/>
         <w:rPr>
           <w:b/>
@@ -4668,6 +5260,7 @@
           <w:ilvl w:val="0"/>
           <w:numId w:val="24"/>
         </w:numPr>
+        <w:spacing w:line="360" w:lineRule="auto"/>
         <w:jc w:val="both"/>
         <w:rPr>
           <w:b/>
@@ -4688,6 +5281,7 @@
           <w:ilvl w:val="1"/>
           <w:numId w:val="24"/>
         </w:numPr>
+        <w:spacing w:line="360" w:lineRule="auto"/>
         <w:jc w:val="both"/>
       </w:pPr>
       <w:proofErr w:type="spellStart"/>
@@ -4705,6 +5299,7 @@
           <w:ilvl w:val="0"/>
           <w:numId w:val="24"/>
         </w:numPr>
+        <w:spacing w:line="360" w:lineRule="auto"/>
         <w:jc w:val="both"/>
         <w:rPr>
           <w:b/>
@@ -4725,6 +5320,7 @@
           <w:ilvl w:val="1"/>
           <w:numId w:val="24"/>
         </w:numPr>
+        <w:spacing w:line="360" w:lineRule="auto"/>
         <w:jc w:val="both"/>
         <w:rPr>
           <w:b/>
@@ -4769,6 +5365,7 @@
     </w:p>
     <w:p>
       <w:pPr>
+        <w:spacing w:line="360" w:lineRule="auto"/>
         <w:jc w:val="both"/>
         <w:rPr>
           <w:b/>
@@ -4785,6 +5382,7 @@
     </w:p>
     <w:p>
       <w:pPr>
+        <w:spacing w:line="360" w:lineRule="auto"/>
         <w:jc w:val="both"/>
       </w:pPr>
       <w:r>
@@ -4797,6 +5395,7 @@
           <w:ilvl w:val="0"/>
           <w:numId w:val="25"/>
         </w:numPr>
+        <w:spacing w:line="360" w:lineRule="auto"/>
         <w:jc w:val="both"/>
         <w:rPr>
           <w:b/>
@@ -4820,6 +5419,7 @@
           <w:ilvl w:val="0"/>
           <w:numId w:val="25"/>
         </w:numPr>
+        <w:spacing w:line="360" w:lineRule="auto"/>
         <w:jc w:val="both"/>
         <w:rPr>
           <w:b/>
@@ -4840,6 +5440,7 @@
           <w:ilvl w:val="1"/>
           <w:numId w:val="25"/>
         </w:numPr>
+        <w:spacing w:line="360" w:lineRule="auto"/>
         <w:jc w:val="both"/>
       </w:pPr>
       <w:proofErr w:type="spellStart"/>
@@ -4857,6 +5458,7 @@
           <w:ilvl w:val="1"/>
           <w:numId w:val="25"/>
         </w:numPr>
+        <w:spacing w:line="360" w:lineRule="auto"/>
         <w:jc w:val="both"/>
       </w:pPr>
       <w:proofErr w:type="spellStart"/>
@@ -4874,6 +5476,7 @@
           <w:ilvl w:val="1"/>
           <w:numId w:val="25"/>
         </w:numPr>
+        <w:spacing w:line="360" w:lineRule="auto"/>
         <w:jc w:val="both"/>
       </w:pPr>
       <w:proofErr w:type="spellStart"/>
@@ -4891,6 +5494,7 @@
           <w:ilvl w:val="0"/>
           <w:numId w:val="25"/>
         </w:numPr>
+        <w:spacing w:line="360" w:lineRule="auto"/>
         <w:jc w:val="both"/>
         <w:rPr>
           <w:b/>
@@ -4911,6 +5515,7 @@
           <w:ilvl w:val="1"/>
           <w:numId w:val="25"/>
         </w:numPr>
+        <w:spacing w:line="360" w:lineRule="auto"/>
         <w:jc w:val="both"/>
         <w:rPr>
           <w:b/>
@@ -4957,6 +5562,7 @@
           <w:ilvl w:val="1"/>
           <w:numId w:val="25"/>
         </w:numPr>
+        <w:spacing w:line="360" w:lineRule="auto"/>
         <w:jc w:val="both"/>
         <w:rPr>
           <w:b/>
@@ -5003,14 +5609,14 @@
           <w:ilvl w:val="1"/>
           <w:numId w:val="25"/>
         </w:numPr>
-        <w:jc w:val="both"/>
-        <w:rPr>
-          <w:b/>
-          <w:bCs/>
-        </w:rPr>
-      </w:pPr>
-      <w:r>
-        <w:lastRenderedPageBreak/>
+        <w:spacing w:line="360" w:lineRule="auto"/>
+        <w:jc w:val="both"/>
+        <w:rPr>
+          <w:b/>
+          <w:bCs/>
+        </w:rPr>
+      </w:pPr>
+      <w:r>
         <w:t xml:space="preserve">Un administrador </w:t>
       </w:r>
       <w:r>
@@ -5048,6 +5654,7 @@
     </w:p>
     <w:p>
       <w:pPr>
+        <w:spacing w:line="360" w:lineRule="auto"/>
         <w:ind w:left="1440"/>
         <w:jc w:val="both"/>
         <w:rPr>
@@ -5058,6 +5665,7 @@
     </w:p>
     <w:p>
       <w:pPr>
+        <w:spacing w:line="360" w:lineRule="auto"/>
         <w:jc w:val="both"/>
         <w:rPr>
           <w:b/>
@@ -5074,6 +5682,7 @@
     </w:p>
     <w:p>
       <w:pPr>
+        <w:spacing w:line="360" w:lineRule="auto"/>
         <w:jc w:val="both"/>
       </w:pPr>
       <w:r>
@@ -5086,6 +5695,7 @@
           <w:ilvl w:val="0"/>
           <w:numId w:val="26"/>
         </w:numPr>
+        <w:spacing w:line="360" w:lineRule="auto"/>
         <w:jc w:val="both"/>
         <w:rPr>
           <w:b/>
@@ -5109,6 +5719,7 @@
           <w:ilvl w:val="0"/>
           <w:numId w:val="26"/>
         </w:numPr>
+        <w:spacing w:line="360" w:lineRule="auto"/>
         <w:jc w:val="both"/>
         <w:rPr>
           <w:b/>
@@ -5129,10 +5740,12 @@
           <w:ilvl w:val="1"/>
           <w:numId w:val="26"/>
         </w:numPr>
+        <w:spacing w:line="360" w:lineRule="auto"/>
         <w:jc w:val="both"/>
       </w:pPr>
       <w:proofErr w:type="spellStart"/>
       <w:r>
+        <w:lastRenderedPageBreak/>
         <w:t>tutor_id</w:t>
       </w:r>
       <w:proofErr w:type="spellEnd"/>
@@ -5146,6 +5759,7 @@
           <w:ilvl w:val="1"/>
           <w:numId w:val="26"/>
         </w:numPr>
+        <w:spacing w:line="360" w:lineRule="auto"/>
         <w:jc w:val="both"/>
       </w:pPr>
       <w:proofErr w:type="spellStart"/>
@@ -5163,6 +5777,7 @@
           <w:ilvl w:val="0"/>
           <w:numId w:val="26"/>
         </w:numPr>
+        <w:spacing w:line="360" w:lineRule="auto"/>
         <w:jc w:val="both"/>
         <w:rPr>
           <w:b/>
@@ -5183,6 +5798,7 @@
           <w:ilvl w:val="1"/>
           <w:numId w:val="26"/>
         </w:numPr>
+        <w:spacing w:line="360" w:lineRule="auto"/>
         <w:jc w:val="both"/>
       </w:pPr>
       <w:r>
@@ -5227,6 +5843,7 @@
           <w:ilvl w:val="1"/>
           <w:numId w:val="26"/>
         </w:numPr>
+        <w:spacing w:line="360" w:lineRule="auto"/>
         <w:jc w:val="both"/>
         <w:rPr>
           <w:b/>
@@ -5271,11 +5888,13 @@
     </w:p>
     <w:p>
       <w:pPr>
-        <w:jc w:val="both"/>
-      </w:pPr>
-    </w:p>
-    <w:p>
-      <w:pPr>
+        <w:spacing w:line="360" w:lineRule="auto"/>
+        <w:jc w:val="both"/>
+      </w:pPr>
+    </w:p>
+    <w:p>
+      <w:pPr>
+        <w:spacing w:line="360" w:lineRule="auto"/>
         <w:jc w:val="both"/>
         <w:rPr>
           <w:b/>
@@ -5292,6 +5911,7 @@
     </w:p>
     <w:p>
       <w:pPr>
+        <w:spacing w:line="360" w:lineRule="auto"/>
         <w:jc w:val="both"/>
       </w:pPr>
       <w:r>
@@ -5304,6 +5924,7 @@
           <w:ilvl w:val="0"/>
           <w:numId w:val="27"/>
         </w:numPr>
+        <w:spacing w:line="360" w:lineRule="auto"/>
         <w:jc w:val="both"/>
         <w:rPr>
           <w:b/>
@@ -5327,6 +5948,7 @@
           <w:ilvl w:val="0"/>
           <w:numId w:val="27"/>
         </w:numPr>
+        <w:spacing w:line="360" w:lineRule="auto"/>
         <w:jc w:val="both"/>
         <w:rPr>
           <w:b/>
@@ -5347,6 +5969,7 @@
           <w:ilvl w:val="1"/>
           <w:numId w:val="27"/>
         </w:numPr>
+        <w:spacing w:line="360" w:lineRule="auto"/>
         <w:jc w:val="both"/>
         <w:rPr>
           <w:b/>
@@ -5395,6 +6018,7 @@
           <w:ilvl w:val="1"/>
           <w:numId w:val="27"/>
         </w:numPr>
+        <w:spacing w:line="360" w:lineRule="auto"/>
         <w:jc w:val="both"/>
       </w:pPr>
       <w:r>
@@ -5429,6 +6053,7 @@
           <w:ilvl w:val="1"/>
           <w:numId w:val="27"/>
         </w:numPr>
+        <w:spacing w:line="360" w:lineRule="auto"/>
         <w:jc w:val="both"/>
         <w:rPr>
           <w:b/>
@@ -5473,6 +6098,7 @@
     </w:p>
     <w:p>
       <w:pPr>
+        <w:spacing w:line="360" w:lineRule="auto"/>
         <w:jc w:val="both"/>
         <w:rPr>
           <w:b/>
@@ -5489,6 +6115,7 @@
     </w:p>
     <w:p>
       <w:pPr>
+        <w:spacing w:line="360" w:lineRule="auto"/>
         <w:jc w:val="both"/>
       </w:pPr>
       <w:r>
@@ -5501,6 +6128,7 @@
           <w:ilvl w:val="0"/>
           <w:numId w:val="28"/>
         </w:numPr>
+        <w:spacing w:line="360" w:lineRule="auto"/>
         <w:jc w:val="both"/>
         <w:rPr>
           <w:b/>
@@ -5524,6 +6152,7 @@
           <w:ilvl w:val="0"/>
           <w:numId w:val="28"/>
         </w:numPr>
+        <w:spacing w:line="360" w:lineRule="auto"/>
         <w:jc w:val="both"/>
         <w:rPr>
           <w:b/>
@@ -5544,6 +6173,7 @@
           <w:ilvl w:val="1"/>
           <w:numId w:val="28"/>
         </w:numPr>
+        <w:spacing w:line="360" w:lineRule="auto"/>
         <w:jc w:val="both"/>
       </w:pPr>
       <w:proofErr w:type="spellStart"/>
@@ -5561,6 +6191,7 @@
           <w:ilvl w:val="0"/>
           <w:numId w:val="28"/>
         </w:numPr>
+        <w:spacing w:line="360" w:lineRule="auto"/>
         <w:jc w:val="both"/>
         <w:rPr>
           <w:b/>
@@ -5581,6 +6212,7 @@
           <w:ilvl w:val="1"/>
           <w:numId w:val="28"/>
         </w:numPr>
+        <w:spacing w:line="360" w:lineRule="auto"/>
         <w:jc w:val="both"/>
         <w:rPr>
           <w:b/>
@@ -5619,6 +6251,7 @@
           <w:ilvl w:val="1"/>
           <w:numId w:val="28"/>
         </w:numPr>
+        <w:spacing w:line="360" w:lineRule="auto"/>
         <w:jc w:val="both"/>
         <w:rPr>
           <w:b/>
@@ -5662,11 +6295,13 @@
     </w:p>
     <w:p>
       <w:pPr>
-        <w:jc w:val="both"/>
-      </w:pPr>
-    </w:p>
-    <w:p>
-      <w:pPr>
+        <w:spacing w:line="360" w:lineRule="auto"/>
+        <w:jc w:val="both"/>
+      </w:pPr>
+    </w:p>
+    <w:p>
+      <w:pPr>
+        <w:spacing w:line="360" w:lineRule="auto"/>
         <w:jc w:val="both"/>
         <w:rPr>
           <w:b/>
@@ -5683,6 +6318,7 @@
     </w:p>
     <w:p>
       <w:pPr>
+        <w:spacing w:line="360" w:lineRule="auto"/>
         <w:jc w:val="both"/>
       </w:pPr>
       <w:r>
@@ -5695,6 +6331,7 @@
           <w:ilvl w:val="0"/>
           <w:numId w:val="29"/>
         </w:numPr>
+        <w:spacing w:line="360" w:lineRule="auto"/>
         <w:jc w:val="both"/>
         <w:rPr>
           <w:b/>
@@ -5718,6 +6355,7 @@
           <w:ilvl w:val="0"/>
           <w:numId w:val="29"/>
         </w:numPr>
+        <w:spacing w:line="360" w:lineRule="auto"/>
         <w:jc w:val="both"/>
         <w:rPr>
           <w:b/>
@@ -5738,6 +6376,7 @@
           <w:ilvl w:val="1"/>
           <w:numId w:val="29"/>
         </w:numPr>
+        <w:spacing w:line="360" w:lineRule="auto"/>
         <w:jc w:val="both"/>
       </w:pPr>
       <w:proofErr w:type="spellStart"/>
@@ -5755,6 +6394,7 @@
           <w:ilvl w:val="0"/>
           <w:numId w:val="29"/>
         </w:numPr>
+        <w:spacing w:line="360" w:lineRule="auto"/>
         <w:jc w:val="both"/>
         <w:rPr>
           <w:b/>
@@ -5775,6 +6415,7 @@
           <w:ilvl w:val="1"/>
           <w:numId w:val="29"/>
         </w:numPr>
+        <w:spacing w:line="360" w:lineRule="auto"/>
         <w:jc w:val="both"/>
         <w:rPr>
           <w:b/>
@@ -5811,6 +6452,7 @@
           <w:ilvl w:val="1"/>
           <w:numId w:val="29"/>
         </w:numPr>
+        <w:spacing w:line="360" w:lineRule="auto"/>
         <w:jc w:val="both"/>
         <w:rPr>
           <w:b/>
@@ -5853,11 +6495,13 @@
     </w:p>
     <w:p>
       <w:pPr>
-        <w:jc w:val="both"/>
-      </w:pPr>
-    </w:p>
-    <w:p>
-      <w:pPr>
+        <w:spacing w:line="360" w:lineRule="auto"/>
+        <w:jc w:val="both"/>
+      </w:pPr>
+    </w:p>
+    <w:p>
+      <w:pPr>
+        <w:spacing w:line="360" w:lineRule="auto"/>
         <w:jc w:val="both"/>
       </w:pPr>
       <w:r>
@@ -5870,6 +6514,7 @@
     </w:p>
     <w:p>
       <w:pPr>
+        <w:spacing w:line="360" w:lineRule="auto"/>
         <w:jc w:val="both"/>
       </w:pPr>
       <w:r>
@@ -5892,6 +6537,7 @@
           <w:ilvl w:val="0"/>
           <w:numId w:val="30"/>
         </w:numPr>
+        <w:spacing w:line="360" w:lineRule="auto"/>
         <w:jc w:val="both"/>
       </w:pPr>
       <w:r>
@@ -5911,6 +6557,7 @@
           <w:ilvl w:val="0"/>
           <w:numId w:val="30"/>
         </w:numPr>
+        <w:spacing w:line="360" w:lineRule="auto"/>
         <w:jc w:val="both"/>
       </w:pPr>
       <w:r>
@@ -5927,6 +6574,7 @@
           <w:ilvl w:val="1"/>
           <w:numId w:val="30"/>
         </w:numPr>
+        <w:spacing w:line="360" w:lineRule="auto"/>
         <w:jc w:val="both"/>
       </w:pPr>
       <w:r>
@@ -5949,6 +6597,7 @@
           <w:ilvl w:val="1"/>
           <w:numId w:val="30"/>
         </w:numPr>
+        <w:spacing w:line="360" w:lineRule="auto"/>
         <w:jc w:val="both"/>
       </w:pPr>
       <w:r>
@@ -5967,6 +6616,7 @@
     </w:p>
     <w:p>
       <w:pPr>
+        <w:spacing w:line="360" w:lineRule="auto"/>
         <w:jc w:val="both"/>
       </w:pPr>
       <w:r>
@@ -5979,6 +6629,7 @@
     </w:p>
     <w:p>
       <w:pPr>
+        <w:spacing w:line="360" w:lineRule="auto"/>
         <w:jc w:val="both"/>
       </w:pPr>
       <w:r>
@@ -5997,6 +6648,7 @@
     </w:p>
     <w:p>
       <w:pPr>
+        <w:spacing w:line="360" w:lineRule="auto"/>
         <w:jc w:val="both"/>
         <w:rPr>
           <w:b/>
@@ -6013,6 +6665,7 @@
     </w:p>
     <w:p>
       <w:pPr>
+        <w:spacing w:line="360" w:lineRule="auto"/>
         <w:jc w:val="both"/>
       </w:pPr>
       <w:r>
@@ -6025,13 +6678,15 @@
           <w:ilvl w:val="0"/>
           <w:numId w:val="31"/>
         </w:numPr>
-        <w:jc w:val="both"/>
-      </w:pPr>
-      <w:r>
-        <w:rPr>
-          <w:b/>
-          <w:bCs/>
-        </w:rPr>
+        <w:spacing w:line="360" w:lineRule="auto"/>
+        <w:jc w:val="both"/>
+      </w:pPr>
+      <w:r>
+        <w:rPr>
+          <w:b/>
+          <w:bCs/>
+        </w:rPr>
+        <w:lastRenderedPageBreak/>
         <w:t>Claves primarias y foráneas:</w:t>
       </w:r>
     </w:p>
@@ -6041,6 +6696,7 @@
           <w:ilvl w:val="1"/>
           <w:numId w:val="31"/>
         </w:numPr>
+        <w:spacing w:line="360" w:lineRule="auto"/>
         <w:jc w:val="both"/>
       </w:pPr>
       <w:proofErr w:type="spellStart"/>
@@ -6068,6 +6724,7 @@
           <w:ilvl w:val="1"/>
           <w:numId w:val="31"/>
         </w:numPr>
+        <w:spacing w:line="360" w:lineRule="auto"/>
         <w:jc w:val="both"/>
       </w:pPr>
       <w:proofErr w:type="spellStart"/>
@@ -6091,38 +6748,42 @@
     </w:p>
     <w:p>
       <w:pPr>
-        <w:jc w:val="both"/>
-      </w:pPr>
-    </w:p>
-    <w:p>
-      <w:pPr>
-        <w:jc w:val="both"/>
-      </w:pPr>
-    </w:p>
-    <w:p>
-      <w:pPr>
-        <w:jc w:val="both"/>
-      </w:pPr>
-    </w:p>
-    <w:p>
-      <w:pPr>
-        <w:jc w:val="both"/>
-        <w:rPr>
-          <w:b/>
-          <w:bCs/>
-        </w:rPr>
-      </w:pPr>
-      <w:r>
-        <w:rPr>
-          <w:b/>
-          <w:bCs/>
-        </w:rPr>
-        <w:lastRenderedPageBreak/>
+        <w:spacing w:line="360" w:lineRule="auto"/>
+        <w:jc w:val="both"/>
+      </w:pPr>
+    </w:p>
+    <w:p>
+      <w:pPr>
+        <w:spacing w:line="360" w:lineRule="auto"/>
+        <w:jc w:val="both"/>
+      </w:pPr>
+    </w:p>
+    <w:p>
+      <w:pPr>
+        <w:spacing w:line="360" w:lineRule="auto"/>
+        <w:jc w:val="both"/>
+      </w:pPr>
+    </w:p>
+    <w:p>
+      <w:pPr>
+        <w:spacing w:line="360" w:lineRule="auto"/>
+        <w:jc w:val="both"/>
+        <w:rPr>
+          <w:b/>
+          <w:bCs/>
+        </w:rPr>
+      </w:pPr>
+      <w:r>
+        <w:rPr>
+          <w:b/>
+          <w:bCs/>
+        </w:rPr>
         <w:t>Actividad-Cronograma</w:t>
       </w:r>
     </w:p>
     <w:p>
       <w:pPr>
+        <w:spacing w:line="360" w:lineRule="auto"/>
         <w:jc w:val="both"/>
       </w:pPr>
       <w:r>
@@ -6135,6 +6796,7 @@
           <w:ilvl w:val="0"/>
           <w:numId w:val="32"/>
         </w:numPr>
+        <w:spacing w:line="360" w:lineRule="auto"/>
         <w:jc w:val="both"/>
       </w:pPr>
       <w:r>
@@ -6151,6 +6813,7 @@
           <w:ilvl w:val="1"/>
           <w:numId w:val="32"/>
         </w:numPr>
+        <w:spacing w:line="360" w:lineRule="auto"/>
         <w:jc w:val="both"/>
       </w:pPr>
       <w:proofErr w:type="spellStart"/>
@@ -6178,6 +6841,7 @@
           <w:ilvl w:val="1"/>
           <w:numId w:val="32"/>
         </w:numPr>
+        <w:spacing w:line="360" w:lineRule="auto"/>
         <w:jc w:val="both"/>
       </w:pPr>
       <w:proofErr w:type="spellStart"/>
@@ -6201,6 +6865,7 @@
     </w:p>
     <w:p>
       <w:pPr>
+        <w:spacing w:line="360" w:lineRule="auto"/>
         <w:jc w:val="both"/>
       </w:pPr>
       <w:r>
@@ -6208,6 +6873,10 @@
       </w:r>
     </w:p>
     <w:p>
+      <w:pPr>
+        <w:spacing w:line="360" w:lineRule="auto"/>
+        <w:jc w:val="both"/>
+      </w:pPr>
       <w:r>
         <w:rPr>
           <w:rFonts w:asciiTheme="majorHAnsi" w:eastAsiaTheme="majorEastAsia" w:hAnsiTheme="majorHAnsi" w:cstheme="majorBidi"/>
@@ -6267,11 +6936,28 @@
         </w:drawing>
       </w:r>
     </w:p>
-    <w:p/>
-    <w:p/>
-    <w:p/>
-    <w:p>
-      <w:pPr>
+    <w:p>
+      <w:pPr>
+        <w:spacing w:line="360" w:lineRule="auto"/>
+        <w:jc w:val="both"/>
+      </w:pPr>
+    </w:p>
+    <w:p>
+      <w:pPr>
+        <w:spacing w:line="360" w:lineRule="auto"/>
+        <w:jc w:val="both"/>
+      </w:pPr>
+    </w:p>
+    <w:p>
+      <w:pPr>
+        <w:spacing w:line="360" w:lineRule="auto"/>
+        <w:jc w:val="both"/>
+      </w:pPr>
+    </w:p>
+    <w:p>
+      <w:pPr>
+        <w:spacing w:line="360" w:lineRule="auto"/>
+        <w:jc w:val="both"/>
         <w:rPr>
           <w:b/>
           <w:bCs/>
@@ -6292,6 +6978,8 @@
           <w:ilvl w:val="0"/>
           <w:numId w:val="33"/>
         </w:numPr>
+        <w:spacing w:line="360" w:lineRule="auto"/>
+        <w:jc w:val="both"/>
       </w:pPr>
       <w:r>
         <w:rPr>
@@ -6317,6 +7005,8 @@
           <w:ilvl w:val="0"/>
           <w:numId w:val="33"/>
         </w:numPr>
+        <w:spacing w:line="360" w:lineRule="auto"/>
+        <w:jc w:val="both"/>
       </w:pPr>
       <w:r>
         <w:rPr>
@@ -6371,6 +7061,8 @@
     </w:p>
     <w:p>
       <w:pPr>
+        <w:spacing w:line="360" w:lineRule="auto"/>
+        <w:jc w:val="both"/>
         <w:rPr>
           <w:b/>
           <w:bCs/>
@@ -6390,6 +7082,8 @@
           <w:ilvl w:val="0"/>
           <w:numId w:val="34"/>
         </w:numPr>
+        <w:spacing w:line="360" w:lineRule="auto"/>
+        <w:jc w:val="both"/>
       </w:pPr>
       <w:r>
         <w:rPr>
@@ -6415,6 +7109,8 @@
           <w:ilvl w:val="0"/>
           <w:numId w:val="34"/>
         </w:numPr>
+        <w:spacing w:line="360" w:lineRule="auto"/>
+        <w:jc w:val="both"/>
       </w:pPr>
       <w:r>
         <w:rPr>
@@ -6447,9 +7143,16 @@
         <w:t>. La inscripción no puede existir sin el tutor que la realiza, por lo que la inscripción depende completamente de la existencia del tutor.</w:t>
       </w:r>
     </w:p>
-    <w:p/>
-    <w:p>
-      <w:pPr>
+    <w:p>
+      <w:pPr>
+        <w:spacing w:line="360" w:lineRule="auto"/>
+        <w:jc w:val="both"/>
+      </w:pPr>
+    </w:p>
+    <w:p>
+      <w:pPr>
+        <w:spacing w:line="360" w:lineRule="auto"/>
+        <w:jc w:val="both"/>
         <w:rPr>
           <w:b/>
           <w:bCs/>
@@ -6469,6 +7172,8 @@
           <w:ilvl w:val="0"/>
           <w:numId w:val="35"/>
         </w:numPr>
+        <w:spacing w:line="360" w:lineRule="auto"/>
+        <w:jc w:val="both"/>
       </w:pPr>
       <w:r>
         <w:rPr>
@@ -6494,6 +7199,8 @@
           <w:ilvl w:val="0"/>
           <w:numId w:val="35"/>
         </w:numPr>
+        <w:spacing w:line="360" w:lineRule="auto"/>
+        <w:jc w:val="both"/>
       </w:pPr>
       <w:r>
         <w:rPr>
@@ -6538,6 +7245,8 @@
     </w:p>
     <w:p>
       <w:pPr>
+        <w:spacing w:line="360" w:lineRule="auto"/>
+        <w:jc w:val="both"/>
         <w:rPr>
           <w:b/>
           <w:bCs/>
@@ -6557,6 +7266,8 @@
           <w:ilvl w:val="0"/>
           <w:numId w:val="36"/>
         </w:numPr>
+        <w:spacing w:line="360" w:lineRule="auto"/>
+        <w:jc w:val="both"/>
       </w:pPr>
       <w:r>
         <w:rPr>
@@ -6582,6 +7293,8 @@
           <w:ilvl w:val="0"/>
           <w:numId w:val="36"/>
         </w:numPr>
+        <w:spacing w:line="360" w:lineRule="auto"/>
+        <w:jc w:val="both"/>
       </w:pPr>
       <w:r>
         <w:rPr>
@@ -6616,6 +7329,8 @@
     </w:p>
     <w:p>
       <w:pPr>
+        <w:spacing w:line="360" w:lineRule="auto"/>
+        <w:jc w:val="both"/>
         <w:rPr>
           <w:b/>
           <w:bCs/>
@@ -6635,6 +7350,8 @@
           <w:ilvl w:val="0"/>
           <w:numId w:val="37"/>
         </w:numPr>
+        <w:spacing w:line="360" w:lineRule="auto"/>
+        <w:jc w:val="both"/>
       </w:pPr>
       <w:r>
         <w:rPr>
@@ -6660,6 +7377,8 @@
           <w:ilvl w:val="0"/>
           <w:numId w:val="37"/>
         </w:numPr>
+        <w:spacing w:line="360" w:lineRule="auto"/>
+        <w:jc w:val="both"/>
       </w:pPr>
       <w:r>
         <w:rPr>
@@ -6707,16 +7426,19 @@
     </w:p>
     <w:p>
       <w:pPr>
-        <w:rPr>
-          <w:b/>
-          <w:bCs/>
-        </w:rPr>
-      </w:pPr>
-      <w:r>
-        <w:rPr>
-          <w:b/>
-          <w:bCs/>
-        </w:rPr>
+        <w:spacing w:line="360" w:lineRule="auto"/>
+        <w:jc w:val="both"/>
+        <w:rPr>
+          <w:b/>
+          <w:bCs/>
+        </w:rPr>
+      </w:pPr>
+      <w:r>
+        <w:rPr>
+          <w:b/>
+          <w:bCs/>
+        </w:rPr>
+        <w:lastRenderedPageBreak/>
         <w:t>Inscripción / Pago</w:t>
       </w:r>
     </w:p>
@@ -6726,6 +7448,8 @@
           <w:ilvl w:val="0"/>
           <w:numId w:val="38"/>
         </w:numPr>
+        <w:spacing w:line="360" w:lineRule="auto"/>
+        <w:jc w:val="both"/>
       </w:pPr>
       <w:r>
         <w:rPr>
@@ -6751,6 +7475,8 @@
           <w:ilvl w:val="0"/>
           <w:numId w:val="38"/>
         </w:numPr>
+        <w:spacing w:line="360" w:lineRule="auto"/>
+        <w:jc w:val="both"/>
       </w:pPr>
       <w:r>
         <w:rPr>
@@ -6816,22 +7542,38 @@
         <w:t>.</w:t>
       </w:r>
     </w:p>
-    <w:p/>
-    <w:p/>
-    <w:p/>
-    <w:p>
-      <w:pPr>
-        <w:rPr>
-          <w:b/>
-          <w:bCs/>
-        </w:rPr>
-      </w:pPr>
-      <w:r>
-        <w:rPr>
-          <w:b/>
-          <w:bCs/>
-        </w:rPr>
-        <w:lastRenderedPageBreak/>
+    <w:p>
+      <w:pPr>
+        <w:spacing w:line="360" w:lineRule="auto"/>
+        <w:jc w:val="both"/>
+      </w:pPr>
+    </w:p>
+    <w:p>
+      <w:pPr>
+        <w:spacing w:line="360" w:lineRule="auto"/>
+        <w:jc w:val="both"/>
+      </w:pPr>
+    </w:p>
+    <w:p>
+      <w:pPr>
+        <w:spacing w:line="360" w:lineRule="auto"/>
+        <w:jc w:val="both"/>
+      </w:pPr>
+    </w:p>
+    <w:p>
+      <w:pPr>
+        <w:spacing w:line="360" w:lineRule="auto"/>
+        <w:jc w:val="both"/>
+        <w:rPr>
+          <w:b/>
+          <w:bCs/>
+        </w:rPr>
+      </w:pPr>
+      <w:r>
+        <w:rPr>
+          <w:b/>
+          <w:bCs/>
+        </w:rPr>
         <w:t>Inscripción / Niño</w:t>
       </w:r>
     </w:p>
@@ -6841,6 +7583,8 @@
           <w:ilvl w:val="0"/>
           <w:numId w:val="39"/>
         </w:numPr>
+        <w:spacing w:line="360" w:lineRule="auto"/>
+        <w:jc w:val="both"/>
       </w:pPr>
       <w:r>
         <w:rPr>
@@ -6866,6 +7610,8 @@
           <w:ilvl w:val="0"/>
           <w:numId w:val="39"/>
         </w:numPr>
+        <w:spacing w:line="360" w:lineRule="auto"/>
+        <w:jc w:val="both"/>
       </w:pPr>
       <w:r>
         <w:rPr>
@@ -6900,6 +7646,8 @@
     </w:p>
     <w:p>
       <w:pPr>
+        <w:spacing w:line="360" w:lineRule="auto"/>
+        <w:jc w:val="both"/>
         <w:rPr>
           <w:b/>
           <w:bCs/>
@@ -6919,6 +7667,8 @@
           <w:ilvl w:val="0"/>
           <w:numId w:val="40"/>
         </w:numPr>
+        <w:spacing w:line="360" w:lineRule="auto"/>
+        <w:jc w:val="both"/>
       </w:pPr>
       <w:r>
         <w:rPr>
@@ -6944,6 +7694,8 @@
           <w:ilvl w:val="0"/>
           <w:numId w:val="40"/>
         </w:numPr>
+        <w:spacing w:line="360" w:lineRule="auto"/>
+        <w:jc w:val="both"/>
       </w:pPr>
       <w:r>
         <w:rPr>
@@ -6988,6 +7740,8 @@
     </w:p>
     <w:p>
       <w:pPr>
+        <w:spacing w:line="360" w:lineRule="auto"/>
+        <w:jc w:val="both"/>
         <w:rPr>
           <w:b/>
           <w:bCs/>
@@ -7021,6 +7775,8 @@
           <w:ilvl w:val="0"/>
           <w:numId w:val="41"/>
         </w:numPr>
+        <w:spacing w:line="360" w:lineRule="auto"/>
+        <w:jc w:val="both"/>
       </w:pPr>
       <w:r>
         <w:rPr>
@@ -7046,6 +7802,8 @@
           <w:ilvl w:val="0"/>
           <w:numId w:val="41"/>
         </w:numPr>
+        <w:spacing w:line="360" w:lineRule="auto"/>
+        <w:jc w:val="both"/>
       </w:pPr>
       <w:r>
         <w:rPr>
@@ -7108,6 +7866,8 @@
     </w:p>
     <w:p>
       <w:pPr>
+        <w:spacing w:line="360" w:lineRule="auto"/>
+        <w:jc w:val="both"/>
         <w:rPr>
           <w:b/>
           <w:bCs/>
@@ -7141,6 +7901,8 @@
           <w:ilvl w:val="0"/>
           <w:numId w:val="42"/>
         </w:numPr>
+        <w:spacing w:line="360" w:lineRule="auto"/>
+        <w:jc w:val="both"/>
       </w:pPr>
       <w:r>
         <w:rPr>
@@ -7166,6 +7928,8 @@
           <w:ilvl w:val="0"/>
           <w:numId w:val="42"/>
         </w:numPr>
+        <w:spacing w:line="360" w:lineRule="auto"/>
+        <w:jc w:val="both"/>
       </w:pPr>
       <w:r>
         <w:rPr>
@@ -7205,11 +7969,17 @@
         <w:t>grupo</w:t>
       </w:r>
       <w:r>
-        <w:t xml:space="preserve"> puede existir independientemente del administrador después de ser creado. El grupo depende del administrador para su creación, pero no necesariamente para seguir existiendo después.</w:t>
-      </w:r>
-    </w:p>
-    <w:p>
-      <w:pPr>
+        <w:t xml:space="preserve"> puede existir independientemente del administrador después de ser creado. El grupo </w:t>
+      </w:r>
+      <w:r>
+        <w:lastRenderedPageBreak/>
+        <w:t>depende del administrador para su creación, pero no necesariamente para seguir existiendo después.</w:t>
+      </w:r>
+    </w:p>
+    <w:p>
+      <w:pPr>
+        <w:spacing w:line="360" w:lineRule="auto"/>
+        <w:jc w:val="both"/>
         <w:rPr>
           <w:b/>
           <w:bCs/>
@@ -7229,6 +7999,8 @@
           <w:ilvl w:val="0"/>
           <w:numId w:val="43"/>
         </w:numPr>
+        <w:spacing w:line="360" w:lineRule="auto"/>
+        <w:jc w:val="both"/>
       </w:pPr>
       <w:r>
         <w:rPr>
@@ -7254,6 +8026,8 @@
           <w:ilvl w:val="0"/>
           <w:numId w:val="43"/>
         </w:numPr>
+        <w:spacing w:line="360" w:lineRule="auto"/>
+        <w:jc w:val="both"/>
       </w:pPr>
       <w:r>
         <w:rPr>
@@ -7288,6 +8062,8 @@
     </w:p>
     <w:p>
       <w:pPr>
+        <w:spacing w:line="360" w:lineRule="auto"/>
+        <w:jc w:val="both"/>
         <w:rPr>
           <w:b/>
           <w:bCs/>
@@ -7307,6 +8083,8 @@
           <w:ilvl w:val="0"/>
           <w:numId w:val="44"/>
         </w:numPr>
+        <w:spacing w:line="360" w:lineRule="auto"/>
+        <w:jc w:val="both"/>
       </w:pPr>
       <w:r>
         <w:rPr>
@@ -7332,6 +8110,8 @@
           <w:ilvl w:val="0"/>
           <w:numId w:val="44"/>
         </w:numPr>
+        <w:spacing w:line="360" w:lineRule="auto"/>
+        <w:jc w:val="both"/>
       </w:pPr>
       <w:r>
         <w:rPr>
@@ -7366,6 +8146,8 @@
     </w:p>
     <w:p>
       <w:pPr>
+        <w:spacing w:line="360" w:lineRule="auto"/>
+        <w:jc w:val="both"/>
         <w:rPr>
           <w:b/>
           <w:bCs/>
@@ -7385,6 +8167,8 @@
           <w:ilvl w:val="0"/>
           <w:numId w:val="45"/>
         </w:numPr>
+        <w:spacing w:line="360" w:lineRule="auto"/>
+        <w:jc w:val="both"/>
       </w:pPr>
       <w:r>
         <w:rPr>
@@ -7410,6 +8194,8 @@
           <w:ilvl w:val="0"/>
           <w:numId w:val="45"/>
         </w:numPr>
+        <w:spacing w:line="360" w:lineRule="auto"/>
+        <w:jc w:val="both"/>
       </w:pPr>
       <w:r>
         <w:rPr>
@@ -7456,17 +8242,18 @@
     </w:p>
     <w:p>
       <w:pPr>
-        <w:rPr>
-          <w:b/>
-          <w:bCs/>
-        </w:rPr>
-      </w:pPr>
-      <w:r>
-        <w:rPr>
-          <w:b/>
-          <w:bCs/>
-        </w:rPr>
-        <w:lastRenderedPageBreak/>
+        <w:spacing w:line="360" w:lineRule="auto"/>
+        <w:jc w:val="both"/>
+        <w:rPr>
+          <w:b/>
+          <w:bCs/>
+        </w:rPr>
+      </w:pPr>
+      <w:r>
+        <w:rPr>
+          <w:b/>
+          <w:bCs/>
+        </w:rPr>
         <w:t>Administrador / Cronograma</w:t>
       </w:r>
     </w:p>
@@ -7476,6 +8263,8 @@
           <w:ilvl w:val="0"/>
           <w:numId w:val="46"/>
         </w:numPr>
+        <w:spacing w:line="360" w:lineRule="auto"/>
+        <w:jc w:val="both"/>
       </w:pPr>
       <w:r>
         <w:rPr>
@@ -7501,6 +8290,8 @@
           <w:ilvl w:val="0"/>
           <w:numId w:val="46"/>
         </w:numPr>
+        <w:spacing w:line="360" w:lineRule="auto"/>
+        <w:jc w:val="both"/>
       </w:pPr>
       <w:r>
         <w:rPr>
@@ -7553,6 +8344,8 @@
     </w:p>
     <w:p>
       <w:pPr>
+        <w:spacing w:line="360" w:lineRule="auto"/>
+        <w:jc w:val="both"/>
         <w:rPr>
           <w:b/>
           <w:bCs/>
@@ -7572,6 +8365,8 @@
           <w:ilvl w:val="0"/>
           <w:numId w:val="47"/>
         </w:numPr>
+        <w:spacing w:line="360" w:lineRule="auto"/>
+        <w:jc w:val="both"/>
       </w:pPr>
       <w:r>
         <w:rPr>
@@ -7597,6 +8392,8 @@
           <w:ilvl w:val="0"/>
           <w:numId w:val="47"/>
         </w:numPr>
+        <w:spacing w:line="360" w:lineRule="auto"/>
+        <w:jc w:val="both"/>
       </w:pPr>
       <w:r>
         <w:rPr>
@@ -7634,16 +8431,19 @@
     </w:p>
     <w:p>
       <w:pPr>
-        <w:rPr>
-          <w:b/>
-          <w:bCs/>
-        </w:rPr>
-      </w:pPr>
-      <w:r>
-        <w:rPr>
-          <w:b/>
-          <w:bCs/>
-        </w:rPr>
+        <w:spacing w:line="360" w:lineRule="auto"/>
+        <w:jc w:val="both"/>
+        <w:rPr>
+          <w:b/>
+          <w:bCs/>
+        </w:rPr>
+      </w:pPr>
+      <w:r>
+        <w:rPr>
+          <w:b/>
+          <w:bCs/>
+        </w:rPr>
+        <w:lastRenderedPageBreak/>
         <w:t>Actividad / Cronograma:</w:t>
       </w:r>
     </w:p>
@@ -7653,6 +8453,8 @@
           <w:ilvl w:val="0"/>
           <w:numId w:val="48"/>
         </w:numPr>
+        <w:spacing w:line="360" w:lineRule="auto"/>
+        <w:jc w:val="both"/>
         <w:rPr>
           <w:b/>
           <w:bCs/>
@@ -7672,6 +8474,8 @@
           <w:ilvl w:val="0"/>
           <w:numId w:val="48"/>
         </w:numPr>
+        <w:spacing w:line="360" w:lineRule="auto"/>
+        <w:jc w:val="both"/>
         <w:rPr>
           <w:b/>
           <w:bCs/>
@@ -7700,14 +8504,18 @@
     </w:p>
     <w:p>
       <w:pPr>
-        <w:rPr>
-          <w:b/>
-          <w:bCs/>
-        </w:rPr>
-      </w:pPr>
-    </w:p>
-    <w:p>
-      <w:pPr>
+        <w:spacing w:line="360" w:lineRule="auto"/>
+        <w:jc w:val="both"/>
+        <w:rPr>
+          <w:b/>
+          <w:bCs/>
+        </w:rPr>
+      </w:pPr>
+    </w:p>
+    <w:p>
+      <w:pPr>
+        <w:spacing w:line="360" w:lineRule="auto"/>
+        <w:jc w:val="both"/>
         <w:rPr>
           <w:rFonts w:cs="Times New Roman"/>
           <w:b/>
@@ -7729,14 +8537,18 @@
     </w:p>
     <w:p>
       <w:pPr>
-        <w:rPr>
-          <w:b/>
-          <w:bCs/>
-        </w:rPr>
-      </w:pPr>
-    </w:p>
-    <w:p>
-      <w:pPr>
+        <w:spacing w:line="360" w:lineRule="auto"/>
+        <w:jc w:val="both"/>
+        <w:rPr>
+          <w:b/>
+          <w:bCs/>
+        </w:rPr>
+      </w:pPr>
+    </w:p>
+    <w:p>
+      <w:pPr>
+        <w:spacing w:line="360" w:lineRule="auto"/>
+        <w:jc w:val="both"/>
         <w:rPr>
           <w:b/>
           <w:bCs/>
@@ -7751,77 +8563,120 @@
       </w:r>
     </w:p>
     <w:p>
-      <w:r>
-        <w:t xml:space="preserve">Para el sistema de diseño, hemos elegido colores azules que nos trasladan al azul del océano, un color que consideramos imprescindible para una temática pirata. En el home, hemos optado por poner un barco pirata surcando los mares, seguido de una estructura con un degradado que inicia en un azul suave y se va oscureciendo conforme haces </w:t>
+      <w:pPr>
+        <w:spacing w:line="360" w:lineRule="auto"/>
+        <w:jc w:val="both"/>
+      </w:pPr>
+    </w:p>
+    <w:p>
+      <w:pPr>
+        <w:spacing w:line="360" w:lineRule="auto"/>
+        <w:jc w:val="both"/>
+      </w:pPr>
+      <w:r>
+        <w:t>El diseño de la página web ha sido concebido para reforzar la temática pirata del campamento y proporcionar una navegación visualmente atractiva y fácil de usar. La elección de los colores predominantes se basa en tonos azules, evocando el mar y sumergiendo a los usuarios en una atmósfera que remite directamente a la aventura y exploración. La página de inicio presenta una imagen destacada de un barco pirata surcando los mares, estableciendo desde el primer momento la identidad visual del campamento. A medida que el usuario se desplaza por la página, se observa un degradado progresivo en el fondo, pasando de un azul claro a tonos más oscuros, simulando la profundidad del océano.</w:t>
+      </w:r>
+    </w:p>
+    <w:p>
+      <w:pPr>
+        <w:spacing w:line="360" w:lineRule="auto"/>
+        <w:jc w:val="both"/>
+      </w:pPr>
+    </w:p>
+    <w:p>
+      <w:pPr>
+        <w:spacing w:line="360" w:lineRule="auto"/>
+        <w:jc w:val="both"/>
+      </w:pPr>
+      <w:r>
+        <w:t xml:space="preserve">Las secciones principales de la web están diseñadas con coherencia visual, manteniendo la paleta de colores y la estética de degradado en todo el sitio. En el caso de las páginas de </w:t>
       </w:r>
       <w:proofErr w:type="spellStart"/>
       <w:r>
-        <w:t>scroll</w:t>
+        <w:t>login</w:t>
       </w:r>
       <w:proofErr w:type="spellEnd"/>
       <w:r>
-        <w:t xml:space="preserve"> vertical, tal y como lo hace el fondo oceánico.</w:t>
-      </w:r>
-    </w:p>
-    <w:p/>
-    <w:p>
-      <w:r>
-        <w:t xml:space="preserve">Hemos optado por el mismo azul suave para el apartado del </w:t>
-      </w:r>
-      <w:proofErr w:type="spellStart"/>
-      <w:r>
-        <w:t>login</w:t>
-      </w:r>
-      <w:proofErr w:type="spellEnd"/>
-      <w:r>
-        <w:t>, registro y las inscripciones. El resto de la web continúa con el degradado, tal y como se emplea en el home. De la misma forma, tenemos un apartado visual muy similar para la vista del monitor y la del administrador.</w:t>
-      </w:r>
-    </w:p>
-    <w:p/>
-    <w:p>
-      <w:r>
-        <w:t>La estructura de la web está dividida en tres partes. La primera sería la vista que puede tener cualquier usuario (especialmente orientada a tutores de los niños), que consta del home, el apartado de la inscripción del niño, la programación, donde se muestran algunas de las actividades que pueden realizar los niños en el campamento mediante un carrusel de imágenes, y el horario, con algunas de las actividades que se hacen a la semana.</w:t>
-      </w:r>
-    </w:p>
-    <w:p/>
-    <w:p>
-      <w:r>
-        <w:t>También cuenta con un apartado de tarifas del campamento, donde los usuarios pueden informarse acerca de las mismas según el horario que deseen. Además, contamos con un apartado "¿Quiénes somos?", donde se muestran la misión, visión y valores de nuestro campamento, así como una pequeña carta de presentación con información sobre nuestros monitores.</w:t>
-      </w:r>
-    </w:p>
-    <w:p/>
-    <w:p>
-      <w:r>
-        <w:t>Por último, en esta sección tenemos el apartado de preguntas frecuentes, donde los usuarios podrán ver algunas de las preguntas y respuestas más interesantes acerca del campamento o del propio funcionamiento de la web. Después, el usuario cuenta con un apartado de contacto, donde podrá llamar por teléfono o enviar un mail para consultar más información.</w:t>
-      </w:r>
-    </w:p>
-    <w:p/>
-    <w:p>
-      <w:r>
-        <w:t>En el lado del monitor, contamos con un apartado principal donde puede consultar las próximas actividades a realizar, así como los materiales que va a necesitar o la posibilidad de cambiar las actividades. También contará con una sección donde puede pasar lista para saber qué niños no han acudido ese día al campamento y poder llevar un buen control sobre el funcionamiento del campamento.</w:t>
-      </w:r>
-    </w:p>
-    <w:p/>
-    <w:p>
-      <w:r>
-        <w:t>Además, cuenta con un cronograma donde puede ver de una forma muy visual las actividades que se van a realizar, e incluso añadirlas o eliminarlas. Por último, tiene una sección con más información de su grupo de alumnos, donde puede consultar información sobre el contacto de los tutores de los niños de una forma muy sencilla, así como realizar anotaciones sobre los alumnos.</w:t>
-      </w:r>
-    </w:p>
-    <w:p/>
-    <w:p>
-      <w:r>
-        <w:t>En el lado del administrador, este podrá consultar las actividades tal y como lo hace el monitor, pero desde un punto de vista más logístico, ya que podrá ver también las últimas conexiones de los monitores, los pagos pendientes, actualizaciones de tarifas o incluso la posibilidad de realizar descuentos.</w:t>
-      </w:r>
-    </w:p>
-    <w:p/>
-    <w:p>
-      <w:r>
-        <w:t>Además, cuenta con una sección donde puede crear o eliminar monitores y grupos de alumnos, controlar las inscripciones y crear excursiones o actividades en el cronograma.</w:t>
-      </w:r>
-    </w:p>
-    <w:p/>
-    <w:p>
-      <w:pPr>
+        <w:t>, registro e inscripciones, se ha optado por un azul suave, lo que proporciona un contraste equilibrado con el fondo y facilita la lectura y usabilidad. Este mismo esquema se mantiene en la vista de los monitores y el administrador, asegurando una experiencia homogénea para todos los usuarios.</w:t>
+      </w:r>
+    </w:p>
+    <w:p>
+      <w:pPr>
+        <w:spacing w:line="360" w:lineRule="auto"/>
+        <w:jc w:val="both"/>
+      </w:pPr>
+    </w:p>
+    <w:p>
+      <w:pPr>
+        <w:spacing w:line="360" w:lineRule="auto"/>
+        <w:jc w:val="both"/>
+      </w:pPr>
+      <w:r>
+        <w:lastRenderedPageBreak/>
+        <w:t xml:space="preserve">La estructura de la web se divide en tres grandes bloques, cada uno adaptado a un tipo de usuario específico. La primera parte corresponde a la vista general accesible para cualquier visitante, principalmente orientada a los padres o tutores interesados en el campamento. En este espacio se encuentran </w:t>
+      </w:r>
+      <w:r>
+        <w:t>la página de inicio</w:t>
+      </w:r>
+      <w:r>
+        <w:t>, el apartado de inscripción, la sección de programación con un carrusel de imágenes sobre las actividades, y un horario detallado de las actividades semanales. También se incluye la página de tarifas, el apartado "¿Quiénes somos?" con información sobre la misión, visión y valores del campamento, así como una carta de presentación de los monitores. Además, hay una sección de preguntas frecuentes donde los usuarios pueden encontrar respuestas a dudas comunes sobre el campamento y el funcionamiento de la plataforma, junto con una página de contacto para consultas directas.</w:t>
+      </w:r>
+    </w:p>
+    <w:p>
+      <w:pPr>
+        <w:spacing w:line="360" w:lineRule="auto"/>
+        <w:jc w:val="both"/>
+      </w:pPr>
+    </w:p>
+    <w:p>
+      <w:pPr>
+        <w:spacing w:line="360" w:lineRule="auto"/>
+        <w:jc w:val="both"/>
+      </w:pPr>
+      <w:r>
+        <w:t>El segundo bloque está dedicado a los monitores, quienes cuentan con un panel específico donde pueden consultar y modificar las actividades diarias, registrar la asistencia de los niños y acceder a información detallada sobre los alumnos a su cargo. La interfaz para ellos está diseñada para ser clara y funcional, con accesos rápidos a las herramientas que necesitan en su día a día. Además, el cronograma de actividades está presentado de manera visual, permitiendo a los monitores gestionar y organizar las actividades de forma sencilla.</w:t>
+      </w:r>
+    </w:p>
+    <w:p>
+      <w:pPr>
+        <w:spacing w:line="360" w:lineRule="auto"/>
+        <w:jc w:val="both"/>
+      </w:pPr>
+    </w:p>
+    <w:p>
+      <w:pPr>
+        <w:spacing w:line="360" w:lineRule="auto"/>
+        <w:jc w:val="both"/>
+      </w:pPr>
+      <w:r>
+        <w:t>El tercer bloque corresponde a la vista del administrador, quien tiene un control completo sobre el sistema. Su panel le permite gestionar las actividades de los monitores, realizar modificaciones en la estructura del campamento, controlar los pagos y actualizar las tarifas. También tiene la capacidad de crear y eliminar monitores y grupos de alumnos, asegurando que la organización del campamento se mantenga eficiente en todo momento.</w:t>
+      </w:r>
+    </w:p>
+    <w:p>
+      <w:pPr>
+        <w:spacing w:line="360" w:lineRule="auto"/>
+        <w:jc w:val="both"/>
+      </w:pPr>
+    </w:p>
+    <w:p>
+      <w:pPr>
+        <w:spacing w:line="360" w:lineRule="auto"/>
+        <w:jc w:val="both"/>
+      </w:pPr>
+      <w:r>
+        <w:t>Gracias a este diseño estructurado y funcional, la página web del campamento no solo facilita la gestión interna, sino que también ofrece a los padres una experiencia intuitiva y atractiva, permitiendo que la inscripción y el seguimiento de la participación de sus hijos sea un proceso cómodo y accesible.</w:t>
+      </w:r>
+    </w:p>
+    <w:p>
+      <w:pPr>
+        <w:spacing w:line="360" w:lineRule="auto"/>
+        <w:jc w:val="both"/>
+      </w:pPr>
+    </w:p>
+    <w:p>
+      <w:pPr>
+        <w:spacing w:line="360" w:lineRule="auto"/>
+        <w:jc w:val="both"/>
         <w:rPr>
           <w:rFonts w:eastAsiaTheme="majorEastAsia" w:cs="Times New Roman"/>
           <w:b/>
@@ -7838,11 +8693,14 @@
           <w:sz w:val="28"/>
           <w:szCs w:val="28"/>
         </w:rPr>
+        <w:lastRenderedPageBreak/>
         <w:t>PLANIFICACIÓN DEL DESARROLLO</w:t>
       </w:r>
     </w:p>
     <w:p>
       <w:pPr>
+        <w:spacing w:line="360" w:lineRule="auto"/>
+        <w:jc w:val="both"/>
         <w:rPr>
           <w:rFonts w:asciiTheme="majorHAnsi" w:eastAsiaTheme="majorEastAsia" w:hAnsiTheme="majorHAnsi" w:cstheme="majorBidi"/>
           <w:color w:val="2F5496" w:themeColor="accent1" w:themeShade="BF"/>
@@ -7859,18 +8717,26 @@
       </w:r>
       <w:proofErr w:type="spellEnd"/>
       <w:r>
-        <w:t xml:space="preserve">, asegurando una comunicación fluida y un trabajo colaborativo eficiente. Al inicio de cada sesión, revisábamos los objetivos semanales, estableciendo las tareas a completar para cumplir con las entregas planificadas. Nos íbamos dividiendo el trabajo según las necesidades del proyecto, lo que nos permitía </w:t>
-      </w:r>
-      <w:r>
-        <w:lastRenderedPageBreak/>
-        <w:t>avanzar de manera estructurada y optimizada. Para gestionar el código de forma eficiente, hemos utilizado Git y GitHub, subiendo nuestros cambios y descargando los del resto del equipo. Hemos trabajado con diferentes ramas, lo que nos permitió desarrollar nuevas funcionalidades sin afectar la versión principal, facilitando la integración y evitando conflictos en el código.</w:t>
-      </w:r>
-    </w:p>
-    <w:p/>
-    <w:p/>
+        <w:t>, asegurando una comunicación fluida y un trabajo colaborativo eficiente. Al inicio de cada sesión, revisábamos los objetivos semanales, estableciendo las tareas a completar para cumplir con las entregas planificadas. Nos íbamos dividiendo el trabajo según las necesidades del proyecto, lo que nos permitía avanzar de manera estructurada y optimizada. Para gestionar el código de forma eficiente, hemos utilizado Git y GitHub, subiendo nuestros cambios y descargando los del resto del equipo. Hemos trabajado con diferentes ramas, lo que nos permitió desarrollar nuevas funcionalidades sin afectar la versión principal, facilitando la integración y evitando conflictos en el código.</w:t>
+      </w:r>
+    </w:p>
+    <w:p>
+      <w:pPr>
+        <w:spacing w:line="360" w:lineRule="auto"/>
+        <w:jc w:val="both"/>
+      </w:pPr>
+    </w:p>
+    <w:p>
+      <w:pPr>
+        <w:spacing w:line="360" w:lineRule="auto"/>
+        <w:jc w:val="both"/>
+      </w:pPr>
+    </w:p>
     <w:p>
       <w:pPr>
         <w:pStyle w:val="Ttulo1"/>
+        <w:spacing w:line="360" w:lineRule="auto"/>
+        <w:jc w:val="both"/>
         <w:rPr>
           <w:rFonts w:ascii="Times New Roman" w:hAnsi="Times New Roman" w:cs="Times New Roman"/>
           <w:b/>
@@ -7894,10 +8760,17 @@
       </w:r>
       <w:bookmarkEnd w:id="7"/>
     </w:p>
-    <w:p/>
+    <w:p>
+      <w:pPr>
+        <w:spacing w:line="360" w:lineRule="auto"/>
+        <w:jc w:val="both"/>
+      </w:pPr>
+    </w:p>
     <w:p>
       <w:pPr>
         <w:pStyle w:val="Ttulo1"/>
+        <w:spacing w:line="360" w:lineRule="auto"/>
+        <w:jc w:val="both"/>
         <w:rPr>
           <w:rFonts w:ascii="Times New Roman" w:hAnsi="Times New Roman" w:cs="Times New Roman"/>
           <w:b/>
@@ -7923,6 +8796,8 @@
     </w:p>
     <w:p>
       <w:pPr>
+        <w:spacing w:line="360" w:lineRule="auto"/>
+        <w:jc w:val="both"/>
         <w:rPr>
           <w:rFonts w:eastAsiaTheme="majorEastAsia" w:cs="Times New Roman"/>
           <w:b/>
@@ -7935,6 +8810,8 @@
     <w:p>
       <w:pPr>
         <w:pStyle w:val="Ttulo1"/>
+        <w:spacing w:line="360" w:lineRule="auto"/>
+        <w:jc w:val="both"/>
         <w:rPr>
           <w:rFonts w:ascii="Times New Roman" w:hAnsi="Times New Roman" w:cs="Times New Roman"/>
           <w:b/>
@@ -7960,6 +8837,8 @@
     </w:p>
     <w:p>
       <w:pPr>
+        <w:spacing w:line="360" w:lineRule="auto"/>
+        <w:jc w:val="both"/>
         <w:rPr>
           <w:sz w:val="28"/>
           <w:szCs w:val="24"/>
@@ -7968,6 +8847,10 @@
       </w:pPr>
     </w:p>
     <w:p>
+      <w:pPr>
+        <w:spacing w:line="360" w:lineRule="auto"/>
+        <w:jc w:val="both"/>
+      </w:pPr>
       <w:bookmarkStart w:id="10" w:name="_Toc188296911"/>
       <w:r>
         <w:t>DIAGRAMA ENTIDAD-RELACIÓN</w:t>
@@ -7976,6 +8859,7 @@
     </w:p>
     <w:p>
       <w:pPr>
+        <w:spacing w:line="360" w:lineRule="auto"/>
         <w:jc w:val="both"/>
         <w:rPr>
           <w:sz w:val="28"/>
@@ -7985,6 +8869,7 @@
     </w:p>
     <w:p>
       <w:pPr>
+        <w:spacing w:line="360" w:lineRule="auto"/>
         <w:jc w:val="both"/>
         <w:rPr>
           <w:szCs w:val="24"/>
@@ -7993,6 +8878,8 @@
     </w:p>
     <w:p>
       <w:pPr>
+        <w:spacing w:line="360" w:lineRule="auto"/>
+        <w:jc w:val="both"/>
         <w:rPr>
           <w:szCs w:val="24"/>
         </w:rPr>
@@ -8074,6 +8961,10 @@
       </w:r>
     </w:p>
     <w:p>
+      <w:pPr>
+        <w:spacing w:line="360" w:lineRule="auto"/>
+        <w:jc w:val="both"/>
+      </w:pPr>
       <w:bookmarkStart w:id="11" w:name="_Toc188296912"/>
       <w:r>
         <w:lastRenderedPageBreak/>
@@ -8082,6 +8973,10 @@
       <w:bookmarkEnd w:id="11"/>
     </w:p>
     <w:p>
+      <w:pPr>
+        <w:spacing w:line="360" w:lineRule="auto"/>
+        <w:jc w:val="both"/>
+      </w:pPr>
       <w:r>
         <w:rPr>
           <w:noProof/>
@@ -8137,6 +9032,10 @@
       </w:r>
     </w:p>
     <w:p>
+      <w:pPr>
+        <w:spacing w:line="360" w:lineRule="auto"/>
+        <w:jc w:val="both"/>
+      </w:pPr>
       <w:r>
         <w:rPr>
           <w:noProof/>
@@ -8247,6 +9146,10 @@
       </w:r>
     </w:p>
     <w:p>
+      <w:pPr>
+        <w:spacing w:line="360" w:lineRule="auto"/>
+        <w:jc w:val="both"/>
+      </w:pPr>
       <w:r>
         <w:rPr>
           <w:noProof/>
@@ -8358,6 +9261,8 @@
     </w:p>
     <w:p>
       <w:pPr>
+        <w:spacing w:line="360" w:lineRule="auto"/>
+        <w:jc w:val="both"/>
         <w:rPr>
           <w:noProof/>
         </w:rPr>
@@ -8374,7 +9279,8 @@
     </w:p>
     <w:p>
       <w:pPr>
-        <w:jc w:val="center"/>
+        <w:spacing w:line="360" w:lineRule="auto"/>
+        <w:jc w:val="both"/>
         <w:rPr>
           <w:noProof/>
         </w:rPr>
@@ -8382,12 +9288,14 @@
     </w:p>
     <w:p>
       <w:pPr>
-        <w:jc w:val="center"/>
-      </w:pPr>
-    </w:p>
-    <w:p>
-      <w:pPr>
-        <w:jc w:val="center"/>
+        <w:spacing w:line="360" w:lineRule="auto"/>
+        <w:jc w:val="both"/>
+      </w:pPr>
+    </w:p>
+    <w:p>
+      <w:pPr>
+        <w:spacing w:line="360" w:lineRule="auto"/>
+        <w:jc w:val="both"/>
       </w:pPr>
       <w:r>
         <w:rPr>
@@ -8445,47 +9353,56 @@
     </w:p>
     <w:p>
       <w:pPr>
-        <w:jc w:val="center"/>
-      </w:pPr>
-    </w:p>
-    <w:p>
-      <w:pPr>
-        <w:jc w:val="center"/>
-      </w:pPr>
-    </w:p>
-    <w:p>
-      <w:pPr>
-        <w:jc w:val="center"/>
-      </w:pPr>
-    </w:p>
-    <w:p>
-      <w:pPr>
-        <w:jc w:val="center"/>
-      </w:pPr>
-    </w:p>
-    <w:p>
-      <w:pPr>
-        <w:jc w:val="center"/>
-      </w:pPr>
-    </w:p>
-    <w:p>
-      <w:pPr>
-        <w:jc w:val="center"/>
-      </w:pPr>
-    </w:p>
-    <w:p>
-      <w:pPr>
-        <w:jc w:val="center"/>
-      </w:pPr>
-    </w:p>
-    <w:p>
-      <w:pPr>
-        <w:jc w:val="center"/>
-      </w:pPr>
-    </w:p>
-    <w:p>
-      <w:pPr>
-        <w:jc w:val="center"/>
+        <w:spacing w:line="360" w:lineRule="auto"/>
+        <w:jc w:val="both"/>
+      </w:pPr>
+    </w:p>
+    <w:p>
+      <w:pPr>
+        <w:spacing w:line="360" w:lineRule="auto"/>
+        <w:jc w:val="both"/>
+      </w:pPr>
+    </w:p>
+    <w:p>
+      <w:pPr>
+        <w:spacing w:line="360" w:lineRule="auto"/>
+        <w:jc w:val="both"/>
+      </w:pPr>
+    </w:p>
+    <w:p>
+      <w:pPr>
+        <w:spacing w:line="360" w:lineRule="auto"/>
+        <w:jc w:val="both"/>
+      </w:pPr>
+    </w:p>
+    <w:p>
+      <w:pPr>
+        <w:spacing w:line="360" w:lineRule="auto"/>
+        <w:jc w:val="both"/>
+      </w:pPr>
+    </w:p>
+    <w:p>
+      <w:pPr>
+        <w:spacing w:line="360" w:lineRule="auto"/>
+        <w:jc w:val="both"/>
+      </w:pPr>
+    </w:p>
+    <w:p>
+      <w:pPr>
+        <w:spacing w:line="360" w:lineRule="auto"/>
+        <w:jc w:val="both"/>
+      </w:pPr>
+    </w:p>
+    <w:p>
+      <w:pPr>
+        <w:spacing w:line="360" w:lineRule="auto"/>
+        <w:jc w:val="both"/>
+      </w:pPr>
+    </w:p>
+    <w:p>
+      <w:pPr>
+        <w:spacing w:line="360" w:lineRule="auto"/>
+        <w:jc w:val="both"/>
       </w:pPr>
       <w:r>
         <w:t>DIAGRAMA UML</w:t>
@@ -8493,12 +9410,14 @@
     </w:p>
     <w:p>
       <w:pPr>
-        <w:jc w:val="center"/>
+        <w:spacing w:line="360" w:lineRule="auto"/>
+        <w:jc w:val="both"/>
       </w:pPr>
       <w:r>
         <w:rPr>
           <w:noProof/>
         </w:rPr>
+        <w:lastRenderedPageBreak/>
         <w:drawing>
           <wp:inline distT="0" distB="0" distL="0" distR="0" wp14:anchorId="336D886D" wp14:editId="24C57093">
             <wp:extent cx="5400040" cy="7742914"/>
@@ -16546,7 +17465,6 @@
   <w:style w:type="character" w:default="1" w:styleId="Fuentedeprrafopredeter">
     <w:name w:val="Default Paragraph Font"/>
     <w:uiPriority w:val="1"/>
-    <w:semiHidden/>
     <w:unhideWhenUsed/>
   </w:style>
   <w:style w:type="table" w:default="1" w:styleId="Tablanormal">

</xml_diff>

<commit_message>
Apartado de funcionalidades de la aplicación sin imágenes
</commit_message>
<xml_diff>
--- a/docs/memoria.docx
+++ b/docs/memoria.docx
@@ -3534,7 +3534,6 @@
         </w:rPr>
         <w:t xml:space="preserve">: Usar </w:t>
       </w:r>
-      <w:proofErr w:type="spellStart"/>
       <w:r>
         <w:rPr>
           <w:rFonts w:eastAsia="Times New Roman" w:cs="Times New Roman"/>
@@ -3547,7 +3546,6 @@
         </w:rPr>
         <w:t>fetch</w:t>
       </w:r>
-      <w:proofErr w:type="spellEnd"/>
       <w:r>
         <w:rPr>
           <w:rFonts w:eastAsia="Times New Roman" w:cs="Times New Roman"/>
@@ -4275,11 +4273,9 @@
       <w:r>
         <w:t xml:space="preserve"> La sección de preguntas </w:t>
       </w:r>
-      <w:proofErr w:type="gramStart"/>
-      <w:r>
-        <w:t>frecuentes,</w:t>
-      </w:r>
-      <w:proofErr w:type="gramEnd"/>
+      <w:r>
+        <w:t>frecuentes</w:t>
+      </w:r>
       <w:r>
         <w:t xml:space="preserve"> </w:t>
       </w:r>
@@ -4287,17 +4283,7 @@
         <w:t>consiste en</w:t>
       </w:r>
       <w:r>
-        <w:t xml:space="preserve"> unos elementos con una imagen de una flecha en al que el usuario podrá clicar, y aparecerá un elemento interactivo en el que aparecerá la respuesta. Para ello se ha utilizado JS, que añade un evento a la imagen de la flecha que hay en el contenedor, para que cuando haya un elemento </w:t>
-      </w:r>
-      <w:proofErr w:type="spellStart"/>
-      <w:proofErr w:type="gramStart"/>
-      <w:r>
-        <w:t>click</w:t>
-      </w:r>
-      <w:proofErr w:type="spellEnd"/>
-      <w:proofErr w:type="gramEnd"/>
-      <w:r>
-        <w:t>, la acción tenga lugar.</w:t>
+        <w:t xml:space="preserve"> unos elementos con una imagen de una flecha en al que el usuario podrá clicar, y aparecerá un elemento interactivo en el que aparecerá la respuesta. Para ello se ha utilizado JS, que añade un evento a la imagen de la flecha que hay en el contenedor, para que cuando haya un elemento click, la acción tenga lugar.</w:t>
       </w:r>
     </w:p>
     <w:p>
@@ -4328,15 +4314,7 @@
         <w:t xml:space="preserve">icha incidencia le </w:t>
       </w:r>
       <w:r>
-        <w:t xml:space="preserve">aparecerá al administrador en su dashboard y podrá ser gestionada desde el apartado de soporte, en el que podrá responder al usuario para solucionar la incidencia. La incidencia aparecerá mediante el uso de un </w:t>
-      </w:r>
-      <w:proofErr w:type="spellStart"/>
-      <w:r>
-        <w:t>fetch</w:t>
-      </w:r>
-      <w:proofErr w:type="spellEnd"/>
-      <w:r>
-        <w:t>, el cual obtendrá la incidencia de la base de datos, y haciendo uso de JS para mostrarla en la página.</w:t>
+        <w:t>aparecerá al administrador en su dashboard y podrá ser gestionada desde el apartado de soporte, en el que podrá responder al usuario para solucionar la incidencia. La incidencia aparecerá mediante el uso de un fetch, el cual obtendrá la incidencia de la base de datos, y haciendo uso de JS para mostrarla en la página.</w:t>
       </w:r>
     </w:p>
     <w:p>
@@ -4377,22 +4355,131 @@
         <w:jc w:val="both"/>
       </w:pPr>
       <w:r>
-        <w:t>Los monitores cuentan con un espacio propio dentro de la plataforma, el cual les permite llevar un control preciso de sus actividades diarias. Desde su panel de usuario, pueden consultar el cronograma del campamento y conocer con antelación las actividades programadas, así como los materiales necesarios para su realización. Una de las funciones más importantes que ofrece la web para ellos es la posibilidad de modificar actividades o añadir nuevas según las necesidades del grupo. Además, los monitores tienen acceso a una herramienta para pasar lista, lo que les permite registrar de manera digital la asistencia de los niños y detectar cualquier ausencia al instante. Asimismo, disponen de una sección específica donde pueden consultar información relevante sobre los alumnos a su cargo, incluyendo datos de contacto de sus tutores y la posibilidad de realizar anotaciones sobre el desempeño de cada niño.</w:t>
-      </w:r>
-    </w:p>
-    <w:p>
-      <w:pPr>
-        <w:spacing w:line="360" w:lineRule="auto"/>
-        <w:jc w:val="both"/>
-      </w:pPr>
-    </w:p>
-    <w:p>
-      <w:pPr>
-        <w:spacing w:line="360" w:lineRule="auto"/>
-        <w:jc w:val="both"/>
-      </w:pPr>
-      <w:r>
-        <w:t>El administrador del campamento tiene un control aún más amplio sobre el funcionamiento de la web y del programa en general. Su panel le permite supervisar las actividades de los monitores, gestionar la inscripción de los alumnos y controlar aspectos logísticos esenciales, como los pagos pendientes o la creación de nuevos grupos. Además, cuenta con una herramienta para gestionar descuentos y actualizar tarifas según sea necesario. Otra funcionalidad clave del administrador es la capacidad de crear o eliminar monitores y organizar la estructura del campamento de manera flexible, asegurando un funcionamiento eficiente y adaptado a las necesidades de cada edición.</w:t>
+        <w:t xml:space="preserve">Los monitores cuentan con un espacio propio dentro de la plataforma, el cual les permite llevar un control preciso de sus actividades diarias. </w:t>
+      </w:r>
+      <w:r>
+        <w:t xml:space="preserve">Para poder desplazarse a través de su panel de control, se ha hecho uso de JS, para modificar el contenedor principal de este y modificarlo en función de la ventana que haya seleccionado. A través de JS, se controla que aparezca uno cada uno de los contenedores del panel, y se les asigna un estilo u otro de </w:t>
+      </w:r>
+      <w:proofErr w:type="spellStart"/>
+      <w:r>
+        <w:t>css</w:t>
+      </w:r>
+      <w:proofErr w:type="spellEnd"/>
+      <w:r>
+        <w:t xml:space="preserve">. </w:t>
+      </w:r>
+      <w:r>
+        <w:t>Desde su panel de usuario, pueden consultar el cronograma del campamento y conocer con antelación las actividades programadas, así como los materiales necesarios para su realización.</w:t>
+      </w:r>
+      <w:r>
+        <w:t xml:space="preserve"> El cronograma de actividades está creado de tal manera </w:t>
+      </w:r>
+      <w:r>
+        <w:t>que,</w:t>
+      </w:r>
+      <w:r>
+        <w:t xml:space="preserve"> si se selecciona alg</w:t>
+      </w:r>
+      <w:r>
+        <w:t>una hora</w:t>
+      </w:r>
+      <w:r>
+        <w:t xml:space="preserve"> del día</w:t>
+      </w:r>
+      <w:r>
+        <w:t>, aparecerá un pop-up, con un formulario para rellenar la información pertinente acerca de la actividad. Dicha actividad quedará almacenada en la base de datos, la cual será insertada en esta mediante el uso de un fetch.</w:t>
+      </w:r>
+      <w:r>
+        <w:t xml:space="preserve"> Una de las funciones más importantes que ofrece la web para ellos es la posibilidad de modificar actividades o añadir nuevas según las necesidades del grupo. Además, los monitores tienen acceso a una herramienta para pasar lista, lo que les permite registrar de manera digital la asistencia de los niños y detectar cualquier ausencia al instante.</w:t>
+      </w:r>
+      <w:r>
+        <w:t xml:space="preserve"> El registro de asistencia consta de una tabla que se crea de forma dinámica en función del grupo, y de su pertinente monitor. Los niños irán apareciendo en la tabla a medida que se vayan inscribiendo al campamento, y sean asignados a un grupo dentro de la base de datos. Para ello se utiliza JS, en el cual se reciben los datos necesarios del niño desde la base de datos</w:t>
+      </w:r>
+      <w:r>
+        <w:t xml:space="preserve"> </w:t>
+      </w:r>
+      <w:r>
+        <w:t xml:space="preserve">y se </w:t>
+      </w:r>
+      <w:r>
+        <w:t xml:space="preserve">utilizan para ir creando la tabla. Se añade un </w:t>
+      </w:r>
+      <w:proofErr w:type="spellStart"/>
+      <w:r>
+        <w:t>checkbox</w:t>
+      </w:r>
+      <w:proofErr w:type="spellEnd"/>
+      <w:r>
+        <w:t xml:space="preserve"> a la tabla en la que el monitor podrá marcar si el niño a asistido a clase o no. Al pasar de día, se reestablecerá la lista de tal manera que el tutor podrá volver a pasar lista, y así según vaya transcurriendo el campamento.</w:t>
+      </w:r>
+      <w:r>
+        <w:t xml:space="preserve"> Asimismo, disponen de una sección específica donde pueden consultar </w:t>
+      </w:r>
+      <w:r>
+        <w:lastRenderedPageBreak/>
+        <w:t>información relevante sobre los alumnos a su cargo, incluyendo datos de contacto de sus tutores y la posibilidad de realizar anotaciones sobre el desempeño de cada niño.</w:t>
+      </w:r>
+      <w:r>
+        <w:t xml:space="preserve"> </w:t>
+      </w:r>
+      <w:r>
+        <w:t>Para esta parte, aparecen los niños listados de uno en uno y haciendo uso de JS, al pulsar en uno de ellos aparecerá un contenedor con información relevante del niño, junto con la posibilidad de añadir comentarios acerca de este. Para ello, se recorre la lista de los niños, y se les añade un evento de tipo click a cada uno de ellos, para que al pulsarlo aparezca el contenedor.</w:t>
+      </w:r>
+    </w:p>
+    <w:p>
+      <w:pPr>
+        <w:pStyle w:val="Ttulo2"/>
+        <w:spacing w:line="360" w:lineRule="auto"/>
+        <w:jc w:val="both"/>
+        <w:rPr>
+          <w:rFonts w:ascii="Times New Roman" w:hAnsi="Times New Roman" w:cs="Times New Roman"/>
+          <w:b/>
+          <w:bCs/>
+          <w:color w:val="auto"/>
+          <w:sz w:val="24"/>
+          <w:szCs w:val="24"/>
+        </w:rPr>
+      </w:pPr>
+      <w:r>
+        <w:rPr>
+          <w:rFonts w:ascii="Times New Roman" w:hAnsi="Times New Roman" w:cs="Times New Roman"/>
+          <w:b/>
+          <w:bCs/>
+          <w:color w:val="auto"/>
+          <w:sz w:val="24"/>
+          <w:szCs w:val="24"/>
+        </w:rPr>
+        <w:t>ADMINISTRADOR</w:t>
+      </w:r>
+    </w:p>
+    <w:p>
+      <w:pPr>
+        <w:spacing w:line="360" w:lineRule="auto"/>
+        <w:jc w:val="both"/>
+      </w:pPr>
+      <w:r>
+        <w:t>El administrador del campamento tiene un control aún más amplio sobre el funcionamiento de la web y del programa en general. Su panel le permite supervisar las actividades de los monitores, gestionar la inscripción de los alumnos y controlar aspectos logísticos esenciales, como los pagos pendientes o la creación de nuevos grupos.</w:t>
+      </w:r>
+      <w:r>
+        <w:t xml:space="preserve"> Su panel tiene el mismo funcionamiento que el ya mencionado anteriormente en el caso del monitor, al seguir la misma estructura. </w:t>
+      </w:r>
+      <w:r>
+        <w:t xml:space="preserve">Además, cuenta </w:t>
+      </w:r>
+      <w:r>
+        <w:t xml:space="preserve">con la opción </w:t>
+      </w:r>
+      <w:r>
+        <w:t>actualizar tarifas según sea necesario.</w:t>
+      </w:r>
+      <w:r>
+        <w:t xml:space="preserve"> Para ello dispone de las mismas tarjetas que aparecerán en la web más adelante, con la opción de poder modificar su contenido a su antojo, mandando los datos de un lado a otro haciendo uso de la base de datos y realizando las inserciones con fetch.</w:t>
+      </w:r>
+      <w:r>
+        <w:t xml:space="preserve"> Otra funcionalidad clave del administrador es la capacidad de crear o eliminar monitores y organizar la estructura del campamento de manera flexible, asegurando un funcionamiento eficiente y adaptado a las necesidades de cada edición.</w:t>
+      </w:r>
+      <w:r>
+        <w:t xml:space="preserve"> Para crear a un nuevo monitor, el administrador únicamente tendrá que rellenar la información necesaria de el monitor, y enviarla para que esta quede almacenada en la base de datos. De esta forma ya podrá asignar al monitor a distintos grupos y realizar los trámites necesarios. Además de esto, cuenta con un cronograma idéntico al explicado anteriormente en el monitor. Por último, hay un apartado de inscripciones y registros en el que podrá resolver las incidencias que reciba a través de la web. Para ello aparecerá la incidencia en su pantalla al recibirla de la base de datos, y una vez haya respondido el administrador o resuelto la incidencia, solo tendrá que darle a aceptar para enviarla de vuelta, y el estado de esta pasará a resuelta en la base de datos.</w:t>
       </w:r>
     </w:p>
     <w:p>
@@ -17465,6 +17552,7 @@
   <w:style w:type="character" w:default="1" w:styleId="Fuentedeprrafopredeter">
     <w:name w:val="Default Paragraph Font"/>
     <w:uiPriority w:val="1"/>
+    <w:semiHidden/>
     <w:unhideWhenUsed/>
   </w:style>
   <w:style w:type="table" w:default="1" w:styleId="Tablanormal">

</xml_diff>